<commit_message>
fix: update all 20 lesson plans to match exact Desainer Grafis Muda master template structure
</commit_message>
<xml_diff>
--- a/documents/Lesson_Plan_Pertemuan_01.docx
+++ b/documents/Lesson_Plan_Pertemuan_01.docx
@@ -1,6 +1,6 @@
 
 <file path=word/document.xml><?xml version="1.0" encoding="utf-8"?>
-<w:document xmlns:wpc="http://schemas.microsoft.com/office/word/2010/wordprocessingCanvas" xmlns:cx="http://schemas.microsoft.com/office/drawing/2014/chartex" xmlns:cx1="http://schemas.microsoft.com/office/drawing/2015/9/8/chartex" xmlns:cx2="http://schemas.microsoft.com/office/drawing/2015/10/21/chartex" xmlns:cx3="http://schemas.microsoft.com/office/drawing/2016/5/9/chartex" xmlns:cx4="http://schemas.microsoft.com/office/drawing/2016/5/10/chartex" xmlns:cx5="http://schemas.microsoft.com/office/drawing/2016/5/11/chartex" xmlns:cx6="http://schemas.microsoft.com/office/drawing/2016/5/12/chartex" xmlns:cx7="http://schemas.microsoft.com/office/drawing/2016/5/13/chartex" xmlns:cx8="http://schemas.microsoft.com/office/drawing/2016/5/14/chartex" xmlns:mc="http://schemas.openxmlformats.org/markup-compatibility/2006" xmlns:aink="http://schemas.microsoft.com/office/drawing/2016/ink" xmlns:am3d="http://schemas.microsoft.com/office/drawing/2017/model3d" xmlns:o="urn:schemas-microsoft-com:office:office" xmlns:oel="http://schemas.microsoft.com/office/2019/extlst" xmlns:r="http://schemas.openxmlformats.org/officeDocument/2006/relationships" xmlns:m="http://schemas.openxmlformats.org/officeDocument/2006/math" xmlns:v="urn:schemas-microsoft-com:vml" xmlns:wp14="http://schemas.microsoft.com/office/word/2010/wordprocessingDrawing" xmlns:wp="http://schemas.openxmlformats.org/drawingml/2006/wordprocessingDrawing" xmlns:w10="urn:schemas-microsoft-com:office:word" xmlns:w="http://schemas.openxmlformats.org/wordprocessingml/2006/main" xmlns:w14="http://schemas.microsoft.com/office/word/2010/wordml" xmlns:w15="http://schemas.microsoft.com/office/word/2012/wordml" xmlns:w16cex="http://schemas.microsoft.com/office/word/2018/wordml/cex" xmlns:w16cid="http://schemas.microsoft.com/office/word/2016/wordml/cid" xmlns:w16="http://schemas.microsoft.com/office/word/2018/wordml" xmlns:w16du="http://schemas.microsoft.com/office/word/2023/wordml/word16du" xmlns:w16sdtdh="http://schemas.microsoft.com/office/word/2020/wordml/sdtdatahash" xmlns:w16sdtfl="http://schemas.microsoft.com/office/word/2024/wordml/sdtformatlock" xmlns:w16se="http://schemas.microsoft.com/office/word/2015/wordml/symex" xmlns:wpg="http://schemas.microsoft.com/office/word/2010/wordprocessingGroup" xmlns:wpi="http://schemas.microsoft.com/office/word/2010/wordprocessingInk" xmlns:wne="http://schemas.microsoft.com/office/word/2006/wordml" xmlns:wps="http://schemas.microsoft.com/office/word/2010/wordprocessingShape" mc:Ignorable="w14 w15 w16se w16cid w16 w16cex w16sdtdh w16sdtfl w16du wp14">
+<w:document xmlns:wpc="http://schemas.microsoft.com/office/word/2010/wordprocessingCanvas" xmlns:cx="http://schemas.microsoft.com/office/drawing/2014/chartex" xmlns:cx1="http://schemas.microsoft.com/office/drawing/2015/9/8/chartex" xmlns:cx2="http://schemas.microsoft.com/office/drawing/2015/10/21/chartex" xmlns:cx3="http://schemas.microsoft.com/office/drawing/2016/5/9/chartex" xmlns:cx4="http://schemas.microsoft.com/office/drawing/2016/5/10/chartex" xmlns:cx5="http://schemas.microsoft.com/office/drawing/2016/5/11/chartex" xmlns:cx6="http://schemas.microsoft.com/office/drawing/2016/5/12/chartex" xmlns:cx7="http://schemas.microsoft.com/office/drawing/2016/5/13/chartex" xmlns:cx8="http://schemas.microsoft.com/office/drawing/2016/5/14/chartex" xmlns:mc="http://schemas.openxmlformats.org/markup-compatibility/2006" xmlns:aink="http://schemas.microsoft.com/office/drawing/2016/ink" xmlns:am3d="http://schemas.microsoft.com/office/drawing/2017/model3d" xmlns:o="urn:schemas-microsoft-com:office:office" xmlns:oel="http://schemas.microsoft.com/office/2019/extlst" xmlns:r="http://schemas.openxmlformats.org/officeDocument/2006/relationships" xmlns:m="http://schemas.openxmlformats.org/officeDocument/2006/math" xmlns:v="urn:schemas-microsoft-com:vml" xmlns:wp14="http://schemas.microsoft.com/office/word/2010/wordprocessingDrawing" xmlns:wp="http://schemas.openxmlformats.org/drawingml/2006/wordprocessingDrawing" xmlns:w10="urn:schemas-microsoft-com:office:word" xmlns:w="http://schemas.openxmlformats.org/wordprocessingml/2006/main" xmlns:w14="http://schemas.microsoft.com/office/word/2010/wordml" xmlns:w15="http://schemas.microsoft.com/office/word/2012/wordml" xmlns:w16cei="http://schemas.microsoft.com/office/word/2026/wordml/cei" xmlns:w16cex="http://schemas.microsoft.com/office/word/2018/wordml/cex" xmlns:w16cid="http://schemas.microsoft.com/office/word/2016/wordml/cid" xmlns:w16="http://schemas.microsoft.com/office/word/2018/wordml" xmlns:w16du="http://schemas.microsoft.com/office/word/2023/wordml/word16du" xmlns:w16sdtdh="http://schemas.microsoft.com/office/word/2020/wordml/sdtdatahash" xmlns:w16sdtfl="http://schemas.microsoft.com/office/word/2024/wordml/sdtformatlock" xmlns:w16se="http://schemas.microsoft.com/office/word/2015/wordml/symex" xmlns:wpg="http://schemas.microsoft.com/office/word/2010/wordprocessingGroup" xmlns:wpi="http://schemas.microsoft.com/office/word/2010/wordprocessingInk" xmlns:wne="http://schemas.microsoft.com/office/word/2006/wordml" xmlns:wps="http://schemas.microsoft.com/office/word/2010/wordprocessingShape" mc:Ignorable="w14 w15 w16se w16cid w16 w16cex w16sdtdh w16sdtfl w16du wp14">
   <w:body>
     <w:p>
       <w:pPr>
@@ -179,28 +179,9 @@
             <w:vAlign w:val="center"/>
           </w:tcPr>
           <w:p>
-            <w:pPr>
-              <w:spacing w:before="60" w:after="60"/>
-              <w:rPr>
-                <w:rFonts w:ascii="Tahoma" w:eastAsia="Tahoma" w:hAnsi="Tahoma" w:cs="Tahoma"/>
-                <w:b/>
-                <w:sz w:val="22"/>
-                <w:szCs w:val="22"/>
-                <w:lang w:val="en-US"/>
-              </w:rPr>
-            </w:pPr>
-            <w:proofErr w:type="spellStart"/>
-            <w:r>
-              <w:rPr>
-                <w:rFonts w:ascii="Tahoma" w:eastAsia="Tahoma" w:hAnsi="Tahoma" w:cs="Tahoma"/>
-                <w:b/>
-                <w:sz w:val="22"/>
-                <w:szCs w:val="22"/>
-                <w:lang w:val="en-US"/>
-              </w:rPr>
-              <w:t>Kejuruan</w:t>
-            </w:r>
-            <w:proofErr w:type="spellEnd"/>
+            <w:r>
+              <w:t>Teknologi Informasi dan Komunikasi (TIK)</w:t>
+            </w:r>
           </w:p>
         </w:tc>
         <w:tc>
@@ -243,8 +224,16 @@
             <w:vAlign w:val="center"/>
           </w:tcPr>
           <w:p>
-            <w:r>
-              <w:t>Pertanian Modern &amp; TIK</w:t>
+            <w:pPr>
+              <w:spacing w:before="60" w:after="60"/>
+              <w:rPr>
+                <w:rFonts w:ascii="Tahoma" w:eastAsia="Tahoma" w:hAnsi="Tahoma" w:cs="Tahoma"/>
+                <w:sz w:val="22"/>
+                <w:szCs w:val="22"/>
+              </w:rPr>
+            </w:pPr>
+            <w:r>
+              <w:t xml:space="preserve">Teknologi Informasi dan Komunikasi (TIK)</w:t>
             </w:r>
           </w:p>
         </w:tc>
@@ -337,23 +326,8 @@
             <w:vAlign w:val="center"/>
           </w:tcPr>
           <w:p>
-            <w:pPr>
-              <w:spacing w:before="60" w:after="60"/>
-              <w:rPr>
-                <w:rFonts w:ascii="Tahoma" w:eastAsia="Tahoma" w:hAnsi="Tahoma" w:cs="Tahoma"/>
-                <w:b/>
-                <w:sz w:val="22"/>
-                <w:szCs w:val="22"/>
-              </w:rPr>
-            </w:pPr>
-            <w:r>
-              <w:rPr>
-                <w:rFonts w:ascii="Tahoma" w:eastAsia="Tahoma" w:hAnsi="Tahoma" w:cs="Tahoma"/>
-                <w:b/>
-                <w:sz w:val="22"/>
-                <w:szCs w:val="22"/>
-              </w:rPr>
-              <w:t>Penyajian ke</w:t>
+            <w:r>
+              <w:t>1</w:t>
             </w:r>
           </w:p>
         </w:tc>
@@ -397,8 +371,16 @@
             <w:vAlign w:val="center"/>
           </w:tcPr>
           <w:p>
-            <w:r>
-              <w:t>1</w:t>
+            <w:pPr>
+              <w:spacing w:before="60" w:after="60"/>
+              <w:rPr>
+                <w:rFonts w:ascii="Tahoma" w:eastAsia="Tahoma" w:hAnsi="Tahoma" w:cs="Tahoma"/>
+                <w:sz w:val="22"/>
+                <w:szCs w:val="22"/>
+              </w:rPr>
+            </w:pPr>
+            <w:r>
+              <w:t xml:space="preserve">6</w:t>
             </w:r>
           </w:p>
         </w:tc>
@@ -491,23 +473,8 @@
             <w:vAlign w:val="center"/>
           </w:tcPr>
           <w:p>
-            <w:pPr>
-              <w:spacing w:before="60" w:after="60"/>
-              <w:rPr>
-                <w:rFonts w:ascii="Tahoma" w:eastAsia="Tahoma" w:hAnsi="Tahoma" w:cs="Tahoma"/>
-                <w:b/>
-                <w:sz w:val="22"/>
-                <w:szCs w:val="22"/>
-              </w:rPr>
-            </w:pPr>
-            <w:r>
-              <w:rPr>
-                <w:rFonts w:ascii="Tahoma" w:eastAsia="Tahoma" w:hAnsi="Tahoma" w:cs="Tahoma"/>
-                <w:b/>
-                <w:sz w:val="22"/>
-                <w:szCs w:val="22"/>
-              </w:rPr>
-              <w:t xml:space="preserve">Waktu </w:t>
+            <w:r>
+              <w:t>8 JP (360 menit)</w:t>
             </w:r>
           </w:p>
         </w:tc>
@@ -551,8 +518,16 @@
             <w:vAlign w:val="center"/>
           </w:tcPr>
           <w:p>
-            <w:r>
-              <w:t>8 JP</w:t>
+            <w:pPr>
+              <w:spacing w:before="60" w:after="60"/>
+              <w:rPr>
+                <w:rFonts w:ascii="Tahoma" w:eastAsia="Tahoma" w:hAnsi="Tahoma" w:cs="Tahoma"/>
+                <w:sz w:val="22"/>
+                <w:szCs w:val="22"/>
+              </w:rPr>
+            </w:pPr>
+            <w:r>
+              <w:t xml:space="preserve">180 menit</w:t>
             </w:r>
           </w:p>
         </w:tc>
@@ -565,7 +540,7 @@
           </w:tcPr>
           <w:p>
             <w:r>
-              <w:t>JUDUL / Pengenalan K3 Pertanian Modern &amp; Keselamatan Kelistrikan</w:t>
+              <w:t>Pengenalan K3 Pertanian Modern &amp; Keselamatan Kelistrikan</w:t>
             </w:r>
           </w:p>
         </w:tc>
@@ -578,7 +553,7 @@
           </w:tcPr>
           <w:p>
             <w:r>
-              <w:t>Tujuan Pembelajaran  :  / Setelah selesai mengikuti pelatihan ini peserta kompeten dalam memahami teori dan mampu mengaplikasikan praktik secara langsung terkait materi "Pengenalan K3 Pertanian Modern &amp; Keselamatan Kelistrikan" sesuai standar industri pertanian modern.</w:t>
+              <w:t>Peserta kompeten dalam memahami dan menerapkan prosedur K3 serta keselamatan kelistrikan pada perangkat pertanian modern.</w:t>
             </w:r>
           </w:p>
         </w:tc>
@@ -625,8 +600,84 @@
             <w:gridSpan w:val="6"/>
           </w:tcPr>
           <w:p>
-            <w:r>
-              <w:t>Ceramah / Praktikum / Diskusi</w:t>
+            <w:pPr>
+              <w:numPr>
+                <w:ilvl w:val="0"/>
+                <w:numId w:val="2"/>
+              </w:numPr>
+              <w:pBdr>
+                <w:top w:val="nil"/>
+                <w:left w:val="nil"/>
+                <w:bottom w:val="nil"/>
+                <w:right w:val="nil"/>
+                <w:between w:val="nil"/>
+              </w:pBdr>
+              <w:spacing w:after="120"/>
+              <w:ind w:left="294" w:hanging="284"/>
+              <w:jc w:val="both"/>
+              <w:rPr>
+                <w:rFonts w:ascii="Tahoma" w:eastAsia="Tahoma" w:hAnsi="Tahoma" w:cs="Tahoma"/>
+                <w:color w:val="000000" w:themeColor="text1"/>
+                <w:sz w:val="22"/>
+                <w:szCs w:val="22"/>
+              </w:rPr>
+            </w:pPr>
+            <w:r>
+              <w:t xml:space="preserve">Ceramah</w:t>
+            </w:r>
+          </w:p>
+          <w:p>
+            <w:pPr>
+              <w:numPr>
+                <w:ilvl w:val="0"/>
+                <w:numId w:val="2"/>
+              </w:numPr>
+              <w:pBdr>
+                <w:top w:val="nil"/>
+                <w:left w:val="nil"/>
+                <w:bottom w:val="nil"/>
+                <w:right w:val="nil"/>
+                <w:between w:val="nil"/>
+              </w:pBdr>
+              <w:spacing w:after="120"/>
+              <w:ind w:left="294" w:hanging="284"/>
+              <w:jc w:val="both"/>
+              <w:rPr>
+                <w:rFonts w:ascii="Tahoma" w:eastAsia="Tahoma" w:hAnsi="Tahoma" w:cs="Tahoma"/>
+                <w:color w:val="000000" w:themeColor="text1"/>
+                <w:sz w:val="22"/>
+                <w:szCs w:val="22"/>
+              </w:rPr>
+            </w:pPr>
+            <w:r>
+              <w:t xml:space="preserve">Praktikum</w:t>
+            </w:r>
+          </w:p>
+          <w:p>
+            <w:pPr>
+              <w:numPr>
+                <w:ilvl w:val="0"/>
+                <w:numId w:val="2"/>
+              </w:numPr>
+              <w:pBdr>
+                <w:top w:val="nil"/>
+                <w:left w:val="nil"/>
+                <w:bottom w:val="nil"/>
+                <w:right w:val="nil"/>
+                <w:between w:val="nil"/>
+              </w:pBdr>
+              <w:spacing w:after="120"/>
+              <w:ind w:left="294" w:hanging="284"/>
+              <w:jc w:val="both"/>
+              <w:rPr>
+                <w:rFonts w:ascii="Tahoma" w:eastAsia="Tahoma" w:hAnsi="Tahoma" w:cs="Tahoma"/>
+                <w:color w:val="000000" w:themeColor="text1"/>
+                <w:sz w:val="22"/>
+                <w:szCs w:val="22"/>
+              </w:rPr>
+            </w:pPr>
+            <w:r>
+              <w:t xml:space="preserve">Diskusi</w:t>
             </w:r>
           </w:p>
         </w:tc>
@@ -699,8 +750,72 @@
             <w:gridSpan w:val="6"/>
           </w:tcPr>
           <w:p>
-            <w:r>
-              <w:t>Media / Power Point / Gambar dan Video / Modul Ajar</w:t>
+            <w:pPr>
+              <w:pBdr>
+                <w:top w:val="nil"/>
+                <w:left w:val="nil"/>
+                <w:bottom w:val="nil"/>
+                <w:right w:val="nil"/>
+                <w:between w:val="nil"/>
+              </w:pBdr>
+              <w:spacing w:before="120" w:line="276" w:lineRule="auto"/>
+              <w:ind w:left="52"/>
+              <w:jc w:val="both"/>
+              <w:rPr>
+                <w:rFonts w:ascii="Tahoma" w:eastAsia="Tahoma" w:hAnsi="Tahoma" w:cs="Tahoma"/>
+                <w:color w:val="000000" w:themeColor="text1"/>
+                <w:sz w:val="22"/>
+                <w:szCs w:val="22"/>
+              </w:rPr>
+            </w:pPr>
+            <w:r>
+              <w:t xml:space="preserve">Media</w:t>
+            </w:r>
+          </w:p>
+          <w:p>
+            <w:pPr>
+              <w:pBdr>
+                <w:top w:val="nil"/>
+                <w:left w:val="nil"/>
+                <w:bottom w:val="nil"/>
+                <w:right w:val="nil"/>
+                <w:between w:val="nil"/>
+              </w:pBdr>
+              <w:spacing w:before="120" w:line="276" w:lineRule="auto"/>
+              <w:ind w:left="52"/>
+              <w:jc w:val="both"/>
+              <w:rPr>
+                <w:rFonts w:ascii="Tahoma" w:eastAsia="Tahoma" w:hAnsi="Tahoma" w:cs="Tahoma"/>
+                <w:color w:val="000000" w:themeColor="text1"/>
+                <w:sz w:val="22"/>
+                <w:szCs w:val="22"/>
+              </w:rPr>
+            </w:pPr>
+            <w:r>
+              <w:t xml:space="preserve">Power Point</w:t>
+            </w:r>
+          </w:p>
+          <w:p>
+            <w:pPr>
+              <w:pBdr>
+                <w:top w:val="nil"/>
+                <w:left w:val="nil"/>
+                <w:bottom w:val="nil"/>
+                <w:right w:val="nil"/>
+                <w:between w:val="nil"/>
+              </w:pBdr>
+              <w:spacing w:before="120" w:line="276" w:lineRule="auto"/>
+              <w:ind w:left="52"/>
+              <w:jc w:val="both"/>
+              <w:rPr>
+                <w:rFonts w:ascii="Tahoma" w:eastAsia="Tahoma" w:hAnsi="Tahoma" w:cs="Tahoma"/>
+                <w:color w:val="000000" w:themeColor="text1"/>
+                <w:sz w:val="22"/>
+                <w:szCs w:val="22"/>
+              </w:rPr>
+            </w:pPr>
+            <w:r>
+              <w:t xml:space="preserve">Gambar dan Video</w:t>
             </w:r>
           </w:p>
         </w:tc>
@@ -736,8 +851,95 @@
             <w:gridSpan w:val="6"/>
           </w:tcPr>
           <w:p>
-            <w:r>
-              <w:t>Alat / Proyektor dan Layar / Perangkat Mikrokontroler / Papan Tulis, Spidol</w:t>
+            <w:pPr>
+              <w:pBdr>
+                <w:top w:val="nil"/>
+                <w:left w:val="nil"/>
+                <w:bottom w:val="nil"/>
+                <w:right w:val="nil"/>
+                <w:between w:val="nil"/>
+              </w:pBdr>
+              <w:spacing w:before="120" w:line="276" w:lineRule="auto"/>
+              <w:ind w:left="52"/>
+              <w:jc w:val="both"/>
+              <w:rPr>
+                <w:rFonts w:ascii="Tahoma" w:eastAsia="Tahoma" w:hAnsi="Tahoma" w:cs="Tahoma"/>
+                <w:color w:val="000000" w:themeColor="text1"/>
+                <w:sz w:val="22"/>
+                <w:szCs w:val="22"/>
+              </w:rPr>
+            </w:pPr>
+            <w:r>
+              <w:t xml:space="preserve">Alat</w:t>
+            </w:r>
+          </w:p>
+          <w:p>
+            <w:pPr>
+              <w:pBdr>
+                <w:top w:val="nil"/>
+                <w:left w:val="nil"/>
+                <w:bottom w:val="nil"/>
+                <w:right w:val="nil"/>
+                <w:between w:val="nil"/>
+              </w:pBdr>
+              <w:spacing w:before="120" w:line="276" w:lineRule="auto"/>
+              <w:ind w:left="52"/>
+              <w:jc w:val="both"/>
+              <w:rPr>
+                <w:rFonts w:ascii="Tahoma" w:eastAsia="Tahoma" w:hAnsi="Tahoma" w:cs="Tahoma"/>
+                <w:color w:val="000000" w:themeColor="text1"/>
+                <w:sz w:val="22"/>
+                <w:szCs w:val="22"/>
+              </w:rPr>
+            </w:pPr>
+            <w:r>
+              <w:t xml:space="preserve">Proyektor dan Layar</w:t>
+            </w:r>
+          </w:p>
+          <w:p>
+            <w:pPr>
+              <w:pBdr>
+                <w:top w:val="nil"/>
+                <w:left w:val="nil"/>
+                <w:bottom w:val="nil"/>
+                <w:right w:val="nil"/>
+                <w:between w:val="nil"/>
+              </w:pBdr>
+              <w:spacing w:before="120" w:line="276" w:lineRule="auto"/>
+              <w:ind w:left="52"/>
+              <w:jc w:val="both"/>
+              <w:rPr>
+                <w:rFonts w:ascii="Tahoma" w:eastAsia="Tahoma" w:hAnsi="Tahoma" w:cs="Tahoma"/>
+                <w:color w:val="000000" w:themeColor="text1"/>
+                <w:sz w:val="22"/>
+                <w:szCs w:val="22"/>
+              </w:rPr>
+            </w:pPr>
+            <w:r>
+              <w:t xml:space="preserve">UPS dan Perangkat Komputer</w:t>
+            </w:r>
+          </w:p>
+          <w:p>
+            <w:pPr>
+              <w:pBdr>
+                <w:top w:val="nil"/>
+                <w:left w:val="nil"/>
+                <w:bottom w:val="nil"/>
+                <w:right w:val="nil"/>
+                <w:between w:val="nil"/>
+              </w:pBdr>
+              <w:spacing w:before="120" w:line="276" w:lineRule="auto"/>
+              <w:ind w:left="52"/>
+              <w:jc w:val="both"/>
+              <w:rPr>
+                <w:rFonts w:ascii="Tahoma" w:eastAsia="Tahoma" w:hAnsi="Tahoma" w:cs="Tahoma"/>
+                <w:color w:val="000000" w:themeColor="text1"/>
+                <w:sz w:val="22"/>
+                <w:szCs w:val="22"/>
+              </w:rPr>
+            </w:pPr>
+            <w:r>
+              <w:t xml:space="preserve">Papan Tulis, Spidol dan Penghapus</w:t>
             </w:r>
           </w:p>
         </w:tc>
@@ -776,8 +978,95 @@
             <w:gridSpan w:val="6"/>
           </w:tcPr>
           <w:p>
-            <w:r>
-              <w:t>Bahan / Flashdisk / Sensor &amp; Aktuator Pertanian / Komponen IoT</w:t>
+            <w:pPr>
+              <w:pBdr>
+                <w:top w:val="nil"/>
+                <w:left w:val="nil"/>
+                <w:bottom w:val="nil"/>
+                <w:right w:val="nil"/>
+                <w:between w:val="nil"/>
+              </w:pBdr>
+              <w:spacing w:before="120" w:line="276" w:lineRule="auto"/>
+              <w:ind w:left="52"/>
+              <w:jc w:val="both"/>
+              <w:rPr>
+                <w:rFonts w:ascii="Tahoma" w:eastAsia="Tahoma" w:hAnsi="Tahoma" w:cs="Tahoma"/>
+                <w:color w:val="000000" w:themeColor="text1"/>
+                <w:sz w:val="22"/>
+                <w:szCs w:val="22"/>
+              </w:rPr>
+            </w:pPr>
+            <w:r>
+              <w:t xml:space="preserve">Bahan</w:t>
+            </w:r>
+          </w:p>
+          <w:p>
+            <w:pPr>
+              <w:pBdr>
+                <w:top w:val="nil"/>
+                <w:left w:val="nil"/>
+                <w:bottom w:val="nil"/>
+                <w:right w:val="nil"/>
+                <w:between w:val="nil"/>
+              </w:pBdr>
+              <w:spacing w:before="120" w:line="276" w:lineRule="auto"/>
+              <w:ind w:left="52"/>
+              <w:jc w:val="both"/>
+              <w:rPr>
+                <w:rFonts w:ascii="Tahoma" w:eastAsia="Tahoma" w:hAnsi="Tahoma" w:cs="Tahoma"/>
+                <w:color w:val="000000" w:themeColor="text1"/>
+                <w:sz w:val="22"/>
+                <w:szCs w:val="22"/>
+              </w:rPr>
+            </w:pPr>
+            <w:r>
+              <w:t xml:space="preserve">Flashdisk</w:t>
+            </w:r>
+          </w:p>
+          <w:p>
+            <w:pPr>
+              <w:pBdr>
+                <w:top w:val="nil"/>
+                <w:left w:val="nil"/>
+                <w:bottom w:val="nil"/>
+                <w:right w:val="nil"/>
+                <w:between w:val="nil"/>
+              </w:pBdr>
+              <w:spacing w:before="120" w:line="276" w:lineRule="auto"/>
+              <w:ind w:left="52"/>
+              <w:jc w:val="both"/>
+              <w:rPr>
+                <w:rFonts w:ascii="Tahoma" w:eastAsia="Tahoma" w:hAnsi="Tahoma" w:cs="Tahoma"/>
+                <w:color w:val="000000" w:themeColor="text1"/>
+                <w:sz w:val="22"/>
+                <w:szCs w:val="22"/>
+              </w:rPr>
+            </w:pPr>
+            <w:r>
+              <w:t xml:space="preserve">Canva</w:t>
+            </w:r>
+          </w:p>
+          <w:p>
+            <w:pPr>
+              <w:pBdr>
+                <w:top w:val="nil"/>
+                <w:left w:val="nil"/>
+                <w:bottom w:val="nil"/>
+                <w:right w:val="nil"/>
+                <w:between w:val="nil"/>
+              </w:pBdr>
+              <w:spacing w:before="120" w:line="276" w:lineRule="auto"/>
+              <w:ind w:left="52"/>
+              <w:jc w:val="both"/>
+              <w:rPr>
+                <w:rFonts w:ascii="Tahoma" w:eastAsia="Tahoma" w:hAnsi="Tahoma" w:cs="Tahoma"/>
+                <w:color w:val="000000" w:themeColor="text1"/>
+                <w:sz w:val="22"/>
+                <w:szCs w:val="22"/>
+              </w:rPr>
+            </w:pPr>
+            <w:r>
+              <w:t xml:space="preserve">Software Desain (CorelDraw/Illustrator/Photoshop)</w:t>
             </w:r>
           </w:p>
         </w:tc>
@@ -819,32 +1108,6 @@
             <w:tcW w:w="7189" w:type="dxa"/>
             <w:gridSpan w:val="6"/>
           </w:tcPr>
-          <w:p>
-            <w:pPr>
-              <w:numPr>
-                <w:ilvl w:val="0"/>
-                <w:numId w:val="5"/>
-              </w:numPr>
-              <w:spacing w:before="120" w:line="276" w:lineRule="auto"/>
-              <w:ind w:left="266" w:hanging="266"/>
-              <w:jc w:val="both"/>
-              <w:rPr>
-                <w:rFonts w:ascii="Tahoma" w:eastAsia="Tahoma" w:hAnsi="Tahoma" w:cs="Tahoma"/>
-                <w:color w:val="000000" w:themeColor="text1"/>
-                <w:sz w:val="22"/>
-                <w:szCs w:val="22"/>
-              </w:rPr>
-            </w:pPr>
-            <w:r>
-              <w:rPr>
-                <w:rFonts w:ascii="Tahoma" w:eastAsia="Tahoma" w:hAnsi="Tahoma" w:cs="Tahoma"/>
-                <w:color w:val="000000" w:themeColor="text1"/>
-                <w:sz w:val="22"/>
-                <w:szCs w:val="22"/>
-              </w:rPr>
-              <w:t>Persiapan ruangan</w:t>
-            </w:r>
-          </w:p>
           <w:p>
             <w:pPr>
               <w:numPr>
@@ -862,13 +1125,27 @@
               </w:rPr>
             </w:pPr>
             <w:r>
+              <w:t xml:space="preserve">Persiapan ruangan</w:t>
+            </w:r>
+          </w:p>
+          <w:p>
+            <w:pPr>
+              <w:numPr>
+                <w:ilvl w:val="0"/>
+                <w:numId w:val="5"/>
+              </w:numPr>
+              <w:spacing w:after="120" w:line="276" w:lineRule="auto"/>
+              <w:ind w:left="294" w:hanging="284"/>
+              <w:jc w:val="both"/>
               <w:rPr>
                 <w:rFonts w:ascii="Tahoma" w:eastAsia="Tahoma" w:hAnsi="Tahoma" w:cs="Tahoma"/>
                 <w:color w:val="000000" w:themeColor="text1"/>
                 <w:sz w:val="22"/>
                 <w:szCs w:val="22"/>
               </w:rPr>
-              <w:t>Persiapan alat peraga</w:t>
+            </w:pPr>
+            <w:r>
+              <w:t xml:space="preserve">Persiapan alat peraga</w:t>
             </w:r>
           </w:p>
         </w:tc>
@@ -887,7 +1164,7 @@
           </w:tcPr>
           <w:p>
             <w:pPr>
-              <w:pStyle w:val="DaftarParagraf"/>
+              <w:pStyle w:val="ListParagraph"/>
               <w:numPr>
                 <w:ilvl w:val="0"/>
                 <w:numId w:val="6"/>
@@ -916,20 +1193,87 @@
             <w:vMerge w:val="restart"/>
           </w:tcPr>
           <w:p>
-            <w:r>
-              <w:t>1. Memberi salam dan Memperkenalkan diri</w:t>
-              <w:br/>
-              <w:t>2. Mengabsen peserta pelatihan</w:t>
-              <w:br/>
-              <w:t>3. Menjelaskan safety induction dan rules</w:t>
-              <w:br/>
-              <w:t>4. Mengadakan apersepsi</w:t>
-              <w:br/>
-              <w:t>5. Menyampaikan judul</w:t>
-              <w:br/>
-              <w:t>6. Roadmap pelatihan</w:t>
-              <w:br/>
-              <w:t>7. Menyampaikan tujuan dan manfaat belajar</w:t>
+            <w:pPr>
+              <w:rPr>
+                <w:rFonts w:ascii="Tahoma" w:eastAsia="Tahoma" w:hAnsi="Tahoma" w:cs="Tahoma"/>
+                <w:sz w:val="22"/>
+                <w:szCs w:val="22"/>
+              </w:rPr>
+            </w:pPr>
+            <w:r>
+              <w:t xml:space="preserve">1. Memberi salam dan Memperkenalkan diri</w:t>
+            </w:r>
+          </w:p>
+          <w:p>
+            <w:pPr>
+              <w:rPr>
+                <w:rFonts w:ascii="Tahoma" w:eastAsia="Tahoma" w:hAnsi="Tahoma" w:cs="Tahoma"/>
+                <w:sz w:val="22"/>
+                <w:szCs w:val="22"/>
+              </w:rPr>
+            </w:pPr>
+            <w:r>
+              <w:t xml:space="preserve">2. Mengabsen peserta pelatihan</w:t>
+            </w:r>
+          </w:p>
+          <w:p>
+            <w:pPr>
+              <w:rPr>
+                <w:rFonts w:ascii="Tahoma" w:eastAsia="Tahoma" w:hAnsi="Tahoma" w:cs="Tahoma"/>
+                <w:sz w:val="22"/>
+                <w:szCs w:val="22"/>
+              </w:rPr>
+            </w:pPr>
+            <w:r>
+              <w:t xml:space="preserve">3. Menjelaskan safety induction dan rules</w:t>
+            </w:r>
+          </w:p>
+          <w:p>
+            <w:pPr>
+              <w:rPr>
+                <w:rFonts w:ascii="Tahoma" w:eastAsia="Tahoma" w:hAnsi="Tahoma" w:cs="Tahoma"/>
+                <w:sz w:val="22"/>
+                <w:szCs w:val="22"/>
+              </w:rPr>
+            </w:pPr>
+            <w:r>
+              <w:t xml:space="preserve">4. Mengadakan apersepsi</w:t>
+            </w:r>
+          </w:p>
+          <w:p>
+            <w:pPr>
+              <w:rPr>
+                <w:rFonts w:ascii="Tahoma" w:eastAsia="Tahoma" w:hAnsi="Tahoma" w:cs="Tahoma"/>
+                <w:sz w:val="22"/>
+                <w:szCs w:val="22"/>
+              </w:rPr>
+            </w:pPr>
+            <w:r>
+              <w:t xml:space="preserve">5. Menyampaikan judul</w:t>
+            </w:r>
+          </w:p>
+          <w:p>
+            <w:pPr>
+              <w:rPr>
+                <w:rFonts w:ascii="Tahoma" w:eastAsia="Tahoma" w:hAnsi="Tahoma" w:cs="Tahoma"/>
+                <w:sz w:val="22"/>
+                <w:szCs w:val="22"/>
+              </w:rPr>
+            </w:pPr>
+            <w:r>
+              <w:t xml:space="preserve">6. Roadmap pelatihan</w:t>
+            </w:r>
+          </w:p>
+          <w:p>
+            <w:pPr>
+              <w:rPr>
+                <w:rFonts w:ascii="Tahoma" w:eastAsia="Tahoma" w:hAnsi="Tahoma" w:cs="Tahoma"/>
+                <w:sz w:val="22"/>
+                <w:szCs w:val="22"/>
+              </w:rPr>
+            </w:pPr>
+            <w:r>
+              <w:t xml:space="preserve">7. Menyampaikan tujuan dan manfaat belajar</w:t>
             </w:r>
           </w:p>
         </w:tc>
@@ -956,7 +1300,6 @@
                 <w:sz w:val="22"/>
                 <w:szCs w:val="22"/>
               </w:rPr>
-              <w:lastRenderedPageBreak/>
               <w:t>Perkiraan Waktu</w:t>
             </w:r>
           </w:p>
@@ -1023,8 +1366,17 @@
             <w:tcW w:w="1850" w:type="dxa"/>
           </w:tcPr>
           <w:p>
-            <w:r>
-              <w:t>15 menit</w:t>
+            <w:pPr>
+              <w:ind w:left="26"/>
+              <w:jc w:val="center"/>
+              <w:rPr>
+                <w:rFonts w:ascii="Tahoma" w:eastAsia="Tahoma" w:hAnsi="Tahoma" w:cs="Tahoma"/>
+                <w:sz w:val="22"/>
+                <w:szCs w:val="22"/>
+              </w:rPr>
+            </w:pPr>
+            <w:r>
+              <w:t xml:space="preserve">10 menit</w:t>
             </w:r>
           </w:p>
         </w:tc>
@@ -1045,7 +1397,7 @@
           </w:tcPr>
           <w:p>
             <w:pPr>
-              <w:pStyle w:val="DaftarParagraf"/>
+              <w:pStyle w:val="ListParagraph"/>
               <w:numPr>
                 <w:ilvl w:val="0"/>
                 <w:numId w:val="6"/>
@@ -1281,22 +1633,7 @@
               </w:rPr>
             </w:pPr>
             <w:r>
-              <w:rPr>
-                <w:rFonts w:ascii="Tahoma" w:eastAsia="Tahoma" w:hAnsi="Tahoma" w:cs="Tahoma"/>
-                <w:b/>
-                <w:sz w:val="22"/>
-                <w:szCs w:val="22"/>
-              </w:rPr>
-              <w:t>Perkiraan Waktu</w:t>
-            </w:r>
-            <w:r>
-              <w:rPr>
-                <w:rFonts w:ascii="Tahoma" w:eastAsia="Tahoma" w:hAnsi="Tahoma" w:cs="Tahoma"/>
-                <w:i/>
-                <w:sz w:val="22"/>
-                <w:szCs w:val="22"/>
-              </w:rPr>
-              <w:t xml:space="preserve"> </w:t>
+              <w:t xml:space="preserve">Perkiraan Waktu</w:t>
             </w:r>
           </w:p>
         </w:tc>
@@ -1314,7 +1651,7 @@
           </w:tcPr>
           <w:p>
             <w:r>
-              <w:t>Pengenalan K3 Pertanian Modern &amp; Keselamatan Kelistrikan</w:t>
+              <w:t>Instruktur menjelaskan terkait K3 pertanian, potensi bahaya kelistrikan alat IoT, dan penggunaan APD.</w:t>
             </w:r>
           </w:p>
         </w:tc>
@@ -1324,14 +1661,153 @@
             <w:gridSpan w:val="2"/>
           </w:tcPr>
           <w:p>
-            <w:r>
-              <w:t>Pengenalan K3 Pertanian dan Keselamatan Kelistrikan:</w:t>
-              <w:br/>
-              <w:t>- Dasar-dasar K3 di lahan pertanian modern</w:t>
-              <w:br/>
-              <w:t>- Bahaya kelistrikan pada perangkat otomatisasi</w:t>
-              <w:br/>
-              <w:t>- Pengenalan Alat Pelindung Diri (APD) standar</w:t>
+            <w:pPr>
+              <w:pStyle w:val="ListParagraph"/>
+              <w:numPr>
+                <w:ilvl w:val="0"/>
+                <w:numId w:val="4"/>
+              </w:numPr>
+              <w:pBdr>
+                <w:top w:val="nil"/>
+                <w:left w:val="nil"/>
+                <w:bottom w:val="nil"/>
+                <w:right w:val="nil"/>
+                <w:between w:val="nil"/>
+              </w:pBdr>
+              <w:spacing w:before="60"/>
+              <w:ind w:left="171" w:right="89" w:hanging="283"/>
+              <w:rPr>
+                <w:rFonts w:ascii="Tahoma" w:eastAsia="Tahoma" w:hAnsi="Tahoma" w:cs="Tahoma"/>
+                <w:color w:val="000000"/>
+              </w:rPr>
+            </w:pPr>
+            <w:r>
+              <w:t xml:space="preserve">Instruktur menjelaskan kepada peserta terkait:</w:t>
+            </w:r>
+          </w:p>
+          <w:p>
+            <w:pPr>
+              <w:pStyle w:val="ListParagraph"/>
+              <w:numPr>
+                <w:ilvl w:val="0"/>
+                <w:numId w:val="4"/>
+              </w:numPr>
+              <w:pBdr>
+                <w:top w:val="nil"/>
+                <w:left w:val="nil"/>
+                <w:bottom w:val="nil"/>
+                <w:right w:val="nil"/>
+                <w:between w:val="nil"/>
+              </w:pBdr>
+              <w:spacing w:before="60"/>
+              <w:ind w:left="171" w:right="89" w:hanging="283"/>
+              <w:rPr>
+                <w:rFonts w:ascii="Tahoma" w:eastAsia="Tahoma" w:hAnsi="Tahoma" w:cs="Tahoma"/>
+                <w:color w:val="000000"/>
+              </w:rPr>
+            </w:pPr>
+            <w:r>
+              <w:t xml:space="preserve">- Pengertian prototipe dalam desain grafis</w:t>
+            </w:r>
+          </w:p>
+          <w:p>
+            <w:pPr>
+              <w:pStyle w:val="ListParagraph"/>
+              <w:numPr>
+                <w:ilvl w:val="0"/>
+                <w:numId w:val="4"/>
+              </w:numPr>
+              <w:pBdr>
+                <w:top w:val="nil"/>
+                <w:left w:val="nil"/>
+                <w:bottom w:val="nil"/>
+                <w:right w:val="nil"/>
+                <w:between w:val="nil"/>
+              </w:pBdr>
+              <w:spacing w:before="60"/>
+              <w:ind w:left="171" w:right="89" w:hanging="283"/>
+              <w:rPr>
+                <w:rFonts w:ascii="Tahoma" w:eastAsia="Tahoma" w:hAnsi="Tahoma" w:cs="Tahoma"/>
+                <w:color w:val="000000"/>
+              </w:rPr>
+            </w:pPr>
+            <w:r>
+              <w:t xml:space="preserve">- Design brief sebagai acuan: konsep, tujuan, konten, target audiens</w:t>
+            </w:r>
+          </w:p>
+          <w:p>
+            <w:pPr>
+              <w:pStyle w:val="ListParagraph"/>
+              <w:numPr>
+                <w:ilvl w:val="0"/>
+                <w:numId w:val="4"/>
+              </w:numPr>
+              <w:pBdr>
+                <w:top w:val="nil"/>
+                <w:left w:val="nil"/>
+                <w:bottom w:val="nil"/>
+                <w:right w:val="nil"/>
+                <w:between w:val="nil"/>
+              </w:pBdr>
+              <w:spacing w:before="60"/>
+              <w:ind w:left="171" w:right="89" w:hanging="283"/>
+              <w:rPr>
+                <w:rFonts w:ascii="Tahoma" w:eastAsia="Tahoma" w:hAnsi="Tahoma" w:cs="Tahoma"/>
+                <w:color w:val="000000"/>
+              </w:rPr>
+            </w:pPr>
+            <w:r>
+              <w:t xml:space="preserve">- Tahap memilih media/wadah karya desain</w:t>
+            </w:r>
+          </w:p>
+          <w:p>
+            <w:pPr>
+              <w:pStyle w:val="ListParagraph"/>
+              <w:numPr>
+                <w:ilvl w:val="0"/>
+                <w:numId w:val="4"/>
+              </w:numPr>
+              <w:pBdr>
+                <w:top w:val="nil"/>
+                <w:left w:val="nil"/>
+                <w:bottom w:val="nil"/>
+                <w:right w:val="nil"/>
+                <w:between w:val="nil"/>
+              </w:pBdr>
+              <w:spacing w:before="60"/>
+              <w:ind w:left="171" w:right="89" w:hanging="283"/>
+              <w:rPr>
+                <w:rFonts w:ascii="Tahoma" w:eastAsia="Tahoma" w:hAnsi="Tahoma" w:cs="Tahoma"/>
+                <w:color w:val="000000"/>
+              </w:rPr>
+            </w:pPr>
+            <w:r>
+              <w:t xml:space="preserve">- Cara menelaah informasi kunci pada design brief</w:t>
+            </w:r>
+          </w:p>
+          <w:p>
+            <w:pPr>
+              <w:pStyle w:val="ListParagraph"/>
+              <w:numPr>
+                <w:ilvl w:val="0"/>
+                <w:numId w:val="4"/>
+              </w:numPr>
+              <w:pBdr>
+                <w:top w:val="nil"/>
+                <w:left w:val="nil"/>
+                <w:bottom w:val="nil"/>
+                <w:right w:val="nil"/>
+                <w:between w:val="nil"/>
+              </w:pBdr>
+              <w:spacing w:before="60"/>
+              <w:ind w:left="171" w:right="89" w:hanging="283"/>
+              <w:rPr>
+                <w:rFonts w:ascii="Tahoma" w:eastAsia="Tahoma" w:hAnsi="Tahoma" w:cs="Tahoma"/>
+                <w:color w:val="000000"/>
+              </w:rPr>
+            </w:pPr>
+            <w:r>
+              <w:t xml:space="preserve">Instruktur menanyakan kepada peserta apakah materi yang disampaikan telah dipahami dan memberikan kesempatan kepada peserta untuk mengajukan pertanyaan</w:t>
             </w:r>
           </w:p>
         </w:tc>
@@ -1341,8 +1817,47 @@
             <w:gridSpan w:val="3"/>
           </w:tcPr>
           <w:p>
-            <w:r>
-              <w:t>Power Point / Modul / Alat Praktik</w:t>
+            <w:pPr>
+              <w:pBdr>
+                <w:top w:val="nil"/>
+                <w:left w:val="nil"/>
+                <w:bottom w:val="nil"/>
+                <w:right w:val="nil"/>
+                <w:between w:val="nil"/>
+              </w:pBdr>
+              <w:spacing w:before="60" w:line="276" w:lineRule="auto"/>
+              <w:ind w:left="253" w:right="89"/>
+              <w:rPr>
+                <w:rFonts w:ascii="Tahoma" w:eastAsia="Tahoma" w:hAnsi="Tahoma" w:cs="Tahoma"/>
+                <w:color w:val="000000"/>
+                <w:sz w:val="22"/>
+                <w:szCs w:val="22"/>
+              </w:rPr>
+            </w:pPr>
+            <w:r>
+              <w:t xml:space="preserve">Power Point</w:t>
+            </w:r>
+          </w:p>
+          <w:p>
+            <w:pPr>
+              <w:pBdr>
+                <w:top w:val="nil"/>
+                <w:left w:val="nil"/>
+                <w:bottom w:val="nil"/>
+                <w:right w:val="nil"/>
+                <w:between w:val="nil"/>
+              </w:pBdr>
+              <w:spacing w:before="60" w:line="276" w:lineRule="auto"/>
+              <w:ind w:left="253" w:right="89"/>
+              <w:rPr>
+                <w:rFonts w:ascii="Tahoma" w:eastAsia="Tahoma" w:hAnsi="Tahoma" w:cs="Tahoma"/>
+                <w:color w:val="000000"/>
+                <w:sz w:val="22"/>
+                <w:szCs w:val="22"/>
+              </w:rPr>
+            </w:pPr>
+            <w:r>
+              <w:t xml:space="preserve">Gambar dan Video</w:t>
             </w:r>
           </w:p>
         </w:tc>
@@ -1351,8 +1866,17 @@
             <w:tcW w:w="1850" w:type="dxa"/>
           </w:tcPr>
           <w:p>
-            <w:r>
-              <w:t>275 menit</w:t>
+            <w:pPr>
+              <w:spacing w:before="60"/>
+              <w:jc w:val="center"/>
+              <w:rPr>
+                <w:rFonts w:ascii="Tahoma" w:eastAsia="Tahoma" w:hAnsi="Tahoma" w:cs="Tahoma"/>
+                <w:sz w:val="22"/>
+                <w:szCs w:val="22"/>
+              </w:rPr>
+            </w:pPr>
+            <w:r>
+              <w:t xml:space="preserve">35 menit</w:t>
             </w:r>
           </w:p>
         </w:tc>
@@ -1370,7 +1894,7 @@
           </w:tcPr>
           <w:p>
             <w:pPr>
-              <w:pStyle w:val="DaftarParagraf"/>
+              <w:pStyle w:val="ListParagraph"/>
               <w:numPr>
                 <w:ilvl w:val="3"/>
                 <w:numId w:val="5"/>
@@ -1383,11 +1907,7 @@
               </w:rPr>
             </w:pPr>
             <w:r>
-              <w:rPr>
-                <w:rFonts w:ascii="Tahoma" w:eastAsia="Tahoma" w:hAnsi="Tahoma" w:cs="Tahoma"/>
-                <w:b/>
-              </w:rPr>
-              <w:t>Pengenalan Tools AI ( ChatGPT dan Canva AI)</w:t>
+              <w:t xml:space="preserve">Brainstorming &amp; Pembuatan Thumbnail</w:t>
             </w:r>
           </w:p>
         </w:tc>
@@ -1419,129 +1939,7 @@
               </w:rPr>
             </w:pPr>
             <w:r>
-              <w:rPr>
-                <w:rFonts w:ascii="Tahoma" w:eastAsia="Tahoma" w:hAnsi="Tahoma" w:cs="Tahoma"/>
-                <w:color w:val="000000"/>
-                <w:sz w:val="22"/>
-                <w:szCs w:val="22"/>
-              </w:rPr>
-              <w:t>Instruktur menjelaskan kepada peserta terkait :</w:t>
-            </w:r>
-          </w:p>
-          <w:p>
-            <w:pPr>
-              <w:pStyle w:val="DaftarParagraf"/>
-              <w:numPr>
-                <w:ilvl w:val="4"/>
-                <w:numId w:val="5"/>
-              </w:numPr>
-              <w:pBdr>
-                <w:top w:val="nil"/>
-                <w:left w:val="nil"/>
-                <w:bottom w:val="nil"/>
-                <w:right w:val="nil"/>
-                <w:between w:val="nil"/>
-              </w:pBdr>
-              <w:spacing w:before="60"/>
-              <w:ind w:left="738" w:right="89"/>
-              <w:rPr>
-                <w:rFonts w:ascii="Tahoma" w:eastAsia="Tahoma" w:hAnsi="Tahoma" w:cs="Tahoma"/>
-                <w:color w:val="000000"/>
-              </w:rPr>
-            </w:pPr>
-            <w:r>
-              <w:rPr>
-                <w:rFonts w:ascii="Tahoma" w:eastAsia="Tahoma" w:hAnsi="Tahoma" w:cs="Tahoma"/>
-                <w:color w:val="000000"/>
-              </w:rPr>
-              <w:t>Pengertian ChatGPT dan Canva AI.</w:t>
-            </w:r>
-          </w:p>
-          <w:p>
-            <w:pPr>
-              <w:pStyle w:val="DaftarParagraf"/>
-              <w:numPr>
-                <w:ilvl w:val="4"/>
-                <w:numId w:val="5"/>
-              </w:numPr>
-              <w:pBdr>
-                <w:top w:val="nil"/>
-                <w:left w:val="nil"/>
-                <w:bottom w:val="nil"/>
-                <w:right w:val="nil"/>
-                <w:between w:val="nil"/>
-              </w:pBdr>
-              <w:spacing w:before="60"/>
-              <w:ind w:left="738" w:right="89"/>
-              <w:rPr>
-                <w:rFonts w:ascii="Tahoma" w:eastAsia="Tahoma" w:hAnsi="Tahoma" w:cs="Tahoma"/>
-                <w:color w:val="000000"/>
-              </w:rPr>
-            </w:pPr>
-            <w:r>
-              <w:rPr>
-                <w:rFonts w:ascii="Tahoma" w:eastAsia="Tahoma" w:hAnsi="Tahoma" w:cs="Tahoma"/>
-                <w:color w:val="000000"/>
-              </w:rPr>
-              <w:t>Manfaat atau Fungsi ChatGPT dan Canva AI dalam Copywriting</w:t>
-            </w:r>
-          </w:p>
-          <w:p>
-            <w:pPr>
-              <w:pStyle w:val="DaftarParagraf"/>
-              <w:numPr>
-                <w:ilvl w:val="4"/>
-                <w:numId w:val="5"/>
-              </w:numPr>
-              <w:pBdr>
-                <w:top w:val="nil"/>
-                <w:left w:val="nil"/>
-                <w:bottom w:val="nil"/>
-                <w:right w:val="nil"/>
-                <w:between w:val="nil"/>
-              </w:pBdr>
-              <w:spacing w:before="60"/>
-              <w:ind w:left="738" w:right="89"/>
-              <w:rPr>
-                <w:rFonts w:ascii="Tahoma" w:eastAsia="Tahoma" w:hAnsi="Tahoma" w:cs="Tahoma"/>
-                <w:color w:val="000000"/>
-              </w:rPr>
-            </w:pPr>
-            <w:r>
-              <w:rPr>
-                <w:rFonts w:ascii="Tahoma" w:eastAsia="Tahoma" w:hAnsi="Tahoma" w:cs="Tahoma"/>
-                <w:color w:val="000000"/>
-              </w:rPr>
-              <w:t>Fitur-Fitur yang terdapat pada ChatGPT dan Canva AI</w:t>
-            </w:r>
-          </w:p>
-          <w:p>
-            <w:pPr>
-              <w:pStyle w:val="DaftarParagraf"/>
-              <w:numPr>
-                <w:ilvl w:val="4"/>
-                <w:numId w:val="5"/>
-              </w:numPr>
-              <w:pBdr>
-                <w:top w:val="nil"/>
-                <w:left w:val="nil"/>
-                <w:bottom w:val="nil"/>
-                <w:right w:val="nil"/>
-                <w:between w:val="nil"/>
-              </w:pBdr>
-              <w:spacing w:before="60"/>
-              <w:ind w:left="738" w:right="89"/>
-              <w:rPr>
-                <w:rFonts w:ascii="Tahoma" w:eastAsia="Tahoma" w:hAnsi="Tahoma" w:cs="Tahoma"/>
-                <w:color w:val="000000"/>
-              </w:rPr>
-            </w:pPr>
-            <w:r>
-              <w:rPr>
-                <w:rFonts w:ascii="Tahoma" w:eastAsia="Tahoma" w:hAnsi="Tahoma" w:cs="Tahoma"/>
-                <w:color w:val="000000"/>
-              </w:rPr>
-              <w:t>Perbedaan ChatGPT dan Canva AI</w:t>
+              <w:t xml:space="preserve">Instruktur menjelaskan kepada peserta terkait:</w:t>
             </w:r>
           </w:p>
           <w:p>
@@ -1567,19 +1965,639 @@
               </w:rPr>
             </w:pPr>
             <w:r>
+              <w:t xml:space="preserve">- Mengumpulkan dan mengelompokkan konten teks &amp; gambar</w:t>
+            </w:r>
+          </w:p>
+          <w:p>
+            <w:pPr>
+              <w:numPr>
+                <w:ilvl w:val="0"/>
+                <w:numId w:val="4"/>
+              </w:numPr>
+              <w:pBdr>
+                <w:top w:val="nil"/>
+                <w:left w:val="nil"/>
+                <w:bottom w:val="nil"/>
+                <w:right w:val="nil"/>
+                <w:between w:val="nil"/>
+              </w:pBdr>
+              <w:spacing w:before="60" w:line="276" w:lineRule="auto"/>
+              <w:ind w:left="171" w:right="89" w:hanging="283"/>
               <w:rPr>
                 <w:rFonts w:ascii="Tahoma" w:eastAsia="Tahoma" w:hAnsi="Tahoma" w:cs="Tahoma"/>
                 <w:color w:val="000000"/>
-              </w:rPr>
-              <w:t xml:space="preserve">Instruktur menanyakan kepada peserta apakah materi yang disampaikan telah dipahami dan memberikan kesempatan </w:t>
-            </w:r>
-            <w:r>
+                <w:sz w:val="22"/>
+                <w:szCs w:val="22"/>
+              </w:rPr>
+            </w:pPr>
+            <w:r>
+              <w:t xml:space="preserve">- Menentukan prioritas konten</w:t>
+            </w:r>
+          </w:p>
+          <w:p>
+            <w:pPr>
+              <w:numPr>
+                <w:ilvl w:val="0"/>
+                <w:numId w:val="4"/>
+              </w:numPr>
+              <w:pBdr>
+                <w:top w:val="nil"/>
+                <w:left w:val="nil"/>
+                <w:bottom w:val="nil"/>
+                <w:right w:val="nil"/>
+                <w:between w:val="nil"/>
+              </w:pBdr>
+              <w:spacing w:before="60" w:line="276" w:lineRule="auto"/>
+              <w:ind w:left="171" w:right="89" w:hanging="283"/>
               <w:rPr>
                 <w:rFonts w:ascii="Tahoma" w:eastAsia="Tahoma" w:hAnsi="Tahoma" w:cs="Tahoma"/>
                 <w:color w:val="000000"/>
-              </w:rPr>
-              <w:lastRenderedPageBreak/>
-              <w:t>kepada peserta untuk mengajukan pertanyaan</w:t>
+                <w:sz w:val="22"/>
+                <w:szCs w:val="22"/>
+              </w:rPr>
+            </w:pPr>
+            <w:r>
+              <w:t xml:space="preserve">- Mencari referensi &amp; pembanding desain</w:t>
+            </w:r>
+          </w:p>
+          <w:p>
+            <w:pPr>
+              <w:numPr>
+                <w:ilvl w:val="0"/>
+                <w:numId w:val="4"/>
+              </w:numPr>
+              <w:pBdr>
+                <w:top w:val="nil"/>
+                <w:left w:val="nil"/>
+                <w:bottom w:val="nil"/>
+                <w:right w:val="nil"/>
+                <w:between w:val="nil"/>
+              </w:pBdr>
+              <w:spacing w:before="60" w:line="276" w:lineRule="auto"/>
+              <w:ind w:left="171" w:right="89" w:hanging="283"/>
+              <w:rPr>
+                <w:rFonts w:ascii="Tahoma" w:eastAsia="Tahoma" w:hAnsi="Tahoma" w:cs="Tahoma"/>
+                <w:color w:val="000000"/>
+                <w:sz w:val="22"/>
+                <w:szCs w:val="22"/>
+              </w:rPr>
+            </w:pPr>
+            <w:r>
+              <w:t xml:space="preserve">- Teknik membuat thumbnail: margin &amp; grid</w:t>
+            </w:r>
+          </w:p>
+          <w:p>
+            <w:pPr>
+              <w:numPr>
+                <w:ilvl w:val="0"/>
+                <w:numId w:val="4"/>
+              </w:numPr>
+              <w:pBdr>
+                <w:top w:val="nil"/>
+                <w:left w:val="nil"/>
+                <w:bottom w:val="nil"/>
+                <w:right w:val="nil"/>
+                <w:between w:val="nil"/>
+              </w:pBdr>
+              <w:spacing w:before="60" w:line="276" w:lineRule="auto"/>
+              <w:ind w:left="171" w:right="89" w:hanging="283"/>
+              <w:rPr>
+                <w:rFonts w:ascii="Tahoma" w:eastAsia="Tahoma" w:hAnsi="Tahoma" w:cs="Tahoma"/>
+                <w:color w:val="000000"/>
+                <w:sz w:val="22"/>
+                <w:szCs w:val="22"/>
+              </w:rPr>
+            </w:pPr>
+            <w:r>
+              <w:t xml:space="preserve">- Membuat beberapa alternatif thumbnail</w:t>
+            </w:r>
+          </w:p>
+          <w:p>
+            <w:pPr>
+              <w:numPr>
+                <w:ilvl w:val="0"/>
+                <w:numId w:val="4"/>
+              </w:numPr>
+              <w:pBdr>
+                <w:top w:val="nil"/>
+                <w:left w:val="nil"/>
+                <w:bottom w:val="nil"/>
+                <w:right w:val="nil"/>
+                <w:between w:val="nil"/>
+              </w:pBdr>
+              <w:spacing w:before="60" w:line="276" w:lineRule="auto"/>
+              <w:ind w:left="171" w:right="89" w:hanging="283"/>
+              <w:rPr>
+                <w:rFonts w:ascii="Tahoma" w:eastAsia="Tahoma" w:hAnsi="Tahoma" w:cs="Tahoma"/>
+                <w:color w:val="000000"/>
+                <w:sz w:val="22"/>
+                <w:szCs w:val="22"/>
+              </w:rPr>
+            </w:pPr>
+            <w:r>
+              <w:t xml:space="preserve">Instruktur menanyakan kepada peserta apakah materi yang disampaikan telah dipahami dan memberikan kesempatan kepada peserta untuk mengajukan pertanyaan</w:t>
+            </w:r>
+          </w:p>
+        </w:tc>
+        <w:tc>
+          <w:tcPr>
+            <w:tcW w:w="1796" w:type="dxa"/>
+            <w:gridSpan w:val="3"/>
+          </w:tcPr>
+          <w:p>
+            <w:pPr>
+              <w:pBdr>
+                <w:top w:val="nil"/>
+                <w:left w:val="nil"/>
+                <w:bottom w:val="nil"/>
+                <w:right w:val="nil"/>
+                <w:between w:val="nil"/>
+              </w:pBdr>
+              <w:spacing w:before="60" w:line="276" w:lineRule="auto"/>
+              <w:ind w:left="253" w:right="89"/>
+              <w:rPr>
+                <w:rFonts w:ascii="Tahoma" w:eastAsia="Tahoma" w:hAnsi="Tahoma" w:cs="Tahoma"/>
+                <w:color w:val="000000"/>
+                <w:sz w:val="22"/>
+                <w:szCs w:val="22"/>
+              </w:rPr>
+            </w:pPr>
+            <w:r>
+              <w:t xml:space="preserve">Power Point</w:t>
+            </w:r>
+          </w:p>
+          <w:p>
+            <w:pPr>
+              <w:pBdr>
+                <w:top w:val="nil"/>
+                <w:left w:val="nil"/>
+                <w:bottom w:val="nil"/>
+                <w:right w:val="nil"/>
+                <w:between w:val="nil"/>
+              </w:pBdr>
+              <w:spacing w:before="60" w:line="276" w:lineRule="auto"/>
+              <w:ind w:left="253" w:right="89"/>
+              <w:rPr>
+                <w:rFonts w:ascii="Tahoma" w:eastAsia="Tahoma" w:hAnsi="Tahoma" w:cs="Tahoma"/>
+                <w:color w:val="000000"/>
+                <w:sz w:val="22"/>
+                <w:szCs w:val="22"/>
+              </w:rPr>
+            </w:pPr>
+            <w:r>
+              <w:t xml:space="preserve">Gambar dan Video</w:t>
+            </w:r>
+          </w:p>
+        </w:tc>
+        <w:tc>
+          <w:tcPr>
+            <w:tcW w:w="1850" w:type="dxa"/>
+          </w:tcPr>
+          <w:p>
+            <w:pPr>
+              <w:spacing w:before="60"/>
+              <w:jc w:val="center"/>
+              <w:rPr>
+                <w:rFonts w:ascii="Tahoma" w:eastAsia="Tahoma" w:hAnsi="Tahoma" w:cs="Tahoma"/>
+                <w:sz w:val="22"/>
+                <w:szCs w:val="22"/>
+              </w:rPr>
+            </w:pPr>
+            <w:r>
+              <w:t xml:space="preserve">35 menit</w:t>
+            </w:r>
+          </w:p>
+        </w:tc>
+      </w:tr>
+      <w:tr>
+        <w:trPr>
+          <w:gridAfter w:val="1"/>
+          <w:wAfter w:w="10" w:type="dxa"/>
+          <w:trHeight w:val="563"/>
+        </w:trPr>
+        <w:tc>
+          <w:tcPr>
+            <w:tcW w:w="2665" w:type="dxa"/>
+            <w:gridSpan w:val="3"/>
+          </w:tcPr>
+          <w:p>
+            <w:pPr>
+              <w:pStyle w:val="ListParagraph"/>
+              <w:numPr>
+                <w:ilvl w:val="3"/>
+                <w:numId w:val="5"/>
+              </w:numPr>
+              <w:spacing w:before="60"/>
+              <w:ind w:left="292"/>
+              <w:rPr>
+                <w:rFonts w:ascii="Tahoma" w:eastAsia="Tahoma" w:hAnsi="Tahoma" w:cs="Tahoma"/>
+                <w:b/>
+              </w:rPr>
+            </w:pPr>
+            <w:r>
+              <w:t xml:space="preserve">Praktik Membuat Thumbnail (Sketsa)</w:t>
+            </w:r>
+          </w:p>
+        </w:tc>
+        <w:tc>
+          <w:tcPr>
+            <w:tcW w:w="3543" w:type="dxa"/>
+            <w:gridSpan w:val="2"/>
+          </w:tcPr>
+          <w:p>
+            <w:pPr>
+              <w:numPr>
+                <w:ilvl w:val="0"/>
+                <w:numId w:val="4"/>
+              </w:numPr>
+              <w:pBdr>
+                <w:top w:val="nil"/>
+                <w:left w:val="nil"/>
+                <w:bottom w:val="nil"/>
+                <w:right w:val="nil"/>
+                <w:between w:val="nil"/>
+              </w:pBdr>
+              <w:spacing w:before="60" w:line="276" w:lineRule="auto"/>
+              <w:ind w:left="171" w:right="89" w:hanging="283"/>
+              <w:rPr>
+                <w:rFonts w:ascii="Tahoma" w:eastAsia="Tahoma" w:hAnsi="Tahoma" w:cs="Tahoma"/>
+                <w:color w:val="000000"/>
+                <w:sz w:val="22"/>
+                <w:szCs w:val="22"/>
+              </w:rPr>
+            </w:pPr>
+            <w:r>
+              <w:t xml:space="preserve">Instruktur memberikan jobsheet dan mendampingi peserta untuk:</w:t>
+            </w:r>
+          </w:p>
+          <w:p>
+            <w:pPr>
+              <w:numPr>
+                <w:ilvl w:val="0"/>
+                <w:numId w:val="4"/>
+              </w:numPr>
+              <w:pBdr>
+                <w:top w:val="nil"/>
+                <w:left w:val="nil"/>
+                <w:bottom w:val="nil"/>
+                <w:right w:val="nil"/>
+                <w:between w:val="nil"/>
+              </w:pBdr>
+              <w:spacing w:before="60" w:line="276" w:lineRule="auto"/>
+              <w:ind w:left="171" w:right="89" w:hanging="283"/>
+              <w:rPr>
+                <w:rFonts w:ascii="Tahoma" w:eastAsia="Tahoma" w:hAnsi="Tahoma" w:cs="Tahoma"/>
+                <w:color w:val="000000"/>
+                <w:sz w:val="22"/>
+                <w:szCs w:val="22"/>
+              </w:rPr>
+            </w:pPr>
+            <w:r>
+              <w:t xml:space="preserve">- Membuat minimal 3 alternatif thumbnail (sketsa kasar) di buku sketsa sesuai design brief</w:t>
+            </w:r>
+          </w:p>
+          <w:p>
+            <w:pPr>
+              <w:numPr>
+                <w:ilvl w:val="0"/>
+                <w:numId w:val="4"/>
+              </w:numPr>
+              <w:pBdr>
+                <w:top w:val="nil"/>
+                <w:left w:val="nil"/>
+                <w:bottom w:val="nil"/>
+                <w:right w:val="nil"/>
+                <w:between w:val="nil"/>
+              </w:pBdr>
+              <w:spacing w:before="60" w:line="276" w:lineRule="auto"/>
+              <w:ind w:left="171" w:right="89" w:hanging="283"/>
+              <w:rPr>
+                <w:rFonts w:ascii="Tahoma" w:eastAsia="Tahoma" w:hAnsi="Tahoma" w:cs="Tahoma"/>
+                <w:color w:val="000000"/>
+                <w:sz w:val="22"/>
+                <w:szCs w:val="22"/>
+              </w:rPr>
+            </w:pPr>
+            <w:r>
+              <w:t xml:space="preserve">- Menentukan margin &amp; grid, menyusun konten berdasarkan prioritas</w:t>
+            </w:r>
+          </w:p>
+          <w:p>
+            <w:pPr>
+              <w:numPr>
+                <w:ilvl w:val="0"/>
+                <w:numId w:val="4"/>
+              </w:numPr>
+              <w:pBdr>
+                <w:top w:val="nil"/>
+                <w:left w:val="nil"/>
+                <w:bottom w:val="nil"/>
+                <w:right w:val="nil"/>
+                <w:between w:val="nil"/>
+              </w:pBdr>
+              <w:spacing w:before="60" w:line="276" w:lineRule="auto"/>
+              <w:ind w:left="171" w:right="89" w:hanging="283"/>
+              <w:rPr>
+                <w:rFonts w:ascii="Tahoma" w:eastAsia="Tahoma" w:hAnsi="Tahoma" w:cs="Tahoma"/>
+                <w:color w:val="000000"/>
+                <w:sz w:val="22"/>
+                <w:szCs w:val="22"/>
+              </w:rPr>
+            </w:pPr>
+            <w:r>
+              <w:t xml:space="preserve">- Memilih 1 thumbnail terbaik sebagai acuan pembuatan prototipe</w:t>
+            </w:r>
+          </w:p>
+          <w:p>
+            <w:pPr>
+              <w:numPr>
+                <w:ilvl w:val="0"/>
+                <w:numId w:val="4"/>
+              </w:numPr>
+              <w:pBdr>
+                <w:top w:val="nil"/>
+                <w:left w:val="nil"/>
+                <w:bottom w:val="nil"/>
+                <w:right w:val="nil"/>
+                <w:between w:val="nil"/>
+              </w:pBdr>
+              <w:spacing w:before="60" w:line="276" w:lineRule="auto"/>
+              <w:ind w:left="171" w:right="89" w:hanging="283"/>
+              <w:rPr>
+                <w:rFonts w:ascii="Tahoma" w:eastAsia="Tahoma" w:hAnsi="Tahoma" w:cs="Tahoma"/>
+                <w:color w:val="000000"/>
+                <w:sz w:val="22"/>
+                <w:szCs w:val="22"/>
+              </w:rPr>
+            </w:pPr>
+            <w:r>
+              <w:t xml:space="preserve">Instruktur berkeliling memberikan pendampingan dan umpan balik kepada setiap peserta</w:t>
+            </w:r>
+          </w:p>
+        </w:tc>
+        <w:tc>
+          <w:tcPr>
+            <w:tcW w:w="1796" w:type="dxa"/>
+            <w:gridSpan w:val="3"/>
+          </w:tcPr>
+          <w:p>
+            <w:pPr>
+              <w:pBdr>
+                <w:top w:val="nil"/>
+                <w:left w:val="nil"/>
+                <w:bottom w:val="nil"/>
+                <w:right w:val="nil"/>
+                <w:between w:val="nil"/>
+              </w:pBdr>
+              <w:spacing w:before="60" w:line="276" w:lineRule="auto"/>
+              <w:ind w:left="253" w:right="89"/>
+              <w:rPr>
+                <w:rFonts w:ascii="Tahoma" w:eastAsia="Tahoma" w:hAnsi="Tahoma" w:cs="Tahoma"/>
+                <w:color w:val="000000"/>
+                <w:sz w:val="22"/>
+                <w:szCs w:val="22"/>
+              </w:rPr>
+            </w:pPr>
+            <w:r>
+              <w:t xml:space="preserve">Buku Sketsa</w:t>
+            </w:r>
+          </w:p>
+          <w:p>
+            <w:pPr>
+              <w:pBdr>
+                <w:top w:val="nil"/>
+                <w:left w:val="nil"/>
+                <w:bottom w:val="nil"/>
+                <w:right w:val="nil"/>
+                <w:between w:val="nil"/>
+              </w:pBdr>
+              <w:spacing w:before="60" w:line="276" w:lineRule="auto"/>
+              <w:ind w:left="253" w:right="89"/>
+              <w:rPr>
+                <w:rFonts w:ascii="Tahoma" w:eastAsia="Tahoma" w:hAnsi="Tahoma" w:cs="Tahoma"/>
+                <w:color w:val="000000"/>
+                <w:sz w:val="22"/>
+                <w:szCs w:val="22"/>
+              </w:rPr>
+            </w:pPr>
+            <w:r>
+              <w:t xml:space="preserve">Pensil</w:t>
+            </w:r>
+          </w:p>
+          <w:p>
+            <w:pPr>
+              <w:pBdr>
+                <w:top w:val="nil"/>
+                <w:left w:val="nil"/>
+                <w:bottom w:val="nil"/>
+                <w:right w:val="nil"/>
+                <w:between w:val="nil"/>
+              </w:pBdr>
+              <w:spacing w:before="60" w:line="276" w:lineRule="auto"/>
+              <w:ind w:left="253" w:right="89"/>
+              <w:rPr>
+                <w:rFonts w:ascii="Tahoma" w:eastAsia="Tahoma" w:hAnsi="Tahoma" w:cs="Tahoma"/>
+                <w:color w:val="000000"/>
+                <w:sz w:val="22"/>
+                <w:szCs w:val="22"/>
+              </w:rPr>
+            </w:pPr>
+            <w:r>
+              <w:t xml:space="preserve">Lembar Jobsheet</w:t>
+            </w:r>
+          </w:p>
+        </w:tc>
+        <w:tc>
+          <w:tcPr>
+            <w:tcW w:w="1850" w:type="dxa"/>
+          </w:tcPr>
+          <w:p>
+            <w:pPr>
+              <w:spacing w:before="60"/>
+              <w:jc w:val="center"/>
+              <w:rPr>
+                <w:rFonts w:ascii="Tahoma" w:eastAsia="Tahoma" w:hAnsi="Tahoma" w:cs="Tahoma"/>
+                <w:sz w:val="22"/>
+                <w:szCs w:val="22"/>
+              </w:rPr>
+            </w:pPr>
+            <w:r>
+              <w:t xml:space="preserve">35 menit</w:t>
+            </w:r>
+          </w:p>
+        </w:tc>
+      </w:tr>
+      <w:tr>
+        <w:trPr>
+          <w:gridAfter w:val="1"/>
+          <w:wAfter w:w="10" w:type="dxa"/>
+          <w:trHeight w:val="563"/>
+        </w:trPr>
+        <w:tc>
+          <w:tcPr>
+            <w:tcW w:w="2665" w:type="dxa"/>
+            <w:gridSpan w:val="3"/>
+          </w:tcPr>
+          <w:p>
+            <w:pPr>
+              <w:pStyle w:val="ListParagraph"/>
+              <w:numPr>
+                <w:ilvl w:val="3"/>
+                <w:numId w:val="5"/>
+              </w:numPr>
+              <w:spacing w:before="60"/>
+              <w:ind w:left="292"/>
+              <w:rPr>
+                <w:rFonts w:ascii="Tahoma" w:eastAsia="Tahoma" w:hAnsi="Tahoma" w:cs="Tahoma"/>
+                <w:b/>
+              </w:rPr>
+            </w:pPr>
+            <w:r>
+              <w:t xml:space="preserve">Kesimpulan ( Summary)</w:t>
+            </w:r>
+          </w:p>
+        </w:tc>
+        <w:tc>
+          <w:tcPr>
+            <w:tcW w:w="3543" w:type="dxa"/>
+            <w:gridSpan w:val="2"/>
+          </w:tcPr>
+          <w:p>
+            <w:pPr>
+              <w:numPr>
+                <w:ilvl w:val="0"/>
+                <w:numId w:val="4"/>
+              </w:numPr>
+              <w:pBdr>
+                <w:top w:val="nil"/>
+                <w:left w:val="nil"/>
+                <w:bottom w:val="nil"/>
+                <w:right w:val="nil"/>
+                <w:between w:val="nil"/>
+              </w:pBdr>
+              <w:spacing w:before="60" w:line="276" w:lineRule="auto"/>
+              <w:ind w:left="171" w:right="89" w:hanging="283"/>
+              <w:rPr>
+                <w:rFonts w:ascii="Tahoma" w:eastAsia="Tahoma" w:hAnsi="Tahoma" w:cs="Tahoma"/>
+                <w:color w:val="000000"/>
+                <w:sz w:val="22"/>
+                <w:szCs w:val="22"/>
+              </w:rPr>
+            </w:pPr>
+            <w:r>
+              <w:t xml:space="preserve">Instruktur menyimpulkan tentang konsep prototipe desain grafis, tahapan pengembangan sketsa menjadi prototipe, dan pentingnya thumbnail sebagai acuan desain</w:t>
+            </w:r>
+          </w:p>
+        </w:tc>
+        <w:tc>
+          <w:tcPr>
+            <w:tcW w:w="1796" w:type="dxa"/>
+            <w:gridSpan w:val="3"/>
+          </w:tcPr>
+          <w:p>
+            <w:pPr>
+              <w:pBdr>
+                <w:top w:val="nil"/>
+                <w:left w:val="nil"/>
+                <w:bottom w:val="nil"/>
+                <w:right w:val="nil"/>
+                <w:between w:val="nil"/>
+              </w:pBdr>
+              <w:spacing w:before="60" w:line="276" w:lineRule="auto"/>
+              <w:ind w:left="253" w:right="89"/>
+              <w:rPr>
+                <w:rFonts w:ascii="Tahoma" w:eastAsia="Tahoma" w:hAnsi="Tahoma" w:cs="Tahoma"/>
+                <w:color w:val="000000"/>
+                <w:sz w:val="22"/>
+                <w:szCs w:val="22"/>
+              </w:rPr>
+            </w:pPr>
+            <w:r>
+              <w:t xml:space="preserve">Power Point</w:t>
+            </w:r>
+          </w:p>
+        </w:tc>
+        <w:tc>
+          <w:tcPr>
+            <w:tcW w:w="1850" w:type="dxa"/>
+          </w:tcPr>
+          <w:p>
+            <w:pPr>
+              <w:spacing w:before="60"/>
+              <w:jc w:val="center"/>
+              <w:rPr>
+                <w:rFonts w:ascii="Tahoma" w:eastAsia="Tahoma" w:hAnsi="Tahoma" w:cs="Tahoma"/>
+                <w:sz w:val="22"/>
+                <w:szCs w:val="22"/>
+              </w:rPr>
+            </w:pPr>
+            <w:r>
+              <w:t xml:space="preserve">5 menit</w:t>
+            </w:r>
+          </w:p>
+        </w:tc>
+      </w:tr>
+      <w:tr>
+        <w:trPr>
+          <w:gridAfter w:val="1"/>
+          <w:wAfter w:w="10" w:type="dxa"/>
+          <w:trHeight w:val="637"/>
+        </w:trPr>
+        <w:tc>
+          <w:tcPr>
+            <w:tcW w:w="2665" w:type="dxa"/>
+            <w:gridSpan w:val="3"/>
+            <w:vAlign w:val="center"/>
+          </w:tcPr>
+          <w:p>
+            <w:pPr>
+              <w:pStyle w:val="ListParagraph"/>
+              <w:numPr>
+                <w:ilvl w:val="0"/>
+                <w:numId w:val="6"/>
+              </w:numPr>
+              <w:spacing w:before="120" w:after="120"/>
+              <w:ind w:left="436" w:hanging="426"/>
+              <w:jc w:val="both"/>
+              <w:rPr>
+                <w:rFonts w:ascii="Tahoma" w:eastAsia="Tahoma" w:hAnsi="Tahoma" w:cs="Tahoma"/>
+                <w:b/>
+              </w:rPr>
+            </w:pPr>
+            <w:r>
+              <w:t xml:space="preserve">Aplikasi</w:t>
+            </w:r>
+          </w:p>
+        </w:tc>
+        <w:tc>
+          <w:tcPr>
+            <w:tcW w:w="3543" w:type="dxa"/>
+            <w:gridSpan w:val="2"/>
+          </w:tcPr>
+          <w:p>
+            <w:pPr>
+              <w:numPr>
+                <w:ilvl w:val="0"/>
+                <w:numId w:val="4"/>
+              </w:numPr>
+              <w:pBdr>
+                <w:top w:val="nil"/>
+                <w:left w:val="nil"/>
+                <w:bottom w:val="nil"/>
+                <w:right w:val="nil"/>
+                <w:between w:val="nil"/>
+              </w:pBdr>
+              <w:spacing w:before="60" w:line="276" w:lineRule="auto"/>
+              <w:ind w:left="201" w:right="89" w:hanging="283"/>
+              <w:rPr>
+                <w:rFonts w:ascii="Tahoma" w:eastAsia="Tahoma" w:hAnsi="Tahoma" w:cs="Tahoma"/>
+                <w:color w:val="000000"/>
+                <w:sz w:val="22"/>
+                <w:szCs w:val="22"/>
+              </w:rPr>
+            </w:pPr>
+            <w:r>
+              <w:t xml:space="preserve">Instruktur memberikan pertanyaan kepada peserta menggunakan Quizizz untuk mengukur pemahaman peserta terhadap materi yang telah disampaikan</w:t>
             </w:r>
           </w:p>
         </w:tc>
@@ -1611,27 +2629,106 @@
               </w:rPr>
             </w:pPr>
             <w:r>
+              <w:t xml:space="preserve">Quizizz.com</w:t>
+            </w:r>
+          </w:p>
+        </w:tc>
+        <w:tc>
+          <w:tcPr>
+            <w:tcW w:w="1850" w:type="dxa"/>
+          </w:tcPr>
+          <w:p>
+            <w:pPr>
+              <w:pBdr>
+                <w:top w:val="nil"/>
+                <w:left w:val="nil"/>
+                <w:bottom w:val="nil"/>
+                <w:right w:val="nil"/>
+                <w:between w:val="nil"/>
+              </w:pBdr>
+              <w:spacing w:before="60"/>
+              <w:jc w:val="center"/>
+              <w:rPr>
+                <w:rFonts w:ascii="Tahoma" w:eastAsia="Tahoma" w:hAnsi="Tahoma" w:cs="Tahoma"/>
+                <w:sz w:val="22"/>
+                <w:szCs w:val="22"/>
+              </w:rPr>
+            </w:pPr>
+            <w:r>
+              <w:t xml:space="preserve">20 menit</w:t>
+            </w:r>
+          </w:p>
+        </w:tc>
+      </w:tr>
+      <w:tr>
+        <w:trPr>
+          <w:gridAfter w:val="1"/>
+          <w:wAfter w:w="10" w:type="dxa"/>
+          <w:trHeight w:val="306"/>
+        </w:trPr>
+        <w:tc>
+          <w:tcPr>
+            <w:tcW w:w="2665" w:type="dxa"/>
+            <w:gridSpan w:val="3"/>
+            <w:vAlign w:val="center"/>
+          </w:tcPr>
+          <w:p>
+            <w:pPr>
+              <w:pStyle w:val="ListParagraph"/>
+              <w:numPr>
+                <w:ilvl w:val="0"/>
+                <w:numId w:val="6"/>
+              </w:numPr>
+              <w:spacing w:before="120" w:after="120"/>
+              <w:ind w:left="436" w:hanging="426"/>
+              <w:jc w:val="both"/>
+              <w:rPr>
+                <w:rFonts w:ascii="Tahoma" w:eastAsia="Tahoma" w:hAnsi="Tahoma" w:cs="Tahoma"/>
+                <w:b/>
+              </w:rPr>
+            </w:pPr>
+            <w:r>
+              <w:t xml:space="preserve">Evaluasi</w:t>
+            </w:r>
+          </w:p>
+        </w:tc>
+        <w:tc>
+          <w:tcPr>
+            <w:tcW w:w="3543" w:type="dxa"/>
+            <w:gridSpan w:val="2"/>
+          </w:tcPr>
+          <w:p>
+            <w:pPr>
+              <w:numPr>
+                <w:ilvl w:val="0"/>
+                <w:numId w:val="4"/>
+              </w:numPr>
+              <w:pBdr>
+                <w:top w:val="nil"/>
+                <w:left w:val="nil"/>
+                <w:bottom w:val="nil"/>
+                <w:right w:val="nil"/>
+                <w:between w:val="nil"/>
+              </w:pBdr>
+              <w:spacing w:before="60" w:line="276" w:lineRule="auto"/>
+              <w:ind w:left="201" w:right="89" w:hanging="335"/>
               <w:rPr>
                 <w:rFonts w:ascii="Tahoma" w:eastAsia="Tahoma" w:hAnsi="Tahoma" w:cs="Tahoma"/>
                 <w:color w:val="000000"/>
                 <w:sz w:val="22"/>
                 <w:szCs w:val="22"/>
               </w:rPr>
-              <w:lastRenderedPageBreak/>
-              <w:t xml:space="preserve">Power </w:t>
-            </w:r>
-            <w:proofErr w:type="spellStart"/>
-            <w:r>
-              <w:rPr>
-                <w:rFonts w:ascii="Tahoma" w:eastAsia="Tahoma" w:hAnsi="Tahoma" w:cs="Tahoma"/>
-                <w:color w:val="000000"/>
-                <w:sz w:val="22"/>
-                <w:szCs w:val="22"/>
-              </w:rPr>
-              <w:t>Point</w:t>
-            </w:r>
-            <w:proofErr w:type="spellEnd"/>
-          </w:p>
+            </w:pPr>
+            <w:r>
+              <w:t xml:space="preserve">Instruktur membagikan lembar jobsheet kepada peserta pelatihan untuk menyelesaikan tugas tersebut</w:t>
+            </w:r>
+          </w:p>
+        </w:tc>
+        <w:tc>
+          <w:tcPr>
+            <w:tcW w:w="1796" w:type="dxa"/>
+            <w:gridSpan w:val="3"/>
+          </w:tcPr>
           <w:p>
             <w:pPr>
               <w:numPr>
@@ -1654,18 +2751,71 @@
                 <w:szCs w:val="22"/>
               </w:rPr>
             </w:pPr>
-            <w:proofErr w:type="spellStart"/>
-            <w:r>
-              <w:rPr>
-                <w:rFonts w:ascii="Tahoma" w:eastAsia="Tahoma" w:hAnsi="Tahoma" w:cs="Tahoma"/>
-                <w:color w:val="000000"/>
-                <w:sz w:val="22"/>
-                <w:szCs w:val="22"/>
-              </w:rPr>
-              <w:t>ChatGPT</w:t>
-            </w:r>
-            <w:proofErr w:type="spellEnd"/>
-          </w:p>
+            <w:r>
+              <w:t xml:space="preserve">Lembar Jobsheet</w:t>
+            </w:r>
+          </w:p>
+        </w:tc>
+        <w:tc>
+          <w:tcPr>
+            <w:tcW w:w="1850" w:type="dxa"/>
+          </w:tcPr>
+          <w:p>
+            <w:pPr>
+              <w:pBdr>
+                <w:top w:val="nil"/>
+                <w:left w:val="nil"/>
+                <w:bottom w:val="nil"/>
+                <w:right w:val="nil"/>
+                <w:between w:val="nil"/>
+              </w:pBdr>
+              <w:spacing w:before="60"/>
+              <w:jc w:val="center"/>
+              <w:rPr>
+                <w:rFonts w:ascii="Tahoma" w:eastAsia="Tahoma" w:hAnsi="Tahoma" w:cs="Tahoma"/>
+                <w:sz w:val="22"/>
+                <w:szCs w:val="22"/>
+              </w:rPr>
+            </w:pPr>
+            <w:r>
+              <w:t xml:space="preserve">30 menit</w:t>
+            </w:r>
+          </w:p>
+        </w:tc>
+      </w:tr>
+      <w:tr>
+        <w:trPr>
+          <w:gridAfter w:val="1"/>
+          <w:wAfter w:w="10" w:type="dxa"/>
+          <w:trHeight w:val="587"/>
+        </w:trPr>
+        <w:tc>
+          <w:tcPr>
+            <w:tcW w:w="2665" w:type="dxa"/>
+            <w:gridSpan w:val="3"/>
+            <w:vAlign w:val="center"/>
+          </w:tcPr>
+          <w:p>
+            <w:pPr>
+              <w:spacing w:before="120" w:after="120"/>
+              <w:jc w:val="both"/>
+              <w:rPr>
+                <w:rFonts w:ascii="Tahoma" w:eastAsia="Tahoma" w:hAnsi="Tahoma" w:cs="Tahoma"/>
+                <w:b/>
+                <w:sz w:val="22"/>
+                <w:szCs w:val="22"/>
+              </w:rPr>
+            </w:pPr>
+            <w:r>
+              <w:t xml:space="preserve">Tugas Tambahan</w:t>
+            </w:r>
+          </w:p>
+        </w:tc>
+        <w:tc>
+          <w:tcPr>
+            <w:tcW w:w="3543" w:type="dxa"/>
+            <w:gridSpan w:val="2"/>
+          </w:tcPr>
           <w:p>
             <w:pPr>
               <w:numPr>
@@ -1688,18 +2838,16 @@
                 <w:szCs w:val="22"/>
               </w:rPr>
             </w:pPr>
-            <w:proofErr w:type="spellStart"/>
-            <w:r>
-              <w:rPr>
-                <w:rFonts w:ascii="Tahoma" w:eastAsia="Tahoma" w:hAnsi="Tahoma" w:cs="Tahoma"/>
-                <w:color w:val="000000"/>
-                <w:sz w:val="22"/>
-                <w:szCs w:val="22"/>
-              </w:rPr>
-              <w:t>Canva</w:t>
-            </w:r>
-            <w:proofErr w:type="spellEnd"/>
-          </w:p>
+            <w:r>
+              <w:t xml:space="preserve">Instruktur memberikan tugas tambahan kepada peserta pelatihan untuk pekerjaan rumah, setelah menyelesaikan tugas harap dikumpulkan kepada instruktur melalui email batas waktu esok hari pukul 09.00</w:t>
+            </w:r>
+          </w:p>
+        </w:tc>
+        <w:tc>
+          <w:tcPr>
+            <w:tcW w:w="1796" w:type="dxa"/>
+            <w:gridSpan w:val="3"/>
+          </w:tcPr>
           <w:p>
             <w:pPr>
               <w:pBdr>
@@ -1710,7 +2858,7 @@
                 <w:between w:val="nil"/>
               </w:pBdr>
               <w:spacing w:before="60" w:line="276" w:lineRule="auto"/>
-              <w:ind w:left="253" w:right="89"/>
+              <w:ind w:left="33" w:right="89"/>
               <w:rPr>
                 <w:rFonts w:ascii="Tahoma" w:eastAsia="Tahoma" w:hAnsi="Tahoma" w:cs="Tahoma"/>
                 <w:color w:val="000000"/>
@@ -1718,102 +2866,12 @@
                 <w:szCs w:val="22"/>
               </w:rPr>
             </w:pPr>
-          </w:p>
-        </w:tc>
-        <w:tc>
-          <w:tcPr>
-            <w:tcW w:w="1850" w:type="dxa"/>
-          </w:tcPr>
-          <w:p>
-            <w:pPr>
-              <w:spacing w:before="60"/>
-              <w:jc w:val="center"/>
-              <w:rPr>
-                <w:rFonts w:ascii="Tahoma" w:eastAsia="Tahoma" w:hAnsi="Tahoma" w:cs="Tahoma"/>
-                <w:sz w:val="22"/>
-                <w:szCs w:val="22"/>
-              </w:rPr>
-            </w:pPr>
-            <w:r>
-              <w:rPr>
-                <w:rFonts w:ascii="Tahoma" w:eastAsia="Tahoma" w:hAnsi="Tahoma" w:cs="Tahoma"/>
-                <w:sz w:val="22"/>
-                <w:szCs w:val="22"/>
-              </w:rPr>
-              <w:t>3</w:t>
-            </w:r>
-            <w:r>
-              <w:rPr>
-                <w:rFonts w:ascii="Tahoma" w:eastAsia="Tahoma" w:hAnsi="Tahoma" w:cs="Tahoma"/>
-                <w:sz w:val="22"/>
-                <w:szCs w:val="22"/>
-              </w:rPr>
-              <w:t>5</w:t>
-            </w:r>
-            <w:r>
-              <w:rPr>
-                <w:rFonts w:ascii="Tahoma" w:eastAsia="Tahoma" w:hAnsi="Tahoma" w:cs="Tahoma"/>
-                <w:sz w:val="22"/>
-                <w:szCs w:val="22"/>
-              </w:rPr>
-              <w:t xml:space="preserve"> </w:t>
-            </w:r>
-            <w:r>
-              <w:rPr>
-                <w:rFonts w:ascii="Tahoma" w:eastAsia="Tahoma" w:hAnsi="Tahoma" w:cs="Tahoma"/>
-                <w:sz w:val="22"/>
-                <w:szCs w:val="22"/>
-              </w:rPr>
-              <w:t>menit</w:t>
-            </w:r>
-          </w:p>
-        </w:tc>
-      </w:tr>
-      <w:tr>
-        <w:trPr>
-          <w:gridAfter w:val="1"/>
-          <w:wAfter w:w="10" w:type="dxa"/>
-          <w:trHeight w:val="563"/>
-        </w:trPr>
-        <w:tc>
-          <w:tcPr>
-            <w:tcW w:w="2665" w:type="dxa"/>
-            <w:gridSpan w:val="3"/>
-          </w:tcPr>
-          <w:p>
-            <w:pPr>
-              <w:pStyle w:val="DaftarParagraf"/>
-              <w:numPr>
-                <w:ilvl w:val="3"/>
-                <w:numId w:val="5"/>
-              </w:numPr>
-              <w:spacing w:before="60"/>
-              <w:ind w:left="292"/>
-              <w:rPr>
-                <w:rFonts w:ascii="Tahoma" w:eastAsia="Tahoma" w:hAnsi="Tahoma" w:cs="Tahoma"/>
-                <w:b/>
-              </w:rPr>
-            </w:pPr>
-            <w:r>
-              <w:rPr>
-                <w:rFonts w:ascii="Tahoma" w:eastAsia="Tahoma" w:hAnsi="Tahoma" w:cs="Tahoma"/>
-                <w:b/>
-              </w:rPr>
-              <w:t>Batasan dan Etika dalam menggunakan AI</w:t>
-            </w:r>
-          </w:p>
-        </w:tc>
-        <w:tc>
-          <w:tcPr>
-            <w:tcW w:w="3543" w:type="dxa"/>
-            <w:gridSpan w:val="2"/>
-          </w:tcPr>
-          <w:p>
-            <w:pPr>
-              <w:numPr>
-                <w:ilvl w:val="0"/>
-                <w:numId w:val="4"/>
-              </w:numPr>
+            <w:r>
+              <w:t xml:space="preserve">Canva</w:t>
+            </w:r>
+          </w:p>
+          <w:p>
+            <w:pPr>
               <w:pBdr>
                 <w:top w:val="nil"/>
                 <w:left w:val="nil"/>
@@ -1822,7 +2880,7 @@
                 <w:between w:val="nil"/>
               </w:pBdr>
               <w:spacing w:before="60" w:line="276" w:lineRule="auto"/>
-              <w:ind w:left="171" w:right="89" w:hanging="283"/>
+              <w:ind w:left="33" w:right="89"/>
               <w:rPr>
                 <w:rFonts w:ascii="Tahoma" w:eastAsia="Tahoma" w:hAnsi="Tahoma" w:cs="Tahoma"/>
                 <w:color w:val="000000"/>
@@ -1831,22 +2889,16 @@
               </w:rPr>
             </w:pPr>
             <w:r>
-              <w:rPr>
-                <w:rFonts w:ascii="Tahoma" w:eastAsia="Tahoma" w:hAnsi="Tahoma" w:cs="Tahoma"/>
-                <w:color w:val="000000"/>
-                <w:sz w:val="22"/>
-                <w:szCs w:val="22"/>
-              </w:rPr>
-              <w:t>Instruktur menjelaskan kepada peserta terkait :</w:t>
-            </w:r>
-          </w:p>
-          <w:p>
-            <w:pPr>
-              <w:pStyle w:val="DaftarParagraf"/>
-              <w:numPr>
-                <w:ilvl w:val="4"/>
-                <w:numId w:val="5"/>
-              </w:numPr>
+              <w:t xml:space="preserve">(Tugas: mengembangkan thumbnail terpilih menjadi prototipe digital/mockup 1 layout di Canva)</w:t>
+            </w:r>
+          </w:p>
+        </w:tc>
+        <w:tc>
+          <w:tcPr>
+            <w:tcW w:w="1850" w:type="dxa"/>
+          </w:tcPr>
+          <w:p>
+            <w:pPr>
               <w:pBdr>
                 <w:top w:val="nil"/>
                 <w:left w:val="nil"/>
@@ -1855,84 +2907,50 @@
                 <w:between w:val="nil"/>
               </w:pBdr>
               <w:spacing w:before="60"/>
-              <w:ind w:left="738" w:right="89"/>
-              <w:rPr>
-                <w:rFonts w:ascii="Tahoma" w:eastAsia="Tahoma" w:hAnsi="Tahoma" w:cs="Tahoma"/>
-                <w:color w:val="000000"/>
-              </w:rPr>
-            </w:pPr>
-            <w:r>
-              <w:rPr>
-                <w:rFonts w:ascii="Tahoma" w:eastAsia="Tahoma" w:hAnsi="Tahoma" w:cs="Tahoma"/>
-                <w:color w:val="000000"/>
-              </w:rPr>
-              <w:t>Batasan Penggunaan AI.</w:t>
-            </w:r>
-          </w:p>
-          <w:p>
-            <w:pPr>
-              <w:pStyle w:val="DaftarParagraf"/>
-              <w:numPr>
-                <w:ilvl w:val="4"/>
-                <w:numId w:val="5"/>
-              </w:numPr>
-              <w:pBdr>
-                <w:top w:val="nil"/>
-                <w:left w:val="nil"/>
-                <w:bottom w:val="nil"/>
-                <w:right w:val="nil"/>
-                <w:between w:val="nil"/>
-              </w:pBdr>
-              <w:spacing w:before="60"/>
-              <w:ind w:left="738" w:right="89"/>
-              <w:rPr>
-                <w:rFonts w:ascii="Tahoma" w:eastAsia="Tahoma" w:hAnsi="Tahoma" w:cs="Tahoma"/>
-                <w:color w:val="000000"/>
-              </w:rPr>
-            </w:pPr>
-            <w:r>
-              <w:rPr>
-                <w:rFonts w:ascii="Tahoma" w:eastAsia="Tahoma" w:hAnsi="Tahoma" w:cs="Tahoma"/>
-                <w:color w:val="000000"/>
-              </w:rPr>
-              <w:t>Etika dalam Penggunaan AI</w:t>
-            </w:r>
-          </w:p>
-          <w:p>
-            <w:pPr>
-              <w:numPr>
-                <w:ilvl w:val="0"/>
-                <w:numId w:val="4"/>
-              </w:numPr>
-              <w:pBdr>
-                <w:top w:val="nil"/>
-                <w:left w:val="nil"/>
-                <w:bottom w:val="nil"/>
-                <w:right w:val="nil"/>
-                <w:between w:val="nil"/>
-              </w:pBdr>
-              <w:spacing w:before="60" w:line="276" w:lineRule="auto"/>
-              <w:ind w:left="171" w:right="89" w:hanging="283"/>
-              <w:rPr>
-                <w:rFonts w:ascii="Tahoma" w:eastAsia="Tahoma" w:hAnsi="Tahoma" w:cs="Tahoma"/>
-                <w:color w:val="000000"/>
-                <w:sz w:val="22"/>
-                <w:szCs w:val="22"/>
-              </w:rPr>
-            </w:pPr>
-            <w:r>
-              <w:rPr>
-                <w:rFonts w:ascii="Tahoma" w:eastAsia="Tahoma" w:hAnsi="Tahoma" w:cs="Tahoma"/>
-                <w:color w:val="000000"/>
-              </w:rPr>
-              <w:t>Instruktur menanyakan kepada peserta apakah materi yang disampaikan telah dipahami dan memberikan kesempatan kepada peserta untuk mengajukan pertanyaan</w:t>
-            </w:r>
-          </w:p>
-        </w:tc>
-        <w:tc>
-          <w:tcPr>
-            <w:tcW w:w="1796" w:type="dxa"/>
+              <w:jc w:val="center"/>
+              <w:rPr>
+                <w:rFonts w:ascii="Tahoma" w:eastAsia="Tahoma" w:hAnsi="Tahoma" w:cs="Tahoma"/>
+                <w:sz w:val="22"/>
+                <w:szCs w:val="22"/>
+              </w:rPr>
+            </w:pPr>
+            <w:r>
+              <w:t xml:space="preserve">5 menit</w:t>
+            </w:r>
+          </w:p>
+        </w:tc>
+      </w:tr>
+      <w:tr>
+        <w:trPr>
+          <w:gridAfter w:val="1"/>
+          <w:wAfter w:w="10" w:type="dxa"/>
+        </w:trPr>
+        <w:tc>
+          <w:tcPr>
+            <w:tcW w:w="2665" w:type="dxa"/>
             <w:gridSpan w:val="3"/>
+            <w:vAlign w:val="center"/>
+          </w:tcPr>
+          <w:p>
+            <w:pPr>
+              <w:spacing w:before="120" w:after="120"/>
+              <w:jc w:val="both"/>
+              <w:rPr>
+                <w:rFonts w:ascii="Tahoma" w:eastAsia="Tahoma" w:hAnsi="Tahoma" w:cs="Tahoma"/>
+                <w:b/>
+                <w:sz w:val="22"/>
+                <w:szCs w:val="22"/>
+              </w:rPr>
+            </w:pPr>
+            <w:r>
+              <w:t xml:space="preserve">Pemberesan Kelas</w:t>
+            </w:r>
+          </w:p>
+        </w:tc>
+        <w:tc>
+          <w:tcPr>
+            <w:tcW w:w="3543" w:type="dxa"/>
+            <w:gridSpan w:val="2"/>
           </w:tcPr>
           <w:p>
             <w:pPr>
@@ -1957,176 +2975,9 @@
               </w:rPr>
             </w:pPr>
             <w:r>
-              <w:rPr>
-                <w:rFonts w:ascii="Tahoma" w:eastAsia="Tahoma" w:hAnsi="Tahoma" w:cs="Tahoma"/>
-                <w:color w:val="000000"/>
-                <w:sz w:val="22"/>
-                <w:szCs w:val="22"/>
-              </w:rPr>
-              <w:t xml:space="preserve">Power </w:t>
-            </w:r>
-            <w:proofErr w:type="spellStart"/>
-            <w:r>
-              <w:rPr>
-                <w:rFonts w:ascii="Tahoma" w:eastAsia="Tahoma" w:hAnsi="Tahoma" w:cs="Tahoma"/>
-                <w:color w:val="000000"/>
-                <w:sz w:val="22"/>
-                <w:szCs w:val="22"/>
-              </w:rPr>
-              <w:t>Point</w:t>
-            </w:r>
-            <w:proofErr w:type="spellEnd"/>
-          </w:p>
-          <w:p>
-            <w:pPr>
-              <w:pBdr>
-                <w:top w:val="nil"/>
-                <w:left w:val="nil"/>
-                <w:bottom w:val="nil"/>
-                <w:right w:val="nil"/>
-                <w:between w:val="nil"/>
-              </w:pBdr>
-              <w:spacing w:before="60" w:line="276" w:lineRule="auto"/>
-              <w:ind w:left="253" w:right="89"/>
-              <w:rPr>
-                <w:rFonts w:ascii="Tahoma" w:eastAsia="Tahoma" w:hAnsi="Tahoma" w:cs="Tahoma"/>
-                <w:color w:val="000000"/>
-                <w:sz w:val="22"/>
-                <w:szCs w:val="22"/>
-              </w:rPr>
-            </w:pPr>
-          </w:p>
-        </w:tc>
-        <w:tc>
-          <w:tcPr>
-            <w:tcW w:w="1850" w:type="dxa"/>
-          </w:tcPr>
-          <w:p>
-            <w:pPr>
-              <w:spacing w:before="60"/>
-              <w:jc w:val="center"/>
-              <w:rPr>
-                <w:rFonts w:ascii="Tahoma" w:eastAsia="Tahoma" w:hAnsi="Tahoma" w:cs="Tahoma"/>
-                <w:sz w:val="22"/>
-                <w:szCs w:val="22"/>
-              </w:rPr>
-            </w:pPr>
-            <w:r>
-              <w:rPr>
-                <w:rFonts w:ascii="Tahoma" w:eastAsia="Tahoma" w:hAnsi="Tahoma" w:cs="Tahoma"/>
-                <w:sz w:val="22"/>
-                <w:szCs w:val="22"/>
-              </w:rPr>
-              <w:t>15</w:t>
-            </w:r>
-            <w:r>
-              <w:rPr>
-                <w:rFonts w:ascii="Tahoma" w:eastAsia="Tahoma" w:hAnsi="Tahoma" w:cs="Tahoma"/>
-                <w:sz w:val="22"/>
-                <w:szCs w:val="22"/>
-              </w:rPr>
-              <w:t xml:space="preserve"> menit</w:t>
-            </w:r>
-          </w:p>
-        </w:tc>
-      </w:tr>
-      <w:tr>
-        <w:trPr>
-          <w:gridAfter w:val="1"/>
-          <w:wAfter w:w="10" w:type="dxa"/>
-          <w:trHeight w:val="563"/>
-        </w:trPr>
-        <w:tc>
-          <w:tcPr>
-            <w:tcW w:w="2665" w:type="dxa"/>
-            <w:gridSpan w:val="3"/>
-          </w:tcPr>
-          <w:p>
-            <w:pPr>
-              <w:pStyle w:val="DaftarParagraf"/>
-              <w:numPr>
-                <w:ilvl w:val="3"/>
-                <w:numId w:val="5"/>
-              </w:numPr>
-              <w:spacing w:before="60"/>
-              <w:ind w:left="292"/>
-              <w:rPr>
-                <w:rFonts w:ascii="Tahoma" w:eastAsia="Tahoma" w:hAnsi="Tahoma" w:cs="Tahoma"/>
-                <w:b/>
-              </w:rPr>
-            </w:pPr>
-            <w:r>
-              <w:rPr>
-                <w:rFonts w:ascii="Tahoma" w:eastAsia="Tahoma" w:hAnsi="Tahoma" w:cs="Tahoma"/>
-                <w:b/>
-              </w:rPr>
-              <w:t>Kesimpulan ( Summary)</w:t>
-            </w:r>
-          </w:p>
-        </w:tc>
-        <w:tc>
-          <w:tcPr>
-            <w:tcW w:w="3543" w:type="dxa"/>
-            <w:gridSpan w:val="2"/>
-          </w:tcPr>
-          <w:p>
-            <w:pPr>
-              <w:numPr>
-                <w:ilvl w:val="0"/>
-                <w:numId w:val="4"/>
-              </w:numPr>
-              <w:pBdr>
-                <w:top w:val="nil"/>
-                <w:left w:val="nil"/>
-                <w:bottom w:val="nil"/>
-                <w:right w:val="nil"/>
-                <w:between w:val="nil"/>
-              </w:pBdr>
-              <w:spacing w:before="60" w:line="276" w:lineRule="auto"/>
-              <w:ind w:left="171" w:right="89" w:hanging="283"/>
-              <w:rPr>
-                <w:rFonts w:ascii="Tahoma" w:eastAsia="Tahoma" w:hAnsi="Tahoma" w:cs="Tahoma"/>
-                <w:color w:val="000000"/>
-                <w:sz w:val="22"/>
-                <w:szCs w:val="22"/>
-              </w:rPr>
-            </w:pPr>
-            <w:r>
-              <w:rPr>
-                <w:rFonts w:ascii="Tahoma" w:eastAsia="Tahoma" w:hAnsi="Tahoma" w:cs="Tahoma"/>
-                <w:color w:val="000000"/>
-                <w:sz w:val="22"/>
-                <w:szCs w:val="22"/>
-              </w:rPr>
-              <w:t xml:space="preserve">Instruktur menyimpulkan tentang </w:t>
-            </w:r>
-            <w:proofErr w:type="spellStart"/>
-            <w:r>
-              <w:rPr>
-                <w:rFonts w:ascii="Tahoma" w:eastAsia="Tahoma" w:hAnsi="Tahoma" w:cs="Tahoma"/>
-                <w:color w:val="000000"/>
-                <w:sz w:val="22"/>
-                <w:szCs w:val="22"/>
-              </w:rPr>
-              <w:t>Copywriting</w:t>
-            </w:r>
-            <w:proofErr w:type="spellEnd"/>
-            <w:r>
-              <w:rPr>
-                <w:rFonts w:ascii="Tahoma" w:eastAsia="Tahoma" w:hAnsi="Tahoma" w:cs="Tahoma"/>
-                <w:color w:val="000000"/>
-                <w:sz w:val="22"/>
-                <w:szCs w:val="22"/>
-              </w:rPr>
-              <w:t xml:space="preserve"> dan Penggunaan AI dalam membuat konten sebagai media promosi</w:t>
-            </w:r>
-          </w:p>
-        </w:tc>
-        <w:tc>
-          <w:tcPr>
-            <w:tcW w:w="1796" w:type="dxa"/>
-            <w:gridSpan w:val="3"/>
-          </w:tcPr>
+              <w:t xml:space="preserve">Merapikan Ruang kelas</w:t>
+            </w:r>
+          </w:p>
           <w:p>
             <w:pPr>
               <w:numPr>
@@ -2150,115 +3001,7 @@
               </w:rPr>
             </w:pPr>
             <w:r>
-              <w:rPr>
-                <w:rFonts w:ascii="Tahoma" w:eastAsia="Tahoma" w:hAnsi="Tahoma" w:cs="Tahoma"/>
-                <w:color w:val="000000"/>
-                <w:sz w:val="22"/>
-                <w:szCs w:val="22"/>
-              </w:rPr>
-              <w:t xml:space="preserve">Power </w:t>
-            </w:r>
-            <w:proofErr w:type="spellStart"/>
-            <w:r>
-              <w:rPr>
-                <w:rFonts w:ascii="Tahoma" w:eastAsia="Tahoma" w:hAnsi="Tahoma" w:cs="Tahoma"/>
-                <w:color w:val="000000"/>
-                <w:sz w:val="22"/>
-                <w:szCs w:val="22"/>
-              </w:rPr>
-              <w:t>Point</w:t>
-            </w:r>
-            <w:proofErr w:type="spellEnd"/>
-          </w:p>
-          <w:p>
-            <w:pPr>
-              <w:pBdr>
-                <w:top w:val="nil"/>
-                <w:left w:val="nil"/>
-                <w:bottom w:val="nil"/>
-                <w:right w:val="nil"/>
-                <w:between w:val="nil"/>
-              </w:pBdr>
-              <w:spacing w:before="60" w:line="276" w:lineRule="auto"/>
-              <w:ind w:left="253" w:right="89"/>
-              <w:rPr>
-                <w:rFonts w:ascii="Tahoma" w:eastAsia="Tahoma" w:hAnsi="Tahoma" w:cs="Tahoma"/>
-                <w:color w:val="000000"/>
-                <w:sz w:val="22"/>
-                <w:szCs w:val="22"/>
-              </w:rPr>
-            </w:pPr>
-          </w:p>
-        </w:tc>
-        <w:tc>
-          <w:tcPr>
-            <w:tcW w:w="1850" w:type="dxa"/>
-          </w:tcPr>
-          <w:p>
-            <w:pPr>
-              <w:spacing w:before="60"/>
-              <w:jc w:val="center"/>
-              <w:rPr>
-                <w:rFonts w:ascii="Tahoma" w:eastAsia="Tahoma" w:hAnsi="Tahoma" w:cs="Tahoma"/>
-                <w:sz w:val="22"/>
-                <w:szCs w:val="22"/>
-              </w:rPr>
-            </w:pPr>
-            <w:r>
-              <w:rPr>
-                <w:rFonts w:ascii="Tahoma" w:eastAsia="Tahoma" w:hAnsi="Tahoma" w:cs="Tahoma"/>
-                <w:sz w:val="22"/>
-                <w:szCs w:val="22"/>
-              </w:rPr>
-              <w:t>5 Menit</w:t>
-            </w:r>
-          </w:p>
-        </w:tc>
-      </w:tr>
-      <w:tr>
-        <w:trPr>
-          <w:gridAfter w:val="1"/>
-          <w:wAfter w:w="10" w:type="dxa"/>
-          <w:trHeight w:val="637"/>
-        </w:trPr>
-        <w:tc>
-          <w:tcPr>
-            <w:tcW w:w="2665" w:type="dxa"/>
-            <w:gridSpan w:val="3"/>
-            <w:vAlign w:val="center"/>
-          </w:tcPr>
-          <w:p>
-            <w:pPr>
-              <w:pStyle w:val="DaftarParagraf"/>
-              <w:numPr>
-                <w:ilvl w:val="0"/>
-                <w:numId w:val="6"/>
-              </w:numPr>
-              <w:spacing w:before="120" w:after="120"/>
-              <w:ind w:left="436" w:hanging="426"/>
-              <w:jc w:val="both"/>
-              <w:rPr>
-                <w:rFonts w:ascii="Tahoma" w:eastAsia="Tahoma" w:hAnsi="Tahoma" w:cs="Tahoma"/>
-                <w:b/>
-              </w:rPr>
-            </w:pPr>
-            <w:r>
-              <w:rPr>
-                <w:rFonts w:ascii="Tahoma" w:eastAsia="Tahoma" w:hAnsi="Tahoma" w:cs="Tahoma"/>
-                <w:b/>
-              </w:rPr>
-              <w:t>Aplikasi</w:t>
-            </w:r>
-          </w:p>
-        </w:tc>
-        <w:tc>
-          <w:tcPr>
-            <w:tcW w:w="3543" w:type="dxa"/>
-            <w:gridSpan w:val="2"/>
-          </w:tcPr>
-          <w:p>
-            <w:r>
-              <w:t>Instruktur memberikan kuis/tanya jawab terkait prosedur keselamatan kerja di lahan.</w:t>
+              <w:t xml:space="preserve">Berdoa dan memberikan salam</w:t>
             </w:r>
           </w:p>
         </w:tc>
@@ -2266,131 +3009,6 @@
           <w:tcPr>
             <w:tcW w:w="1796" w:type="dxa"/>
             <w:gridSpan w:val="3"/>
-          </w:tcPr>
-          <w:p>
-            <w:r>
-              <w:t>Quizizz / Lembar Tanya Jawab</w:t>
-            </w:r>
-          </w:p>
-        </w:tc>
-        <w:tc>
-          <w:tcPr>
-            <w:tcW w:w="1850" w:type="dxa"/>
-          </w:tcPr>
-          <w:p>
-            <w:r>
-              <w:t>25 menit</w:t>
-            </w:r>
-          </w:p>
-        </w:tc>
-      </w:tr>
-      <w:tr>
-        <w:trPr>
-          <w:gridAfter w:val="1"/>
-          <w:wAfter w:w="10" w:type="dxa"/>
-          <w:trHeight w:val="306"/>
-        </w:trPr>
-        <w:tc>
-          <w:tcPr>
-            <w:tcW w:w="2665" w:type="dxa"/>
-            <w:gridSpan w:val="3"/>
-            <w:vAlign w:val="center"/>
-          </w:tcPr>
-          <w:p>
-            <w:pPr>
-              <w:pStyle w:val="DaftarParagraf"/>
-              <w:numPr>
-                <w:ilvl w:val="0"/>
-                <w:numId w:val="6"/>
-              </w:numPr>
-              <w:spacing w:before="120" w:after="120"/>
-              <w:ind w:left="436" w:hanging="426"/>
-              <w:jc w:val="both"/>
-              <w:rPr>
-                <w:rFonts w:ascii="Tahoma" w:eastAsia="Tahoma" w:hAnsi="Tahoma" w:cs="Tahoma"/>
-                <w:b/>
-              </w:rPr>
-            </w:pPr>
-            <w:r>
-              <w:rPr>
-                <w:rFonts w:ascii="Tahoma" w:eastAsia="Tahoma" w:hAnsi="Tahoma" w:cs="Tahoma"/>
-                <w:b/>
-              </w:rPr>
-              <w:t>Evaluasi</w:t>
-            </w:r>
-          </w:p>
-        </w:tc>
-        <w:tc>
-          <w:tcPr>
-            <w:tcW w:w="3543" w:type="dxa"/>
-            <w:gridSpan w:val="2"/>
-          </w:tcPr>
-          <w:p>
-            <w:r>
-              <w:t>Peserta merangkum prosedur K3 dan membuat checklist keselamatan kerja.</w:t>
-            </w:r>
-          </w:p>
-        </w:tc>
-        <w:tc>
-          <w:tcPr>
-            <w:tcW w:w="1796" w:type="dxa"/>
-            <w:gridSpan w:val="3"/>
-          </w:tcPr>
-          <w:p>
-            <w:r>
-              <w:t>Lembar Jobsheet / Laporan Tugas</w:t>
-            </w:r>
-          </w:p>
-        </w:tc>
-        <w:tc>
-          <w:tcPr>
-            <w:tcW w:w="1850" w:type="dxa"/>
-          </w:tcPr>
-          <w:p>
-            <w:r>
-              <w:t>30 menit</w:t>
-            </w:r>
-          </w:p>
-        </w:tc>
-      </w:tr>
-      <w:tr>
-        <w:trPr>
-          <w:gridAfter w:val="1"/>
-          <w:wAfter w:w="10" w:type="dxa"/>
-          <w:trHeight w:val="587"/>
-        </w:trPr>
-        <w:tc>
-          <w:tcPr>
-            <w:tcW w:w="2665" w:type="dxa"/>
-            <w:gridSpan w:val="3"/>
-            <w:vAlign w:val="center"/>
-          </w:tcPr>
-          <w:p>
-            <w:pPr>
-              <w:spacing w:before="120" w:after="120"/>
-              <w:jc w:val="both"/>
-              <w:rPr>
-                <w:rFonts w:ascii="Tahoma" w:eastAsia="Tahoma" w:hAnsi="Tahoma" w:cs="Tahoma"/>
-                <w:b/>
-                <w:sz w:val="22"/>
-                <w:szCs w:val="22"/>
-              </w:rPr>
-            </w:pPr>
-            <w:r>
-              <w:rPr>
-                <w:rFonts w:ascii="Tahoma" w:eastAsia="Tahoma" w:hAnsi="Tahoma" w:cs="Tahoma"/>
-                <w:b/>
-                <w:sz w:val="22"/>
-                <w:szCs w:val="22"/>
-              </w:rPr>
-              <w:t>Tugas Tambahan</w:t>
-            </w:r>
-          </w:p>
-        </w:tc>
-        <w:tc>
-          <w:tcPr>
-            <w:tcW w:w="3543" w:type="dxa"/>
-            <w:gridSpan w:val="2"/>
           </w:tcPr>
           <w:p>
             <w:pPr>
@@ -2414,209 +3032,6 @@
                 <w:szCs w:val="22"/>
               </w:rPr>
             </w:pPr>
-            <w:r>
-              <w:rPr>
-                <w:rFonts w:ascii="Tahoma" w:eastAsia="Tahoma" w:hAnsi="Tahoma" w:cs="Tahoma"/>
-                <w:color w:val="000000"/>
-                <w:sz w:val="22"/>
-                <w:szCs w:val="22"/>
-              </w:rPr>
-              <w:t>Instruktur memberikan tugas tambahan kepada peserta pelatihan untuk pekerjaan rumah, setelah menyelesaikan tugas harap dikumpulkan kepada instruktur melalui email batas waktu esok hari pukul 0</w:t>
-            </w:r>
-            <w:r>
-              <w:rPr>
-                <w:rFonts w:ascii="Tahoma" w:eastAsia="Tahoma" w:hAnsi="Tahoma" w:cs="Tahoma"/>
-                <w:color w:val="000000"/>
-                <w:sz w:val="22"/>
-                <w:szCs w:val="22"/>
-              </w:rPr>
-              <w:t>9</w:t>
-            </w:r>
-            <w:r>
-              <w:rPr>
-                <w:rFonts w:ascii="Tahoma" w:eastAsia="Tahoma" w:hAnsi="Tahoma" w:cs="Tahoma"/>
-                <w:color w:val="000000"/>
-                <w:sz w:val="22"/>
-                <w:szCs w:val="22"/>
-              </w:rPr>
-              <w:t>.00</w:t>
-            </w:r>
-          </w:p>
-        </w:tc>
-        <w:tc>
-          <w:tcPr>
-            <w:tcW w:w="1796" w:type="dxa"/>
-            <w:gridSpan w:val="3"/>
-          </w:tcPr>
-          <w:p>
-            <w:pPr>
-              <w:numPr>
-                <w:ilvl w:val="0"/>
-                <w:numId w:val="4"/>
-              </w:numPr>
-              <w:pBdr>
-                <w:top w:val="nil"/>
-                <w:left w:val="nil"/>
-                <w:bottom w:val="nil"/>
-                <w:right w:val="nil"/>
-                <w:between w:val="nil"/>
-              </w:pBdr>
-              <w:spacing w:before="60" w:line="276" w:lineRule="auto"/>
-              <w:ind w:left="253" w:right="89" w:hanging="220"/>
-              <w:rPr>
-                <w:rFonts w:ascii="Tahoma" w:eastAsia="Tahoma" w:hAnsi="Tahoma" w:cs="Tahoma"/>
-                <w:color w:val="000000"/>
-                <w:sz w:val="22"/>
-                <w:szCs w:val="22"/>
-              </w:rPr>
-            </w:pPr>
-            <w:r>
-              <w:rPr>
-                <w:rFonts w:ascii="Tahoma" w:eastAsia="Tahoma" w:hAnsi="Tahoma" w:cs="Tahoma"/>
-                <w:color w:val="000000"/>
-                <w:sz w:val="22"/>
-                <w:szCs w:val="22"/>
-              </w:rPr>
-              <w:t xml:space="preserve">Power </w:t>
-            </w:r>
-            <w:proofErr w:type="spellStart"/>
-            <w:r>
-              <w:rPr>
-                <w:rFonts w:ascii="Tahoma" w:eastAsia="Tahoma" w:hAnsi="Tahoma" w:cs="Tahoma"/>
-                <w:color w:val="000000"/>
-                <w:sz w:val="22"/>
-                <w:szCs w:val="22"/>
-              </w:rPr>
-              <w:t>Point</w:t>
-            </w:r>
-            <w:proofErr w:type="spellEnd"/>
-          </w:p>
-          <w:p>
-            <w:pPr>
-              <w:pBdr>
-                <w:top w:val="nil"/>
-                <w:left w:val="nil"/>
-                <w:bottom w:val="nil"/>
-                <w:right w:val="nil"/>
-                <w:between w:val="nil"/>
-              </w:pBdr>
-              <w:spacing w:before="60" w:line="276" w:lineRule="auto"/>
-              <w:ind w:left="253" w:right="89"/>
-              <w:rPr>
-                <w:rFonts w:ascii="Tahoma" w:eastAsia="Tahoma" w:hAnsi="Tahoma" w:cs="Tahoma"/>
-                <w:color w:val="000000"/>
-                <w:sz w:val="22"/>
-                <w:szCs w:val="22"/>
-              </w:rPr>
-            </w:pPr>
-            <w:r>
-              <w:rPr>
-                <w:rFonts w:ascii="Tahoma" w:eastAsia="Tahoma" w:hAnsi="Tahoma" w:cs="Tahoma"/>
-                <w:color w:val="000000"/>
-                <w:sz w:val="22"/>
-                <w:szCs w:val="22"/>
-              </w:rPr>
-              <w:t xml:space="preserve">(Tugas membuat </w:t>
-            </w:r>
-            <w:proofErr w:type="spellStart"/>
-            <w:r>
-              <w:rPr>
-                <w:rFonts w:ascii="Tahoma" w:eastAsia="Tahoma" w:hAnsi="Tahoma" w:cs="Tahoma"/>
-                <w:color w:val="000000"/>
-                <w:sz w:val="22"/>
-                <w:szCs w:val="22"/>
-              </w:rPr>
-              <w:t>Carousel</w:t>
-            </w:r>
-            <w:proofErr w:type="spellEnd"/>
-            <w:r>
-              <w:rPr>
-                <w:rFonts w:ascii="Tahoma" w:eastAsia="Tahoma" w:hAnsi="Tahoma" w:cs="Tahoma"/>
-                <w:color w:val="000000"/>
-                <w:sz w:val="22"/>
-                <w:szCs w:val="22"/>
-              </w:rPr>
-              <w:t xml:space="preserve"> 3 halaman disertakan </w:t>
-            </w:r>
-            <w:proofErr w:type="spellStart"/>
-            <w:r>
-              <w:rPr>
-                <w:rFonts w:ascii="Tahoma" w:eastAsia="Tahoma" w:hAnsi="Tahoma" w:cs="Tahoma"/>
-                <w:color w:val="000000"/>
-                <w:sz w:val="22"/>
-                <w:szCs w:val="22"/>
-              </w:rPr>
-              <w:t>copywriting</w:t>
-            </w:r>
-            <w:proofErr w:type="spellEnd"/>
-            <w:r>
-              <w:rPr>
-                <w:rFonts w:ascii="Tahoma" w:eastAsia="Tahoma" w:hAnsi="Tahoma" w:cs="Tahoma"/>
-                <w:color w:val="000000"/>
-                <w:sz w:val="22"/>
-                <w:szCs w:val="22"/>
-              </w:rPr>
-              <w:t xml:space="preserve"> kemudian </w:t>
-            </w:r>
-            <w:proofErr w:type="spellStart"/>
-            <w:r>
-              <w:rPr>
-                <w:rFonts w:ascii="Tahoma" w:eastAsia="Tahoma" w:hAnsi="Tahoma" w:cs="Tahoma"/>
-                <w:color w:val="000000"/>
-                <w:sz w:val="22"/>
-                <w:szCs w:val="22"/>
-              </w:rPr>
-              <w:t>posting</w:t>
-            </w:r>
-            <w:proofErr w:type="spellEnd"/>
-            <w:r>
-              <w:rPr>
-                <w:rFonts w:ascii="Tahoma" w:eastAsia="Tahoma" w:hAnsi="Tahoma" w:cs="Tahoma"/>
-                <w:color w:val="000000"/>
-                <w:sz w:val="22"/>
-                <w:szCs w:val="22"/>
-              </w:rPr>
-              <w:t xml:space="preserve"> </w:t>
-            </w:r>
-            <w:proofErr w:type="spellStart"/>
-            <w:r>
-              <w:rPr>
-                <w:rFonts w:ascii="Tahoma" w:eastAsia="Tahoma" w:hAnsi="Tahoma" w:cs="Tahoma"/>
-                <w:color w:val="000000"/>
-                <w:sz w:val="22"/>
-                <w:szCs w:val="22"/>
-              </w:rPr>
-              <w:t>diinstagram</w:t>
-            </w:r>
-            <w:proofErr w:type="spellEnd"/>
-            <w:r>
-              <w:rPr>
-                <w:rFonts w:ascii="Tahoma" w:eastAsia="Tahoma" w:hAnsi="Tahoma" w:cs="Tahoma"/>
-                <w:color w:val="000000"/>
-                <w:sz w:val="22"/>
-                <w:szCs w:val="22"/>
-              </w:rPr>
-              <w:t xml:space="preserve">) </w:t>
-            </w:r>
-          </w:p>
-          <w:p>
-            <w:pPr>
-              <w:pBdr>
-                <w:top w:val="nil"/>
-                <w:left w:val="nil"/>
-                <w:bottom w:val="nil"/>
-                <w:right w:val="nil"/>
-                <w:between w:val="nil"/>
-              </w:pBdr>
-              <w:spacing w:before="60" w:line="276" w:lineRule="auto"/>
-              <w:ind w:left="33" w:right="89"/>
-              <w:rPr>
-                <w:rFonts w:ascii="Tahoma" w:eastAsia="Tahoma" w:hAnsi="Tahoma" w:cs="Tahoma"/>
-                <w:color w:val="000000"/>
-                <w:sz w:val="22"/>
-                <w:szCs w:val="22"/>
-              </w:rPr>
-            </w:pPr>
           </w:p>
         </w:tc>
         <w:tc>
@@ -2641,193 +3056,7 @@
               </w:rPr>
             </w:pPr>
             <w:r>
-              <w:rPr>
-                <w:rFonts w:ascii="Tahoma" w:eastAsia="Tahoma" w:hAnsi="Tahoma" w:cs="Tahoma"/>
-                <w:sz w:val="22"/>
-                <w:szCs w:val="22"/>
-              </w:rPr>
-              <w:t>5</w:t>
-            </w:r>
-            <w:r>
-              <w:rPr>
-                <w:rFonts w:ascii="Tahoma" w:eastAsia="Tahoma" w:hAnsi="Tahoma" w:cs="Tahoma"/>
-                <w:sz w:val="22"/>
-                <w:szCs w:val="22"/>
-              </w:rPr>
-              <w:t xml:space="preserve"> menit</w:t>
-            </w:r>
-          </w:p>
-        </w:tc>
-      </w:tr>
-      <w:tr>
-        <w:trPr>
-          <w:gridAfter w:val="1"/>
-          <w:wAfter w:w="10" w:type="dxa"/>
-        </w:trPr>
-        <w:tc>
-          <w:tcPr>
-            <w:tcW w:w="2665" w:type="dxa"/>
-            <w:gridSpan w:val="3"/>
-            <w:vAlign w:val="center"/>
-          </w:tcPr>
-          <w:p>
-            <w:pPr>
-              <w:spacing w:before="120" w:after="120"/>
-              <w:jc w:val="both"/>
-              <w:rPr>
-                <w:rFonts w:ascii="Tahoma" w:eastAsia="Tahoma" w:hAnsi="Tahoma" w:cs="Tahoma"/>
-                <w:b/>
-                <w:sz w:val="22"/>
-                <w:szCs w:val="22"/>
-              </w:rPr>
-            </w:pPr>
-            <w:r>
-              <w:rPr>
-                <w:rFonts w:ascii="Tahoma" w:eastAsia="Tahoma" w:hAnsi="Tahoma" w:cs="Tahoma"/>
-                <w:b/>
-                <w:sz w:val="22"/>
-                <w:szCs w:val="22"/>
-              </w:rPr>
-              <w:t>Pemberesan Kelas</w:t>
-            </w:r>
-          </w:p>
-        </w:tc>
-        <w:tc>
-          <w:tcPr>
-            <w:tcW w:w="3543" w:type="dxa"/>
-            <w:gridSpan w:val="2"/>
-          </w:tcPr>
-          <w:p>
-            <w:pPr>
-              <w:numPr>
-                <w:ilvl w:val="0"/>
-                <w:numId w:val="4"/>
-              </w:numPr>
-              <w:pBdr>
-                <w:top w:val="nil"/>
-                <w:left w:val="nil"/>
-                <w:bottom w:val="nil"/>
-                <w:right w:val="nil"/>
-                <w:between w:val="nil"/>
-              </w:pBdr>
-              <w:spacing w:before="60" w:line="276" w:lineRule="auto"/>
-              <w:ind w:left="253" w:right="89" w:hanging="220"/>
-              <w:rPr>
-                <w:rFonts w:ascii="Tahoma" w:eastAsia="Tahoma" w:hAnsi="Tahoma" w:cs="Tahoma"/>
-                <w:color w:val="000000"/>
-                <w:sz w:val="22"/>
-                <w:szCs w:val="22"/>
-              </w:rPr>
-            </w:pPr>
-            <w:r>
-              <w:rPr>
-                <w:rFonts w:ascii="Tahoma" w:eastAsia="Tahoma" w:hAnsi="Tahoma" w:cs="Tahoma"/>
-                <w:color w:val="000000"/>
-                <w:sz w:val="22"/>
-                <w:szCs w:val="22"/>
-              </w:rPr>
-              <w:t>Merapikan Ruang kelas</w:t>
-            </w:r>
-          </w:p>
-          <w:p>
-            <w:pPr>
-              <w:numPr>
-                <w:ilvl w:val="0"/>
-                <w:numId w:val="4"/>
-              </w:numPr>
-              <w:pBdr>
-                <w:top w:val="nil"/>
-                <w:left w:val="nil"/>
-                <w:bottom w:val="nil"/>
-                <w:right w:val="nil"/>
-                <w:between w:val="nil"/>
-              </w:pBdr>
-              <w:spacing w:before="60" w:line="276" w:lineRule="auto"/>
-              <w:ind w:left="253" w:right="89" w:hanging="220"/>
-              <w:rPr>
-                <w:rFonts w:ascii="Tahoma" w:eastAsia="Tahoma" w:hAnsi="Tahoma" w:cs="Tahoma"/>
-                <w:color w:val="000000"/>
-                <w:sz w:val="22"/>
-                <w:szCs w:val="22"/>
-              </w:rPr>
-            </w:pPr>
-            <w:r>
-              <w:rPr>
-                <w:rFonts w:ascii="Tahoma" w:eastAsia="Tahoma" w:hAnsi="Tahoma" w:cs="Tahoma"/>
-                <w:color w:val="000000"/>
-                <w:sz w:val="22"/>
-                <w:szCs w:val="22"/>
-              </w:rPr>
-              <w:lastRenderedPageBreak/>
-              <w:t>Berdoa dan memberikan salam</w:t>
-            </w:r>
-          </w:p>
-        </w:tc>
-        <w:tc>
-          <w:tcPr>
-            <w:tcW w:w="1796" w:type="dxa"/>
-            <w:gridSpan w:val="3"/>
-          </w:tcPr>
-          <w:p>
-            <w:pPr>
-              <w:numPr>
-                <w:ilvl w:val="0"/>
-                <w:numId w:val="4"/>
-              </w:numPr>
-              <w:pBdr>
-                <w:top w:val="nil"/>
-                <w:left w:val="nil"/>
-                <w:bottom w:val="nil"/>
-                <w:right w:val="nil"/>
-                <w:between w:val="nil"/>
-              </w:pBdr>
-              <w:spacing w:before="60" w:line="276" w:lineRule="auto"/>
-              <w:ind w:left="253" w:right="89" w:hanging="220"/>
-              <w:rPr>
-                <w:rFonts w:ascii="Tahoma" w:eastAsia="Tahoma" w:hAnsi="Tahoma" w:cs="Tahoma"/>
-                <w:color w:val="000000"/>
-                <w:sz w:val="22"/>
-                <w:szCs w:val="22"/>
-              </w:rPr>
-            </w:pPr>
-          </w:p>
-        </w:tc>
-        <w:tc>
-          <w:tcPr>
-            <w:tcW w:w="1850" w:type="dxa"/>
-          </w:tcPr>
-          <w:p>
-            <w:pPr>
-              <w:pBdr>
-                <w:top w:val="nil"/>
-                <w:left w:val="nil"/>
-                <w:bottom w:val="nil"/>
-                <w:right w:val="nil"/>
-                <w:between w:val="nil"/>
-              </w:pBdr>
-              <w:spacing w:before="60"/>
-              <w:jc w:val="center"/>
-              <w:rPr>
-                <w:rFonts w:ascii="Tahoma" w:eastAsia="Tahoma" w:hAnsi="Tahoma" w:cs="Tahoma"/>
-                <w:sz w:val="22"/>
-                <w:szCs w:val="22"/>
-              </w:rPr>
-            </w:pPr>
-            <w:r>
-              <w:rPr>
-                <w:rFonts w:ascii="Tahoma" w:eastAsia="Tahoma" w:hAnsi="Tahoma" w:cs="Tahoma"/>
-                <w:sz w:val="22"/>
-                <w:szCs w:val="22"/>
-              </w:rPr>
-              <w:t>5</w:t>
-            </w:r>
-            <w:r>
-              <w:rPr>
-                <w:rFonts w:ascii="Tahoma" w:eastAsia="Tahoma" w:hAnsi="Tahoma" w:cs="Tahoma"/>
-                <w:sz w:val="22"/>
-                <w:szCs w:val="22"/>
-              </w:rPr>
-              <w:t xml:space="preserve"> menit</w:t>
+              <w:t xml:space="preserve">5 menit</w:t>
             </w:r>
           </w:p>
         </w:tc>
@@ -2874,7 +3103,7 @@
         <w:rPr>
           <w:rFonts w:ascii="Tahoma" w:eastAsia="Tahoma" w:hAnsi="Tahoma" w:cs="Tahoma"/>
         </w:rPr>
-        <w:t>Sorong</w:t>
+        <w:t>Belitung</w:t>
       </w:r>
       <w:r>
         <w:rPr>
@@ -2886,7 +3115,13 @@
         <w:rPr>
           <w:rFonts w:ascii="Tahoma" w:eastAsia="Tahoma" w:hAnsi="Tahoma" w:cs="Tahoma"/>
         </w:rPr>
-        <w:t xml:space="preserve">Juli </w:t>
+        <w:t>Agustus</w:t>
+      </w:r>
+      <w:r>
+        <w:rPr>
+          <w:rFonts w:ascii="Tahoma" w:eastAsia="Tahoma" w:hAnsi="Tahoma" w:cs="Tahoma"/>
+        </w:rPr>
+        <w:t xml:space="preserve"> </w:t>
       </w:r>
       <w:r>
         <w:rPr>
@@ -2899,7 +3134,7 @@
           <w:rFonts w:ascii="Tahoma" w:eastAsia="Tahoma" w:hAnsi="Tahoma" w:cs="Tahoma"/>
           <w:lang w:val="en-US"/>
         </w:rPr>
-        <w:t>5</w:t>
+        <w:t>6</w:t>
       </w:r>
     </w:p>
     <w:p>
@@ -3120,7 +3355,12 @@
           <w:rFonts w:ascii="Tahoma" w:eastAsia="Tahoma" w:hAnsi="Tahoma" w:cs="Tahoma"/>
         </w:rPr>
         <w:tab/>
-        <w:t>Dwi Anggraeni, S.Kom</w:t>
+      </w:r>
+      <w:r>
+        <w:rPr>
+          <w:rFonts w:ascii="Tahoma" w:eastAsia="Tahoma" w:hAnsi="Tahoma" w:cs="Tahoma"/>
+        </w:rPr>
+        <w:t>Arry Trie Adhytia</w:t>
       </w:r>
     </w:p>
     <w:p>
@@ -3337,8 +3577,12 @@
     </w:p>
     <w:p/>
     <w:sectPr>
-      <w:headerReference w:type="default" r:id="rId8"/>
-      <w:footerReference w:type="default" r:id="rId9"/>
+      <w:headerReference w:type="even" r:id="rId8"/>
+      <w:headerReference w:type="default" r:id="rId9"/>
+      <w:footerReference w:type="even" r:id="rId10"/>
+      <w:footerReference w:type="default" r:id="rId11"/>
+      <w:headerReference w:type="first" r:id="rId12"/>
+      <w:footerReference w:type="first" r:id="rId13"/>
       <w:pgSz w:w="11907" w:h="16840"/>
       <w:pgMar w:top="2552" w:right="1134" w:bottom="851" w:left="1418" w:header="720" w:footer="720" w:gutter="0"/>
       <w:pgNumType w:start="1"/>
@@ -3350,7 +3594,7 @@
 </file>
 
 <file path=word/endnotes.xml><?xml version="1.0" encoding="utf-8"?>
-<w:endnotes xmlns:wpc="http://schemas.microsoft.com/office/word/2010/wordprocessingCanvas" xmlns:cx="http://schemas.microsoft.com/office/drawing/2014/chartex" xmlns:cx1="http://schemas.microsoft.com/office/drawing/2015/9/8/chartex" xmlns:cx2="http://schemas.microsoft.com/office/drawing/2015/10/21/chartex" xmlns:cx3="http://schemas.microsoft.com/office/drawing/2016/5/9/chartex" xmlns:cx4="http://schemas.microsoft.com/office/drawing/2016/5/10/chartex" xmlns:cx5="http://schemas.microsoft.com/office/drawing/2016/5/11/chartex" xmlns:cx6="http://schemas.microsoft.com/office/drawing/2016/5/12/chartex" xmlns:cx7="http://schemas.microsoft.com/office/drawing/2016/5/13/chartex" xmlns:cx8="http://schemas.microsoft.com/office/drawing/2016/5/14/chartex" xmlns:mc="http://schemas.openxmlformats.org/markup-compatibility/2006" xmlns:aink="http://schemas.microsoft.com/office/drawing/2016/ink" xmlns:am3d="http://schemas.microsoft.com/office/drawing/2017/model3d" xmlns:o="urn:schemas-microsoft-com:office:office" xmlns:oel="http://schemas.microsoft.com/office/2019/extlst" xmlns:r="http://schemas.openxmlformats.org/officeDocument/2006/relationships" xmlns:m="http://schemas.openxmlformats.org/officeDocument/2006/math" xmlns:v="urn:schemas-microsoft-com:vml" xmlns:wp14="http://schemas.microsoft.com/office/word/2010/wordprocessingDrawing" xmlns:wp="http://schemas.openxmlformats.org/drawingml/2006/wordprocessingDrawing" xmlns:w10="urn:schemas-microsoft-com:office:word" xmlns:w="http://schemas.openxmlformats.org/wordprocessingml/2006/main" xmlns:w14="http://schemas.microsoft.com/office/word/2010/wordml" xmlns:w15="http://schemas.microsoft.com/office/word/2012/wordml" xmlns:w16cex="http://schemas.microsoft.com/office/word/2018/wordml/cex" xmlns:w16cid="http://schemas.microsoft.com/office/word/2016/wordml/cid" xmlns:w16="http://schemas.microsoft.com/office/word/2018/wordml" xmlns:w16du="http://schemas.microsoft.com/office/word/2023/wordml/word16du" xmlns:w16sdtdh="http://schemas.microsoft.com/office/word/2020/wordml/sdtdatahash" xmlns:w16sdtfl="http://schemas.microsoft.com/office/word/2024/wordml/sdtformatlock" xmlns:w16se="http://schemas.microsoft.com/office/word/2015/wordml/symex" xmlns:wpg="http://schemas.microsoft.com/office/word/2010/wordprocessingGroup" xmlns:wpi="http://schemas.microsoft.com/office/word/2010/wordprocessingInk" xmlns:wne="http://schemas.microsoft.com/office/word/2006/wordml" xmlns:wps="http://schemas.microsoft.com/office/word/2010/wordprocessingShape" mc:Ignorable="w14 w15 w16se w16cid w16 w16cex w16sdtdh w16sdtfl w16du wp14">
+<w:endnotes xmlns:wpc="http://schemas.microsoft.com/office/word/2010/wordprocessingCanvas" xmlns:cx="http://schemas.microsoft.com/office/drawing/2014/chartex" xmlns:cx1="http://schemas.microsoft.com/office/drawing/2015/9/8/chartex" xmlns:cx2="http://schemas.microsoft.com/office/drawing/2015/10/21/chartex" xmlns:cx3="http://schemas.microsoft.com/office/drawing/2016/5/9/chartex" xmlns:cx4="http://schemas.microsoft.com/office/drawing/2016/5/10/chartex" xmlns:cx5="http://schemas.microsoft.com/office/drawing/2016/5/11/chartex" xmlns:cx6="http://schemas.microsoft.com/office/drawing/2016/5/12/chartex" xmlns:cx7="http://schemas.microsoft.com/office/drawing/2016/5/13/chartex" xmlns:cx8="http://schemas.microsoft.com/office/drawing/2016/5/14/chartex" xmlns:mc="http://schemas.openxmlformats.org/markup-compatibility/2006" xmlns:aink="http://schemas.microsoft.com/office/drawing/2016/ink" xmlns:am3d="http://schemas.microsoft.com/office/drawing/2017/model3d" xmlns:o="urn:schemas-microsoft-com:office:office" xmlns:oel="http://schemas.microsoft.com/office/2019/extlst" xmlns:r="http://schemas.openxmlformats.org/officeDocument/2006/relationships" xmlns:m="http://schemas.openxmlformats.org/officeDocument/2006/math" xmlns:v="urn:schemas-microsoft-com:vml" xmlns:wp14="http://schemas.microsoft.com/office/word/2010/wordprocessingDrawing" xmlns:wp="http://schemas.openxmlformats.org/drawingml/2006/wordprocessingDrawing" xmlns:w10="urn:schemas-microsoft-com:office:word" xmlns:w="http://schemas.openxmlformats.org/wordprocessingml/2006/main" xmlns:w14="http://schemas.microsoft.com/office/word/2010/wordml" xmlns:w15="http://schemas.microsoft.com/office/word/2012/wordml" xmlns:w16cei="http://schemas.microsoft.com/office/word/2026/wordml/cei" xmlns:w16cex="http://schemas.microsoft.com/office/word/2018/wordml/cex" xmlns:w16cid="http://schemas.microsoft.com/office/word/2016/wordml/cid" xmlns:w16="http://schemas.microsoft.com/office/word/2018/wordml" xmlns:w16du="http://schemas.microsoft.com/office/word/2023/wordml/word16du" xmlns:w16sdtdh="http://schemas.microsoft.com/office/word/2020/wordml/sdtdatahash" xmlns:w16sdtfl="http://schemas.microsoft.com/office/word/2024/wordml/sdtformatlock" xmlns:w16se="http://schemas.microsoft.com/office/word/2015/wordml/symex" xmlns:wpg="http://schemas.microsoft.com/office/word/2010/wordprocessingGroup" xmlns:wpi="http://schemas.microsoft.com/office/word/2010/wordprocessingInk" xmlns:wne="http://schemas.microsoft.com/office/word/2006/wordml" xmlns:wps="http://schemas.microsoft.com/office/word/2010/wordprocessingShape" mc:Ignorable="w14 w15 w16se w16cid w16 w16cex w16sdtdh w16sdtfl w16du wp14">
   <w:endnote w:type="separator" w:id="-1">
     <w:p>
       <w:r>
@@ -3369,7 +3613,17 @@
 </file>
 
 <file path=word/footer1.xml><?xml version="1.0" encoding="utf-8"?>
-<w:ftr xmlns:wpc="http://schemas.microsoft.com/office/word/2010/wordprocessingCanvas" xmlns:cx="http://schemas.microsoft.com/office/drawing/2014/chartex" xmlns:cx1="http://schemas.microsoft.com/office/drawing/2015/9/8/chartex" xmlns:cx2="http://schemas.microsoft.com/office/drawing/2015/10/21/chartex" xmlns:cx3="http://schemas.microsoft.com/office/drawing/2016/5/9/chartex" xmlns:cx4="http://schemas.microsoft.com/office/drawing/2016/5/10/chartex" xmlns:cx5="http://schemas.microsoft.com/office/drawing/2016/5/11/chartex" xmlns:cx6="http://schemas.microsoft.com/office/drawing/2016/5/12/chartex" xmlns:cx7="http://schemas.microsoft.com/office/drawing/2016/5/13/chartex" xmlns:cx8="http://schemas.microsoft.com/office/drawing/2016/5/14/chartex" xmlns:mc="http://schemas.openxmlformats.org/markup-compatibility/2006" xmlns:aink="http://schemas.microsoft.com/office/drawing/2016/ink" xmlns:am3d="http://schemas.microsoft.com/office/drawing/2017/model3d" xmlns:o="urn:schemas-microsoft-com:office:office" xmlns:oel="http://schemas.microsoft.com/office/2019/extlst" xmlns:r="http://schemas.openxmlformats.org/officeDocument/2006/relationships" xmlns:m="http://schemas.openxmlformats.org/officeDocument/2006/math" xmlns:v="urn:schemas-microsoft-com:vml" xmlns:wp14="http://schemas.microsoft.com/office/word/2010/wordprocessingDrawing" xmlns:wp="http://schemas.openxmlformats.org/drawingml/2006/wordprocessingDrawing" xmlns:w10="urn:schemas-microsoft-com:office:word" xmlns:w="http://schemas.openxmlformats.org/wordprocessingml/2006/main" xmlns:w14="http://schemas.microsoft.com/office/word/2010/wordml" xmlns:w15="http://schemas.microsoft.com/office/word/2012/wordml" xmlns:w16cex="http://schemas.microsoft.com/office/word/2018/wordml/cex" xmlns:w16cid="http://schemas.microsoft.com/office/word/2016/wordml/cid" xmlns:w16="http://schemas.microsoft.com/office/word/2018/wordml" xmlns:w16du="http://schemas.microsoft.com/office/word/2023/wordml/word16du" xmlns:w16sdtdh="http://schemas.microsoft.com/office/word/2020/wordml/sdtdatahash" xmlns:w16sdtfl="http://schemas.microsoft.com/office/word/2024/wordml/sdtformatlock" xmlns:w16se="http://schemas.microsoft.com/office/word/2015/wordml/symex" xmlns:wpg="http://schemas.microsoft.com/office/word/2010/wordprocessingGroup" xmlns:wpi="http://schemas.microsoft.com/office/word/2010/wordprocessingInk" xmlns:wne="http://schemas.microsoft.com/office/word/2006/wordml" xmlns:wps="http://schemas.microsoft.com/office/word/2010/wordprocessingShape" mc:Ignorable="w14 w15 w16se w16cid w16 w16cex w16sdtdh w16sdtfl w16du wp14">
+<w:ftr xmlns:wpc="http://schemas.microsoft.com/office/word/2010/wordprocessingCanvas" xmlns:cx="http://schemas.microsoft.com/office/drawing/2014/chartex" xmlns:cx1="http://schemas.microsoft.com/office/drawing/2015/9/8/chartex" xmlns:cx2="http://schemas.microsoft.com/office/drawing/2015/10/21/chartex" xmlns:cx3="http://schemas.microsoft.com/office/drawing/2016/5/9/chartex" xmlns:cx4="http://schemas.microsoft.com/office/drawing/2016/5/10/chartex" xmlns:cx5="http://schemas.microsoft.com/office/drawing/2016/5/11/chartex" xmlns:cx6="http://schemas.microsoft.com/office/drawing/2016/5/12/chartex" xmlns:cx7="http://schemas.microsoft.com/office/drawing/2016/5/13/chartex" xmlns:cx8="http://schemas.microsoft.com/office/drawing/2016/5/14/chartex" xmlns:mc="http://schemas.openxmlformats.org/markup-compatibility/2006" xmlns:aink="http://schemas.microsoft.com/office/drawing/2016/ink" xmlns:am3d="http://schemas.microsoft.com/office/drawing/2017/model3d" xmlns:o="urn:schemas-microsoft-com:office:office" xmlns:oel="http://schemas.microsoft.com/office/2019/extlst" xmlns:r="http://schemas.openxmlformats.org/officeDocument/2006/relationships" xmlns:m="http://schemas.openxmlformats.org/officeDocument/2006/math" xmlns:v="urn:schemas-microsoft-com:vml" xmlns:wp14="http://schemas.microsoft.com/office/word/2010/wordprocessingDrawing" xmlns:wp="http://schemas.openxmlformats.org/drawingml/2006/wordprocessingDrawing" xmlns:w10="urn:schemas-microsoft-com:office:word" xmlns:w="http://schemas.openxmlformats.org/wordprocessingml/2006/main" xmlns:w14="http://schemas.microsoft.com/office/word/2010/wordml" xmlns:w15="http://schemas.microsoft.com/office/word/2012/wordml" xmlns:w16cei="http://schemas.microsoft.com/office/word/2026/wordml/cei" xmlns:w16cex="http://schemas.microsoft.com/office/word/2018/wordml/cex" xmlns:w16cid="http://schemas.microsoft.com/office/word/2016/wordml/cid" xmlns:w16="http://schemas.microsoft.com/office/word/2018/wordml" xmlns:w16du="http://schemas.microsoft.com/office/word/2023/wordml/word16du" xmlns:w16sdtdh="http://schemas.microsoft.com/office/word/2020/wordml/sdtdatahash" xmlns:w16sdtfl="http://schemas.microsoft.com/office/word/2024/wordml/sdtformatlock" xmlns:w16se="http://schemas.microsoft.com/office/word/2015/wordml/symex" xmlns:wpg="http://schemas.microsoft.com/office/word/2010/wordprocessingGroup" xmlns:wpi="http://schemas.microsoft.com/office/word/2010/wordprocessingInk" xmlns:wne="http://schemas.microsoft.com/office/word/2006/wordml" xmlns:wps="http://schemas.microsoft.com/office/word/2010/wordprocessingShape" mc:Ignorable="w14 w15 w16se w16cid w16 w16cex w16sdtdh w16sdtfl w16du wp14">
+  <w:p>
+    <w:pPr>
+      <w:pStyle w:val="Footer"/>
+    </w:pPr>
+  </w:p>
+</w:ftr>
+</file>
+
+<file path=word/footer2.xml><?xml version="1.0" encoding="utf-8"?>
+<w:ftr xmlns:wpc="http://schemas.microsoft.com/office/word/2010/wordprocessingCanvas" xmlns:cx="http://schemas.microsoft.com/office/drawing/2014/chartex" xmlns:cx1="http://schemas.microsoft.com/office/drawing/2015/9/8/chartex" xmlns:cx2="http://schemas.microsoft.com/office/drawing/2015/10/21/chartex" xmlns:cx3="http://schemas.microsoft.com/office/drawing/2016/5/9/chartex" xmlns:cx4="http://schemas.microsoft.com/office/drawing/2016/5/10/chartex" xmlns:cx5="http://schemas.microsoft.com/office/drawing/2016/5/11/chartex" xmlns:cx6="http://schemas.microsoft.com/office/drawing/2016/5/12/chartex" xmlns:cx7="http://schemas.microsoft.com/office/drawing/2016/5/13/chartex" xmlns:cx8="http://schemas.microsoft.com/office/drawing/2016/5/14/chartex" xmlns:mc="http://schemas.openxmlformats.org/markup-compatibility/2006" xmlns:aink="http://schemas.microsoft.com/office/drawing/2016/ink" xmlns:am3d="http://schemas.microsoft.com/office/drawing/2017/model3d" xmlns:o="urn:schemas-microsoft-com:office:office" xmlns:oel="http://schemas.microsoft.com/office/2019/extlst" xmlns:r="http://schemas.openxmlformats.org/officeDocument/2006/relationships" xmlns:m="http://schemas.openxmlformats.org/officeDocument/2006/math" xmlns:v="urn:schemas-microsoft-com:vml" xmlns:wp14="http://schemas.microsoft.com/office/word/2010/wordprocessingDrawing" xmlns:wp="http://schemas.openxmlformats.org/drawingml/2006/wordprocessingDrawing" xmlns:w10="urn:schemas-microsoft-com:office:word" xmlns:w="http://schemas.openxmlformats.org/wordprocessingml/2006/main" xmlns:w14="http://schemas.microsoft.com/office/word/2010/wordml" xmlns:w15="http://schemas.microsoft.com/office/word/2012/wordml" xmlns:w16cei="http://schemas.microsoft.com/office/word/2026/wordml/cei" xmlns:w16cex="http://schemas.microsoft.com/office/word/2018/wordml/cex" xmlns:w16cid="http://schemas.microsoft.com/office/word/2016/wordml/cid" xmlns:w16="http://schemas.microsoft.com/office/word/2018/wordml" xmlns:w16du="http://schemas.microsoft.com/office/word/2023/wordml/word16du" xmlns:w16sdtdh="http://schemas.microsoft.com/office/word/2020/wordml/sdtdatahash" xmlns:w16sdtfl="http://schemas.microsoft.com/office/word/2024/wordml/sdtformatlock" xmlns:w16se="http://schemas.microsoft.com/office/word/2015/wordml/symex" xmlns:wpg="http://schemas.microsoft.com/office/word/2010/wordprocessingGroup" xmlns:wpi="http://schemas.microsoft.com/office/word/2010/wordprocessingInk" xmlns:wne="http://schemas.microsoft.com/office/word/2006/wordml" xmlns:wps="http://schemas.microsoft.com/office/word/2010/wordprocessingShape" mc:Ignorable="w14 w15 w16se w16cid w16 w16cex w16sdtdh w16sdtfl w16du wp14">
   <w:p>
     <w:pPr>
       <w:pBdr>
@@ -3515,8 +3769,18 @@
 </w:ftr>
 </file>
 
+<file path=word/footer3.xml><?xml version="1.0" encoding="utf-8"?>
+<w:ftr xmlns:wpc="http://schemas.microsoft.com/office/word/2010/wordprocessingCanvas" xmlns:cx="http://schemas.microsoft.com/office/drawing/2014/chartex" xmlns:cx1="http://schemas.microsoft.com/office/drawing/2015/9/8/chartex" xmlns:cx2="http://schemas.microsoft.com/office/drawing/2015/10/21/chartex" xmlns:cx3="http://schemas.microsoft.com/office/drawing/2016/5/9/chartex" xmlns:cx4="http://schemas.microsoft.com/office/drawing/2016/5/10/chartex" xmlns:cx5="http://schemas.microsoft.com/office/drawing/2016/5/11/chartex" xmlns:cx6="http://schemas.microsoft.com/office/drawing/2016/5/12/chartex" xmlns:cx7="http://schemas.microsoft.com/office/drawing/2016/5/13/chartex" xmlns:cx8="http://schemas.microsoft.com/office/drawing/2016/5/14/chartex" xmlns:mc="http://schemas.openxmlformats.org/markup-compatibility/2006" xmlns:aink="http://schemas.microsoft.com/office/drawing/2016/ink" xmlns:am3d="http://schemas.microsoft.com/office/drawing/2017/model3d" xmlns:o="urn:schemas-microsoft-com:office:office" xmlns:oel="http://schemas.microsoft.com/office/2019/extlst" xmlns:r="http://schemas.openxmlformats.org/officeDocument/2006/relationships" xmlns:m="http://schemas.openxmlformats.org/officeDocument/2006/math" xmlns:v="urn:schemas-microsoft-com:vml" xmlns:wp14="http://schemas.microsoft.com/office/word/2010/wordprocessingDrawing" xmlns:wp="http://schemas.openxmlformats.org/drawingml/2006/wordprocessingDrawing" xmlns:w10="urn:schemas-microsoft-com:office:word" xmlns:w="http://schemas.openxmlformats.org/wordprocessingml/2006/main" xmlns:w14="http://schemas.microsoft.com/office/word/2010/wordml" xmlns:w15="http://schemas.microsoft.com/office/word/2012/wordml" xmlns:w16cei="http://schemas.microsoft.com/office/word/2026/wordml/cei" xmlns:w16cex="http://schemas.microsoft.com/office/word/2018/wordml/cex" xmlns:w16cid="http://schemas.microsoft.com/office/word/2016/wordml/cid" xmlns:w16="http://schemas.microsoft.com/office/word/2018/wordml" xmlns:w16du="http://schemas.microsoft.com/office/word/2023/wordml/word16du" xmlns:w16sdtdh="http://schemas.microsoft.com/office/word/2020/wordml/sdtdatahash" xmlns:w16sdtfl="http://schemas.microsoft.com/office/word/2024/wordml/sdtformatlock" xmlns:w16se="http://schemas.microsoft.com/office/word/2015/wordml/symex" xmlns:wpg="http://schemas.microsoft.com/office/word/2010/wordprocessingGroup" xmlns:wpi="http://schemas.microsoft.com/office/word/2010/wordprocessingInk" xmlns:wne="http://schemas.microsoft.com/office/word/2006/wordml" xmlns:wps="http://schemas.microsoft.com/office/word/2010/wordprocessingShape" mc:Ignorable="w14 w15 w16se w16cid w16 w16cex w16sdtdh w16sdtfl w16du wp14">
+  <w:p>
+    <w:pPr>
+      <w:pStyle w:val="Footer"/>
+    </w:pPr>
+  </w:p>
+</w:ftr>
+</file>
+
 <file path=word/footnotes.xml><?xml version="1.0" encoding="utf-8"?>
-<w:footnotes xmlns:wpc="http://schemas.microsoft.com/office/word/2010/wordprocessingCanvas" xmlns:cx="http://schemas.microsoft.com/office/drawing/2014/chartex" xmlns:cx1="http://schemas.microsoft.com/office/drawing/2015/9/8/chartex" xmlns:cx2="http://schemas.microsoft.com/office/drawing/2015/10/21/chartex" xmlns:cx3="http://schemas.microsoft.com/office/drawing/2016/5/9/chartex" xmlns:cx4="http://schemas.microsoft.com/office/drawing/2016/5/10/chartex" xmlns:cx5="http://schemas.microsoft.com/office/drawing/2016/5/11/chartex" xmlns:cx6="http://schemas.microsoft.com/office/drawing/2016/5/12/chartex" xmlns:cx7="http://schemas.microsoft.com/office/drawing/2016/5/13/chartex" xmlns:cx8="http://schemas.microsoft.com/office/drawing/2016/5/14/chartex" xmlns:mc="http://schemas.openxmlformats.org/markup-compatibility/2006" xmlns:aink="http://schemas.microsoft.com/office/drawing/2016/ink" xmlns:am3d="http://schemas.microsoft.com/office/drawing/2017/model3d" xmlns:o="urn:schemas-microsoft-com:office:office" xmlns:oel="http://schemas.microsoft.com/office/2019/extlst" xmlns:r="http://schemas.openxmlformats.org/officeDocument/2006/relationships" xmlns:m="http://schemas.openxmlformats.org/officeDocument/2006/math" xmlns:v="urn:schemas-microsoft-com:vml" xmlns:wp14="http://schemas.microsoft.com/office/word/2010/wordprocessingDrawing" xmlns:wp="http://schemas.openxmlformats.org/drawingml/2006/wordprocessingDrawing" xmlns:w10="urn:schemas-microsoft-com:office:word" xmlns:w="http://schemas.openxmlformats.org/wordprocessingml/2006/main" xmlns:w14="http://schemas.microsoft.com/office/word/2010/wordml" xmlns:w15="http://schemas.microsoft.com/office/word/2012/wordml" xmlns:w16cex="http://schemas.microsoft.com/office/word/2018/wordml/cex" xmlns:w16cid="http://schemas.microsoft.com/office/word/2016/wordml/cid" xmlns:w16="http://schemas.microsoft.com/office/word/2018/wordml" xmlns:w16du="http://schemas.microsoft.com/office/word/2023/wordml/word16du" xmlns:w16sdtdh="http://schemas.microsoft.com/office/word/2020/wordml/sdtdatahash" xmlns:w16sdtfl="http://schemas.microsoft.com/office/word/2024/wordml/sdtformatlock" xmlns:w16se="http://schemas.microsoft.com/office/word/2015/wordml/symex" xmlns:wpg="http://schemas.microsoft.com/office/word/2010/wordprocessingGroup" xmlns:wpi="http://schemas.microsoft.com/office/word/2010/wordprocessingInk" xmlns:wne="http://schemas.microsoft.com/office/word/2006/wordml" xmlns:wps="http://schemas.microsoft.com/office/word/2010/wordprocessingShape" mc:Ignorable="w14 w15 w16se w16cid w16 w16cex w16sdtdh w16sdtfl w16du wp14">
+<w:footnotes xmlns:wpc="http://schemas.microsoft.com/office/word/2010/wordprocessingCanvas" xmlns:cx="http://schemas.microsoft.com/office/drawing/2014/chartex" xmlns:cx1="http://schemas.microsoft.com/office/drawing/2015/9/8/chartex" xmlns:cx2="http://schemas.microsoft.com/office/drawing/2015/10/21/chartex" xmlns:cx3="http://schemas.microsoft.com/office/drawing/2016/5/9/chartex" xmlns:cx4="http://schemas.microsoft.com/office/drawing/2016/5/10/chartex" xmlns:cx5="http://schemas.microsoft.com/office/drawing/2016/5/11/chartex" xmlns:cx6="http://schemas.microsoft.com/office/drawing/2016/5/12/chartex" xmlns:cx7="http://schemas.microsoft.com/office/drawing/2016/5/13/chartex" xmlns:cx8="http://schemas.microsoft.com/office/drawing/2016/5/14/chartex" xmlns:mc="http://schemas.openxmlformats.org/markup-compatibility/2006" xmlns:aink="http://schemas.microsoft.com/office/drawing/2016/ink" xmlns:am3d="http://schemas.microsoft.com/office/drawing/2017/model3d" xmlns:o="urn:schemas-microsoft-com:office:office" xmlns:oel="http://schemas.microsoft.com/office/2019/extlst" xmlns:r="http://schemas.openxmlformats.org/officeDocument/2006/relationships" xmlns:m="http://schemas.openxmlformats.org/officeDocument/2006/math" xmlns:v="urn:schemas-microsoft-com:vml" xmlns:wp14="http://schemas.microsoft.com/office/word/2010/wordprocessingDrawing" xmlns:wp="http://schemas.openxmlformats.org/drawingml/2006/wordprocessingDrawing" xmlns:w10="urn:schemas-microsoft-com:office:word" xmlns:w="http://schemas.openxmlformats.org/wordprocessingml/2006/main" xmlns:w14="http://schemas.microsoft.com/office/word/2010/wordml" xmlns:w15="http://schemas.microsoft.com/office/word/2012/wordml" xmlns:w16cei="http://schemas.microsoft.com/office/word/2026/wordml/cei" xmlns:w16cex="http://schemas.microsoft.com/office/word/2018/wordml/cex" xmlns:w16cid="http://schemas.microsoft.com/office/word/2016/wordml/cid" xmlns:w16="http://schemas.microsoft.com/office/word/2018/wordml" xmlns:w16du="http://schemas.microsoft.com/office/word/2023/wordml/word16du" xmlns:w16sdtdh="http://schemas.microsoft.com/office/word/2020/wordml/sdtdatahash" xmlns:w16sdtfl="http://schemas.microsoft.com/office/word/2024/wordml/sdtformatlock" xmlns:w16se="http://schemas.microsoft.com/office/word/2015/wordml/symex" xmlns:wpg="http://schemas.microsoft.com/office/word/2010/wordprocessingGroup" xmlns:wpi="http://schemas.microsoft.com/office/word/2010/wordprocessingInk" xmlns:wne="http://schemas.microsoft.com/office/word/2006/wordml" xmlns:wps="http://schemas.microsoft.com/office/word/2010/wordprocessingShape" mc:Ignorable="w14 w15 w16se w16cid w16 w16cex w16sdtdh w16sdtfl w16du wp14">
   <w:footnote w:type="separator" w:id="-1">
     <w:p>
       <w:r>
@@ -3535,7 +3799,17 @@
 </file>
 
 <file path=word/header1.xml><?xml version="1.0" encoding="utf-8"?>
-<w:hdr xmlns:wpc="http://schemas.microsoft.com/office/word/2010/wordprocessingCanvas" xmlns:cx="http://schemas.microsoft.com/office/drawing/2014/chartex" xmlns:cx1="http://schemas.microsoft.com/office/drawing/2015/9/8/chartex" xmlns:cx2="http://schemas.microsoft.com/office/drawing/2015/10/21/chartex" xmlns:cx3="http://schemas.microsoft.com/office/drawing/2016/5/9/chartex" xmlns:cx4="http://schemas.microsoft.com/office/drawing/2016/5/10/chartex" xmlns:cx5="http://schemas.microsoft.com/office/drawing/2016/5/11/chartex" xmlns:cx6="http://schemas.microsoft.com/office/drawing/2016/5/12/chartex" xmlns:cx7="http://schemas.microsoft.com/office/drawing/2016/5/13/chartex" xmlns:cx8="http://schemas.microsoft.com/office/drawing/2016/5/14/chartex" xmlns:mc="http://schemas.openxmlformats.org/markup-compatibility/2006" xmlns:aink="http://schemas.microsoft.com/office/drawing/2016/ink" xmlns:am3d="http://schemas.microsoft.com/office/drawing/2017/model3d" xmlns:o="urn:schemas-microsoft-com:office:office" xmlns:oel="http://schemas.microsoft.com/office/2019/extlst" xmlns:r="http://schemas.openxmlformats.org/officeDocument/2006/relationships" xmlns:m="http://schemas.openxmlformats.org/officeDocument/2006/math" xmlns:v="urn:schemas-microsoft-com:vml" xmlns:wp14="http://schemas.microsoft.com/office/word/2010/wordprocessingDrawing" xmlns:wp="http://schemas.openxmlformats.org/drawingml/2006/wordprocessingDrawing" xmlns:w10="urn:schemas-microsoft-com:office:word" xmlns:w="http://schemas.openxmlformats.org/wordprocessingml/2006/main" xmlns:w14="http://schemas.microsoft.com/office/word/2010/wordml" xmlns:w15="http://schemas.microsoft.com/office/word/2012/wordml" xmlns:w16cex="http://schemas.microsoft.com/office/word/2018/wordml/cex" xmlns:w16cid="http://schemas.microsoft.com/office/word/2016/wordml/cid" xmlns:w16="http://schemas.microsoft.com/office/word/2018/wordml" xmlns:w16du="http://schemas.microsoft.com/office/word/2023/wordml/word16du" xmlns:w16sdtdh="http://schemas.microsoft.com/office/word/2020/wordml/sdtdatahash" xmlns:w16sdtfl="http://schemas.microsoft.com/office/word/2024/wordml/sdtformatlock" xmlns:w16se="http://schemas.microsoft.com/office/word/2015/wordml/symex" xmlns:wpg="http://schemas.microsoft.com/office/word/2010/wordprocessingGroup" xmlns:wpi="http://schemas.microsoft.com/office/word/2010/wordprocessingInk" xmlns:wne="http://schemas.microsoft.com/office/word/2006/wordml" xmlns:wps="http://schemas.microsoft.com/office/word/2010/wordprocessingShape" mc:Ignorable="w14 w15 w16se w16cid w16 w16cex w16sdtdh w16sdtfl w16du wp14">
+<w:hdr xmlns:wpc="http://schemas.microsoft.com/office/word/2010/wordprocessingCanvas" xmlns:cx="http://schemas.microsoft.com/office/drawing/2014/chartex" xmlns:cx1="http://schemas.microsoft.com/office/drawing/2015/9/8/chartex" xmlns:cx2="http://schemas.microsoft.com/office/drawing/2015/10/21/chartex" xmlns:cx3="http://schemas.microsoft.com/office/drawing/2016/5/9/chartex" xmlns:cx4="http://schemas.microsoft.com/office/drawing/2016/5/10/chartex" xmlns:cx5="http://schemas.microsoft.com/office/drawing/2016/5/11/chartex" xmlns:cx6="http://schemas.microsoft.com/office/drawing/2016/5/12/chartex" xmlns:cx7="http://schemas.microsoft.com/office/drawing/2016/5/13/chartex" xmlns:cx8="http://schemas.microsoft.com/office/drawing/2016/5/14/chartex" xmlns:mc="http://schemas.openxmlformats.org/markup-compatibility/2006" xmlns:aink="http://schemas.microsoft.com/office/drawing/2016/ink" xmlns:am3d="http://schemas.microsoft.com/office/drawing/2017/model3d" xmlns:o="urn:schemas-microsoft-com:office:office" xmlns:oel="http://schemas.microsoft.com/office/2019/extlst" xmlns:r="http://schemas.openxmlformats.org/officeDocument/2006/relationships" xmlns:m="http://schemas.openxmlformats.org/officeDocument/2006/math" xmlns:v="urn:schemas-microsoft-com:vml" xmlns:wp14="http://schemas.microsoft.com/office/word/2010/wordprocessingDrawing" xmlns:wp="http://schemas.openxmlformats.org/drawingml/2006/wordprocessingDrawing" xmlns:w10="urn:schemas-microsoft-com:office:word" xmlns:w="http://schemas.openxmlformats.org/wordprocessingml/2006/main" xmlns:w14="http://schemas.microsoft.com/office/word/2010/wordml" xmlns:w15="http://schemas.microsoft.com/office/word/2012/wordml" xmlns:w16cei="http://schemas.microsoft.com/office/word/2026/wordml/cei" xmlns:w16cex="http://schemas.microsoft.com/office/word/2018/wordml/cex" xmlns:w16cid="http://schemas.microsoft.com/office/word/2016/wordml/cid" xmlns:w16="http://schemas.microsoft.com/office/word/2018/wordml" xmlns:w16du="http://schemas.microsoft.com/office/word/2023/wordml/word16du" xmlns:w16sdtdh="http://schemas.microsoft.com/office/word/2020/wordml/sdtdatahash" xmlns:w16sdtfl="http://schemas.microsoft.com/office/word/2024/wordml/sdtformatlock" xmlns:w16se="http://schemas.microsoft.com/office/word/2015/wordml/symex" xmlns:wpg="http://schemas.microsoft.com/office/word/2010/wordprocessingGroup" xmlns:wpi="http://schemas.microsoft.com/office/word/2010/wordprocessingInk" xmlns:wne="http://schemas.microsoft.com/office/word/2006/wordml" xmlns:wps="http://schemas.microsoft.com/office/word/2010/wordprocessingShape" mc:Ignorable="w14 w15 w16se w16cid w16 w16cex w16sdtdh w16sdtfl w16du wp14">
+  <w:p>
+    <w:pPr>
+      <w:pStyle w:val="Header"/>
+    </w:pPr>
+  </w:p>
+</w:hdr>
+</file>
+
+<file path=word/header2.xml><?xml version="1.0" encoding="utf-8"?>
+<w:hdr xmlns:wpc="http://schemas.microsoft.com/office/word/2010/wordprocessingCanvas" xmlns:cx="http://schemas.microsoft.com/office/drawing/2014/chartex" xmlns:cx1="http://schemas.microsoft.com/office/drawing/2015/9/8/chartex" xmlns:cx2="http://schemas.microsoft.com/office/drawing/2015/10/21/chartex" xmlns:cx3="http://schemas.microsoft.com/office/drawing/2016/5/9/chartex" xmlns:cx4="http://schemas.microsoft.com/office/drawing/2016/5/10/chartex" xmlns:cx5="http://schemas.microsoft.com/office/drawing/2016/5/11/chartex" xmlns:cx6="http://schemas.microsoft.com/office/drawing/2016/5/12/chartex" xmlns:cx7="http://schemas.microsoft.com/office/drawing/2016/5/13/chartex" xmlns:cx8="http://schemas.microsoft.com/office/drawing/2016/5/14/chartex" xmlns:mc="http://schemas.openxmlformats.org/markup-compatibility/2006" xmlns:aink="http://schemas.microsoft.com/office/drawing/2016/ink" xmlns:am3d="http://schemas.microsoft.com/office/drawing/2017/model3d" xmlns:o="urn:schemas-microsoft-com:office:office" xmlns:oel="http://schemas.microsoft.com/office/2019/extlst" xmlns:r="http://schemas.openxmlformats.org/officeDocument/2006/relationships" xmlns:m="http://schemas.openxmlformats.org/officeDocument/2006/math" xmlns:v="urn:schemas-microsoft-com:vml" xmlns:wp14="http://schemas.microsoft.com/office/word/2010/wordprocessingDrawing" xmlns:wp="http://schemas.openxmlformats.org/drawingml/2006/wordprocessingDrawing" xmlns:w10="urn:schemas-microsoft-com:office:word" xmlns:w="http://schemas.openxmlformats.org/wordprocessingml/2006/main" xmlns:w14="http://schemas.microsoft.com/office/word/2010/wordml" xmlns:w15="http://schemas.microsoft.com/office/word/2012/wordml" xmlns:w16cei="http://schemas.microsoft.com/office/word/2026/wordml/cei" xmlns:w16cex="http://schemas.microsoft.com/office/word/2018/wordml/cex" xmlns:w16cid="http://schemas.microsoft.com/office/word/2016/wordml/cid" xmlns:w16="http://schemas.microsoft.com/office/word/2018/wordml" xmlns:w16du="http://schemas.microsoft.com/office/word/2023/wordml/word16du" xmlns:w16sdtdh="http://schemas.microsoft.com/office/word/2020/wordml/sdtdatahash" xmlns:w16sdtfl="http://schemas.microsoft.com/office/word/2024/wordml/sdtformatlock" xmlns:w16se="http://schemas.microsoft.com/office/word/2015/wordml/symex" xmlns:wpg="http://schemas.microsoft.com/office/word/2010/wordprocessingGroup" xmlns:wpi="http://schemas.microsoft.com/office/word/2010/wordprocessingInk" xmlns:wne="http://schemas.microsoft.com/office/word/2006/wordml" xmlns:wps="http://schemas.microsoft.com/office/word/2010/wordprocessingShape" mc:Ignorable="w14 w15 w16se w16cid w16 w16cex w16sdtdh w16sdtfl w16du wp14">
   <w:p>
     <w:pPr>
       <w:shd w:val="clear" w:color="auto" w:fill="FFFFFF"/>
@@ -3630,7 +3904,17 @@
         <w:kern w:val="36"/>
         <w:sz w:val="28"/>
       </w:rPr>
-      <w:t>BBPVP dan BPVP</w:t>
+      <w:t>BPVP</w:t>
+    </w:r>
+    <w:r>
+      <w:rPr>
+        <w:rFonts w:ascii="Tahoma" w:hAnsi="Tahoma" w:cs="Tahoma"/>
+        <w:b/>
+        <w:color w:val="101418"/>
+        <w:kern w:val="36"/>
+        <w:sz w:val="28"/>
+      </w:rPr>
+      <w:t xml:space="preserve"> BELITUNG</w:t>
     </w:r>
   </w:p>
   <w:p>
@@ -3694,61 +3978,7 @@
         <w:color w:val="101418"/>
         <w:kern w:val="36"/>
       </w:rPr>
-      <w:t xml:space="preserve">- </w:t>
-    </w:r>
-    <w:proofErr w:type="spellStart"/>
-    <w:r>
-      <w:rPr>
-        <w:rFonts w:ascii="Tahoma" w:hAnsi="Tahoma" w:cs="Tahoma"/>
-        <w:color w:val="101418"/>
-        <w:kern w:val="36"/>
-      </w:rPr>
-      <w:t>Smart</w:t>
-    </w:r>
-    <w:proofErr w:type="spellEnd"/>
-    <w:r>
-      <w:rPr>
-        <w:rFonts w:ascii="Tahoma" w:hAnsi="Tahoma" w:cs="Tahoma"/>
-        <w:color w:val="101418"/>
-        <w:kern w:val="36"/>
-      </w:rPr>
-      <w:t xml:space="preserve"> </w:t>
-    </w:r>
-    <w:proofErr w:type="spellStart"/>
-    <w:r>
-      <w:rPr>
-        <w:rFonts w:ascii="Tahoma" w:hAnsi="Tahoma" w:cs="Tahoma"/>
-        <w:color w:val="101418"/>
-        <w:kern w:val="36"/>
-      </w:rPr>
-      <w:t>Creative</w:t>
-    </w:r>
-    <w:proofErr w:type="spellEnd"/>
-    <w:r>
-      <w:rPr>
-        <w:rFonts w:ascii="Tahoma" w:hAnsi="Tahoma" w:cs="Tahoma"/>
-        <w:color w:val="101418"/>
-        <w:kern w:val="36"/>
-      </w:rPr>
-      <w:t xml:space="preserve"> </w:t>
-    </w:r>
-    <w:proofErr w:type="spellStart"/>
-    <w:r>
-      <w:rPr>
-        <w:rFonts w:ascii="Tahoma" w:hAnsi="Tahoma" w:cs="Tahoma"/>
-        <w:color w:val="101418"/>
-        <w:kern w:val="36"/>
-      </w:rPr>
-      <w:t>Skills</w:t>
-    </w:r>
-    <w:proofErr w:type="spellEnd"/>
-    <w:r>
-      <w:rPr>
-        <w:rFonts w:ascii="Tahoma" w:hAnsi="Tahoma" w:cs="Tahoma"/>
-        <w:color w:val="101418"/>
-        <w:kern w:val="36"/>
-      </w:rPr>
-      <w:t xml:space="preserve"> -</w:t>
+      <w:t>- Smart Creative Skills -</w:t>
     </w:r>
   </w:p>
   <w:p>
@@ -3829,8 +4059,18 @@
 </w:hdr>
 </file>
 
+<file path=word/header3.xml><?xml version="1.0" encoding="utf-8"?>
+<w:hdr xmlns:wpc="http://schemas.microsoft.com/office/word/2010/wordprocessingCanvas" xmlns:cx="http://schemas.microsoft.com/office/drawing/2014/chartex" xmlns:cx1="http://schemas.microsoft.com/office/drawing/2015/9/8/chartex" xmlns:cx2="http://schemas.microsoft.com/office/drawing/2015/10/21/chartex" xmlns:cx3="http://schemas.microsoft.com/office/drawing/2016/5/9/chartex" xmlns:cx4="http://schemas.microsoft.com/office/drawing/2016/5/10/chartex" xmlns:cx5="http://schemas.microsoft.com/office/drawing/2016/5/11/chartex" xmlns:cx6="http://schemas.microsoft.com/office/drawing/2016/5/12/chartex" xmlns:cx7="http://schemas.microsoft.com/office/drawing/2016/5/13/chartex" xmlns:cx8="http://schemas.microsoft.com/office/drawing/2016/5/14/chartex" xmlns:mc="http://schemas.openxmlformats.org/markup-compatibility/2006" xmlns:aink="http://schemas.microsoft.com/office/drawing/2016/ink" xmlns:am3d="http://schemas.microsoft.com/office/drawing/2017/model3d" xmlns:o="urn:schemas-microsoft-com:office:office" xmlns:oel="http://schemas.microsoft.com/office/2019/extlst" xmlns:r="http://schemas.openxmlformats.org/officeDocument/2006/relationships" xmlns:m="http://schemas.openxmlformats.org/officeDocument/2006/math" xmlns:v="urn:schemas-microsoft-com:vml" xmlns:wp14="http://schemas.microsoft.com/office/word/2010/wordprocessingDrawing" xmlns:wp="http://schemas.openxmlformats.org/drawingml/2006/wordprocessingDrawing" xmlns:w10="urn:schemas-microsoft-com:office:word" xmlns:w="http://schemas.openxmlformats.org/wordprocessingml/2006/main" xmlns:w14="http://schemas.microsoft.com/office/word/2010/wordml" xmlns:w15="http://schemas.microsoft.com/office/word/2012/wordml" xmlns:w16cei="http://schemas.microsoft.com/office/word/2026/wordml/cei" xmlns:w16cex="http://schemas.microsoft.com/office/word/2018/wordml/cex" xmlns:w16cid="http://schemas.microsoft.com/office/word/2016/wordml/cid" xmlns:w16="http://schemas.microsoft.com/office/word/2018/wordml" xmlns:w16du="http://schemas.microsoft.com/office/word/2023/wordml/word16du" xmlns:w16sdtdh="http://schemas.microsoft.com/office/word/2020/wordml/sdtdatahash" xmlns:w16sdtfl="http://schemas.microsoft.com/office/word/2024/wordml/sdtformatlock" xmlns:w16se="http://schemas.microsoft.com/office/word/2015/wordml/symex" xmlns:wpg="http://schemas.microsoft.com/office/word/2010/wordprocessingGroup" xmlns:wpi="http://schemas.microsoft.com/office/word/2010/wordprocessingInk" xmlns:wne="http://schemas.microsoft.com/office/word/2006/wordml" xmlns:wps="http://schemas.microsoft.com/office/word/2010/wordprocessingShape" mc:Ignorable="w14 w15 w16se w16cid w16 w16cex w16sdtdh w16sdtfl w16du wp14">
+  <w:p>
+    <w:pPr>
+      <w:pStyle w:val="Header"/>
+    </w:pPr>
+  </w:p>
+</w:hdr>
+</file>
+
 <file path=word/numbering.xml><?xml version="1.0" encoding="utf-8"?>
-<w:numbering xmlns:wpc="http://schemas.microsoft.com/office/word/2010/wordprocessingCanvas" xmlns:cx="http://schemas.microsoft.com/office/drawing/2014/chartex" xmlns:cx1="http://schemas.microsoft.com/office/drawing/2015/9/8/chartex" xmlns:cx2="http://schemas.microsoft.com/office/drawing/2015/10/21/chartex" xmlns:cx3="http://schemas.microsoft.com/office/drawing/2016/5/9/chartex" xmlns:cx4="http://schemas.microsoft.com/office/drawing/2016/5/10/chartex" xmlns:cx5="http://schemas.microsoft.com/office/drawing/2016/5/11/chartex" xmlns:cx6="http://schemas.microsoft.com/office/drawing/2016/5/12/chartex" xmlns:cx7="http://schemas.microsoft.com/office/drawing/2016/5/13/chartex" xmlns:cx8="http://schemas.microsoft.com/office/drawing/2016/5/14/chartex" xmlns:mc="http://schemas.openxmlformats.org/markup-compatibility/2006" xmlns:aink="http://schemas.microsoft.com/office/drawing/2016/ink" xmlns:am3d="http://schemas.microsoft.com/office/drawing/2017/model3d" xmlns:o="urn:schemas-microsoft-com:office:office" xmlns:oel="http://schemas.microsoft.com/office/2019/extlst" xmlns:r="http://schemas.openxmlformats.org/officeDocument/2006/relationships" xmlns:m="http://schemas.openxmlformats.org/officeDocument/2006/math" xmlns:v="urn:schemas-microsoft-com:vml" xmlns:wp14="http://schemas.microsoft.com/office/word/2010/wordprocessingDrawing" xmlns:wp="http://schemas.openxmlformats.org/drawingml/2006/wordprocessingDrawing" xmlns:w10="urn:schemas-microsoft-com:office:word" xmlns:w="http://schemas.openxmlformats.org/wordprocessingml/2006/main" xmlns:w14="http://schemas.microsoft.com/office/word/2010/wordml" xmlns:w15="http://schemas.microsoft.com/office/word/2012/wordml" xmlns:w16cex="http://schemas.microsoft.com/office/word/2018/wordml/cex" xmlns:w16cid="http://schemas.microsoft.com/office/word/2016/wordml/cid" xmlns:w16="http://schemas.microsoft.com/office/word/2018/wordml" xmlns:w16du="http://schemas.microsoft.com/office/word/2023/wordml/word16du" xmlns:w16sdtdh="http://schemas.microsoft.com/office/word/2020/wordml/sdtdatahash" xmlns:w16sdtfl="http://schemas.microsoft.com/office/word/2024/wordml/sdtformatlock" xmlns:w16se="http://schemas.microsoft.com/office/word/2015/wordml/symex" xmlns:wpg="http://schemas.microsoft.com/office/word/2010/wordprocessingGroup" xmlns:wpi="http://schemas.microsoft.com/office/word/2010/wordprocessingInk" xmlns:wne="http://schemas.microsoft.com/office/word/2006/wordml" xmlns:wps="http://schemas.microsoft.com/office/word/2010/wordprocessingShape" mc:Ignorable="w14 w15 w16se w16cid w16 w16cex w16sdtdh w16sdtfl w16du wp14">
+<w:numbering xmlns:wpc="http://schemas.microsoft.com/office/word/2010/wordprocessingCanvas" xmlns:cx="http://schemas.microsoft.com/office/drawing/2014/chartex" xmlns:cx1="http://schemas.microsoft.com/office/drawing/2015/9/8/chartex" xmlns:cx2="http://schemas.microsoft.com/office/drawing/2015/10/21/chartex" xmlns:cx3="http://schemas.microsoft.com/office/drawing/2016/5/9/chartex" xmlns:cx4="http://schemas.microsoft.com/office/drawing/2016/5/10/chartex" xmlns:cx5="http://schemas.microsoft.com/office/drawing/2016/5/11/chartex" xmlns:cx6="http://schemas.microsoft.com/office/drawing/2016/5/12/chartex" xmlns:cx7="http://schemas.microsoft.com/office/drawing/2016/5/13/chartex" xmlns:cx8="http://schemas.microsoft.com/office/drawing/2016/5/14/chartex" xmlns:mc="http://schemas.openxmlformats.org/markup-compatibility/2006" xmlns:aink="http://schemas.microsoft.com/office/drawing/2016/ink" xmlns:am3d="http://schemas.microsoft.com/office/drawing/2017/model3d" xmlns:o="urn:schemas-microsoft-com:office:office" xmlns:oel="http://schemas.microsoft.com/office/2019/extlst" xmlns:r="http://schemas.openxmlformats.org/officeDocument/2006/relationships" xmlns:m="http://schemas.openxmlformats.org/officeDocument/2006/math" xmlns:v="urn:schemas-microsoft-com:vml" xmlns:wp14="http://schemas.microsoft.com/office/word/2010/wordprocessingDrawing" xmlns:wp="http://schemas.openxmlformats.org/drawingml/2006/wordprocessingDrawing" xmlns:w10="urn:schemas-microsoft-com:office:word" xmlns:w="http://schemas.openxmlformats.org/wordprocessingml/2006/main" xmlns:w14="http://schemas.microsoft.com/office/word/2010/wordml" xmlns:w15="http://schemas.microsoft.com/office/word/2012/wordml" xmlns:w16cei="http://schemas.microsoft.com/office/word/2026/wordml/cei" xmlns:w16cex="http://schemas.microsoft.com/office/word/2018/wordml/cex" xmlns:w16cid="http://schemas.microsoft.com/office/word/2016/wordml/cid" xmlns:w16="http://schemas.microsoft.com/office/word/2018/wordml" xmlns:w16du="http://schemas.microsoft.com/office/word/2023/wordml/word16du" xmlns:w16sdtdh="http://schemas.microsoft.com/office/word/2020/wordml/sdtdatahash" xmlns:w16sdtfl="http://schemas.microsoft.com/office/word/2024/wordml/sdtformatlock" xmlns:w16se="http://schemas.microsoft.com/office/word/2015/wordml/symex" xmlns:wpg="http://schemas.microsoft.com/office/word/2010/wordprocessingGroup" xmlns:wpi="http://schemas.microsoft.com/office/word/2010/wordprocessingInk" xmlns:wne="http://schemas.microsoft.com/office/word/2006/wordml" xmlns:wps="http://schemas.microsoft.com/office/word/2010/wordprocessingShape" mc:Ignorable="w14 w15 w16se w16cid w16 w16cex w16sdtdh w16sdtfl w16du wp14">
   <w:abstractNum w:abstractNumId="0" w15:restartNumberingAfterBreak="0">
     <w:nsid w:val="181F2140"/>
     <w:multiLevelType w:val="hybridMultilevel"/>
@@ -4986,10 +5226,10 @@
       <w:lang w:val="id-ID"/>
     </w:rPr>
   </w:style>
-  <w:style w:type="paragraph" w:styleId="Judul1">
+  <w:style w:type="paragraph" w:styleId="Heading1">
     <w:name w:val="heading 1"/>
     <w:basedOn w:val="Normal"/>
-    <w:link w:val="Judul1KAR"/>
+    <w:link w:val="Heading1Char"/>
     <w:uiPriority w:val="9"/>
     <w:qFormat/>
     <w:rsid w:val="00830A25"/>
@@ -5006,13 +5246,13 @@
       <w:lang w:val="en-US"/>
     </w:rPr>
   </w:style>
-  <w:style w:type="character" w:default="1" w:styleId="FontParagrafDefault">
+  <w:style w:type="character" w:default="1" w:styleId="DefaultParagraphFont">
     <w:name w:val="Default Paragraph Font"/>
     <w:uiPriority w:val="1"/>
     <w:semiHidden/>
     <w:unhideWhenUsed/>
   </w:style>
-  <w:style w:type="table" w:default="1" w:styleId="TabelNormal">
+  <w:style w:type="table" w:default="1" w:styleId="TableNormal">
     <w:name w:val="Normal Table"/>
     <w:uiPriority w:val="99"/>
     <w:semiHidden/>
@@ -5027,7 +5267,7 @@
       </w:tblCellMar>
     </w:tblPr>
   </w:style>
-  <w:style w:type="numbering" w:default="1" w:styleId="TidakAdaDaftar">
+  <w:style w:type="numbering" w:default="1" w:styleId="NoList">
     <w:name w:val="No List"/>
     <w:uiPriority w:val="99"/>
     <w:semiHidden/>
@@ -5036,7 +5276,7 @@
   <w:style w:type="paragraph" w:styleId="Header">
     <w:name w:val="header"/>
     <w:basedOn w:val="Normal"/>
-    <w:link w:val="HeaderKAR"/>
+    <w:link w:val="HeaderChar"/>
     <w:rsid w:val="00736D39"/>
     <w:pPr>
       <w:tabs>
@@ -5045,9 +5285,9 @@
       </w:tabs>
     </w:pPr>
   </w:style>
-  <w:style w:type="character" w:customStyle="1" w:styleId="HeaderKAR">
-    <w:name w:val="Header KAR"/>
-    <w:basedOn w:val="FontParagrafDefault"/>
+  <w:style w:type="character" w:customStyle="1" w:styleId="HeaderChar">
+    <w:name w:val="Header Char"/>
+    <w:basedOn w:val="DefaultParagraphFont"/>
     <w:link w:val="Header"/>
     <w:rsid w:val="00736D39"/>
     <w:rPr>
@@ -5060,7 +5300,7 @@
   <w:style w:type="paragraph" w:styleId="Footer">
     <w:name w:val="footer"/>
     <w:basedOn w:val="Normal"/>
-    <w:link w:val="FooterKAR"/>
+    <w:link w:val="FooterChar"/>
     <w:rsid w:val="00736D39"/>
     <w:pPr>
       <w:tabs>
@@ -5069,9 +5309,9 @@
       </w:tabs>
     </w:pPr>
   </w:style>
-  <w:style w:type="character" w:customStyle="1" w:styleId="FooterKAR">
-    <w:name w:val="Footer KAR"/>
-    <w:basedOn w:val="FontParagrafDefault"/>
+  <w:style w:type="character" w:customStyle="1" w:styleId="FooterChar">
+    <w:name w:val="Footer Char"/>
+    <w:basedOn w:val="DefaultParagraphFont"/>
     <w:link w:val="Footer"/>
     <w:rsid w:val="00736D39"/>
     <w:rPr>
@@ -5081,7 +5321,7 @@
       <w:lang w:val="id-ID"/>
     </w:rPr>
   </w:style>
-  <w:style w:type="paragraph" w:styleId="DaftarParagraf">
+  <w:style w:type="paragraph" w:styleId="ListParagraph">
     <w:name w:val="List Paragraph"/>
     <w:basedOn w:val="Normal"/>
     <w:uiPriority w:val="34"/>
@@ -5100,10 +5340,10 @@
       <w:lang w:eastAsia="zh-CN"/>
     </w:rPr>
   </w:style>
-  <w:style w:type="paragraph" w:styleId="TeksBalon">
+  <w:style w:type="paragraph" w:styleId="BalloonText">
     <w:name w:val="Balloon Text"/>
     <w:basedOn w:val="Normal"/>
-    <w:link w:val="TeksBalonKAR"/>
+    <w:link w:val="BalloonTextChar"/>
     <w:uiPriority w:val="99"/>
     <w:semiHidden/>
     <w:unhideWhenUsed/>
@@ -5114,10 +5354,10 @@
       <w:szCs w:val="16"/>
     </w:rPr>
   </w:style>
-  <w:style w:type="character" w:customStyle="1" w:styleId="TeksBalonKAR">
-    <w:name w:val="Teks Balon KAR"/>
-    <w:basedOn w:val="FontParagrafDefault"/>
-    <w:link w:val="TeksBalon"/>
+  <w:style w:type="character" w:customStyle="1" w:styleId="BalloonTextChar">
+    <w:name w:val="Balloon Text Char"/>
+    <w:basedOn w:val="DefaultParagraphFont"/>
+    <w:link w:val="BalloonText"/>
     <w:uiPriority w:val="99"/>
     <w:semiHidden/>
     <w:rsid w:val="00736D39"/>
@@ -5128,10 +5368,10 @@
       <w:lang w:val="id-ID"/>
     </w:rPr>
   </w:style>
-  <w:style w:type="character" w:customStyle="1" w:styleId="Judul1KAR">
-    <w:name w:val="Judul 1 KAR"/>
-    <w:basedOn w:val="FontParagrafDefault"/>
-    <w:link w:val="Judul1"/>
+  <w:style w:type="character" w:customStyle="1" w:styleId="Heading1Char">
+    <w:name w:val="Heading 1 Char"/>
+    <w:basedOn w:val="DefaultParagraphFont"/>
+    <w:link w:val="Heading1"/>
     <w:uiPriority w:val="9"/>
     <w:rsid w:val="00830A25"/>
     <w:rPr>
@@ -5145,7 +5385,7 @@
   </w:style>
   <w:style w:type="character" w:customStyle="1" w:styleId="mw-page-title-main">
     <w:name w:val="mw-page-title-main"/>
-    <w:basedOn w:val="FontParagrafDefault"/>
+    <w:basedOn w:val="DefaultParagraphFont"/>
     <w:rsid w:val="00830A25"/>
   </w:style>
 </w:styles>

</xml_diff>

<commit_message>
fix: update 20 lesson plans with correct Smart Farming content using Desainer Grafis Muda master layout
</commit_message>
<xml_diff>
--- a/documents/Lesson_Plan_Pertemuan_01.docx
+++ b/documents/Lesson_Plan_Pertemuan_01.docx
@@ -1651,7 +1651,15 @@
           </w:tcPr>
           <w:p>
             <w:r>
-              <w:t>Instruktur menjelaskan terkait K3 pertanian, potensi bahaya kelistrikan alat IoT, dan penggunaan APD.</w:t>
+              <w:t>Instruktur menjelaskan kepada peserta terkait:</w:t>
+              <w:br/>
+              <w:t>- Dasar-dasar K3 di lahan pertanian modern</w:t>
+              <w:br/>
+              <w:t>- Potensi bahaya kelistrikan pada perangkat otomatisasi dan IoT</w:t>
+              <w:br/>
+              <w:t>- Pengenalan Alat Pelindung Diri (APD) standar</w:t>
+              <w:br/>
+              <w:t>Instruktur menanyakan kepada peserta apakah materi yang disampaikan telah dipahami dan memberikan kesempatan untuk bertanya</w:t>
             </w:r>
           </w:p>
         </w:tc>

</xml_diff>

<commit_message>
fix: generate 20 lesson plans using clean pristine template from Google Drive
</commit_message>
<xml_diff>
--- a/documents/Lesson_Plan_Pertemuan_01.docx
+++ b/documents/Lesson_Plan_Pertemuan_01.docx
@@ -232,9 +232,6 @@
                 <w:szCs w:val="22"/>
               </w:rPr>
             </w:pPr>
-            <w:r>
-              <w:t xml:space="preserve">Teknologi Informasi dan Komunikasi (TIK)</w:t>
-            </w:r>
           </w:p>
         </w:tc>
       </w:tr>
@@ -379,9 +376,6 @@
                 <w:szCs w:val="22"/>
               </w:rPr>
             </w:pPr>
-            <w:r>
-              <w:t xml:space="preserve">6</w:t>
-            </w:r>
           </w:p>
         </w:tc>
       </w:tr>
@@ -526,9 +520,6 @@
                 <w:szCs w:val="22"/>
               </w:rPr>
             </w:pPr>
-            <w:r>
-              <w:t xml:space="preserve">180 menit</w:t>
-            </w:r>
           </w:p>
         </w:tc>
       </w:tr>
@@ -553,7 +544,7 @@
           </w:tcPr>
           <w:p>
             <w:r>
-              <w:t>Peserta kompeten dalam memahami dan menerapkan prosedur K3 serta keselamatan kelistrikan pada perangkat pertanian modern.</w:t>
+              <w:t>Tujuan Pembelajaran : Peserta kompeten dalam memahami dan menerapkan prosedur K3 serta keselamatan kelistrikan pada perangkat pertanian modern.</w:t>
             </w:r>
           </w:p>
         </w:tc>
@@ -573,8 +564,24 @@
             </w:tcBorders>
           </w:tcPr>
           <w:p>
+            <w:pPr>
+              <w:spacing w:before="120"/>
+              <w:jc w:val="both"/>
+              <w:rPr>
+                <w:rFonts w:ascii="Tahoma" w:eastAsia="Tahoma" w:hAnsi="Tahoma" w:cs="Tahoma"/>
+                <w:b/>
+                <w:sz w:val="22"/>
+                <w:szCs w:val="22"/>
+              </w:rPr>
+            </w:pPr>
             <w:r>
-              <w:t>Ceramah / Demonstrasi / Praktikum</w:t>
+              <w:rPr>
+                <w:rFonts w:ascii="Tahoma" w:eastAsia="Tahoma" w:hAnsi="Tahoma" w:cs="Tahoma"/>
+                <w:b/>
+                <w:sz w:val="22"/>
+                <w:szCs w:val="22"/>
+              </w:rPr>
+              <w:t>Metode Mengajar</w:t>
             </w:r>
           </w:p>
         </w:tc>
@@ -606,63 +613,6 @@
                 <w:szCs w:val="22"/>
               </w:rPr>
             </w:pPr>
-            <w:r>
-              <w:t xml:space="preserve">Ceramah</w:t>
-            </w:r>
-          </w:p>
-          <w:p>
-            <w:pPr>
-              <w:numPr>
-                <w:ilvl w:val="0"/>
-                <w:numId w:val="2"/>
-              </w:numPr>
-              <w:pBdr>
-                <w:top w:val="nil"/>
-                <w:left w:val="nil"/>
-                <w:bottom w:val="nil"/>
-                <w:right w:val="nil"/>
-                <w:between w:val="nil"/>
-              </w:pBdr>
-              <w:spacing w:after="120"/>
-              <w:ind w:left="294" w:hanging="284"/>
-              <w:jc w:val="both"/>
-              <w:rPr>
-                <w:rFonts w:ascii="Tahoma" w:eastAsia="Tahoma" w:hAnsi="Tahoma" w:cs="Tahoma"/>
-                <w:color w:val="000000" w:themeColor="text1"/>
-                <w:sz w:val="22"/>
-                <w:szCs w:val="22"/>
-              </w:rPr>
-            </w:pPr>
-            <w:r>
-              <w:t xml:space="preserve">Praktikum</w:t>
-            </w:r>
-          </w:p>
-          <w:p>
-            <w:pPr>
-              <w:numPr>
-                <w:ilvl w:val="0"/>
-                <w:numId w:val="2"/>
-              </w:numPr>
-              <w:pBdr>
-                <w:top w:val="nil"/>
-                <w:left w:val="nil"/>
-                <w:bottom w:val="nil"/>
-                <w:right w:val="nil"/>
-                <w:between w:val="nil"/>
-              </w:pBdr>
-              <w:spacing w:after="120"/>
-              <w:ind w:left="294" w:hanging="284"/>
-              <w:jc w:val="both"/>
-              <w:rPr>
-                <w:rFonts w:ascii="Tahoma" w:eastAsia="Tahoma" w:hAnsi="Tahoma" w:cs="Tahoma"/>
-                <w:color w:val="000000" w:themeColor="text1"/>
-                <w:sz w:val="22"/>
-                <w:szCs w:val="22"/>
-              </w:rPr>
-            </w:pPr>
-            <w:r>
-              <w:t xml:space="preserve">Diskusi</w:t>
-            </w:r>
           </w:p>
         </w:tc>
       </w:tr>
@@ -679,9 +629,53 @@
             <w:vMerge w:val="restart"/>
           </w:tcPr>
           <w:p>
+            <w:pPr>
+              <w:spacing w:before="120"/>
+              <w:jc w:val="both"/>
+              <w:rPr>
+                <w:rFonts w:ascii="Tahoma" w:eastAsia="Tahoma" w:hAnsi="Tahoma" w:cs="Tahoma"/>
+                <w:b/>
+                <w:sz w:val="22"/>
+                <w:szCs w:val="22"/>
+              </w:rPr>
+            </w:pPr>
             <w:r>
-              <w:t>Power Point, Video Tutorial, Diagram Arsitektur IoT</w:t>
+              <w:rPr>
+                <w:rFonts w:ascii="Tahoma" w:eastAsia="Tahoma" w:hAnsi="Tahoma" w:cs="Tahoma"/>
+                <w:b/>
+                <w:sz w:val="22"/>
+                <w:szCs w:val="22"/>
+              </w:rPr>
+              <w:t>Media Pembelajaran</w:t>
             </w:r>
+          </w:p>
+          <w:p>
+            <w:pPr>
+              <w:jc w:val="both"/>
+              <w:rPr>
+                <w:rFonts w:ascii="Tahoma" w:eastAsia="Tahoma" w:hAnsi="Tahoma" w:cs="Tahoma"/>
+                <w:sz w:val="22"/>
+                <w:szCs w:val="22"/>
+              </w:rPr>
+            </w:pPr>
+            <w:r>
+              <w:rPr>
+                <w:rFonts w:ascii="Tahoma" w:eastAsia="Tahoma" w:hAnsi="Tahoma" w:cs="Tahoma"/>
+                <w:sz w:val="22"/>
+                <w:szCs w:val="22"/>
+              </w:rPr>
+              <w:t>(Media, Alat, Bahan)</w:t>
+            </w:r>
+          </w:p>
+          <w:p>
+            <w:pPr>
+              <w:jc w:val="both"/>
+              <w:rPr>
+                <w:rFonts w:ascii="Tahoma" w:eastAsia="Tahoma" w:hAnsi="Tahoma" w:cs="Tahoma"/>
+                <w:sz w:val="22"/>
+                <w:szCs w:val="22"/>
+              </w:rPr>
+            </w:pPr>
           </w:p>
         </w:tc>
         <w:tc>
@@ -709,9 +703,71 @@
               </w:rPr>
             </w:pPr>
             <w:r>
-              <w:t xml:space="preserve">Media</w:t>
+              <w:rPr>
+                <w:rFonts w:ascii="Tahoma" w:eastAsia="Tahoma" w:hAnsi="Tahoma" w:cs="Tahoma"/>
+                <w:color w:val="000000" w:themeColor="text1"/>
+                <w:sz w:val="22"/>
+                <w:szCs w:val="22"/>
+              </w:rPr>
+              <w:t>Media</w:t>
             </w:r>
           </w:p>
+          <w:p>
+            <w:pPr>
+              <w:numPr>
+                <w:ilvl w:val="0"/>
+                <w:numId w:val="3"/>
+              </w:numPr>
+              <w:pBdr>
+                <w:top w:val="nil"/>
+                <w:left w:val="nil"/>
+                <w:bottom w:val="nil"/>
+                <w:right w:val="nil"/>
+                <w:between w:val="nil"/>
+              </w:pBdr>
+              <w:spacing w:after="120" w:line="276" w:lineRule="auto"/>
+              <w:ind w:left="294" w:hanging="242"/>
+              <w:jc w:val="both"/>
+              <w:rPr>
+                <w:rFonts w:ascii="Tahoma" w:eastAsia="Tahoma" w:hAnsi="Tahoma" w:cs="Tahoma"/>
+                <w:color w:val="000000" w:themeColor="text1"/>
+                <w:sz w:val="22"/>
+                <w:szCs w:val="22"/>
+              </w:rPr>
+            </w:pPr>
+          </w:p>
+        </w:tc>
+      </w:tr>
+      <w:tr>
+        <w:trPr>
+          <w:gridAfter w:val="1"/>
+          <w:wAfter w:w="10" w:type="dxa"/>
+          <w:trHeight w:val="754"/>
+        </w:trPr>
+        <w:tc>
+          <w:tcPr>
+            <w:tcW w:w="2665" w:type="dxa"/>
+            <w:gridSpan w:val="3"/>
+            <w:vMerge/>
+          </w:tcPr>
+          <w:p>
+            <w:pPr>
+              <w:spacing w:before="120"/>
+              <w:jc w:val="both"/>
+              <w:rPr>
+                <w:rFonts w:ascii="Tahoma" w:eastAsia="Tahoma" w:hAnsi="Tahoma" w:cs="Tahoma"/>
+                <w:b/>
+                <w:sz w:val="22"/>
+                <w:szCs w:val="22"/>
+              </w:rPr>
+            </w:pPr>
+          </w:p>
+        </w:tc>
+        <w:tc>
+          <w:tcPr>
+            <w:tcW w:w="7189" w:type="dxa"/>
+            <w:gridSpan w:val="6"/>
+          </w:tcPr>
           <w:p>
             <w:pPr>
               <w:pBdr>
@@ -732,9 +788,74 @@
               </w:rPr>
             </w:pPr>
             <w:r>
-              <w:t xml:space="preserve">Power Point</w:t>
+              <w:rPr>
+                <w:rFonts w:ascii="Tahoma" w:eastAsia="Tahoma" w:hAnsi="Tahoma" w:cs="Tahoma"/>
+                <w:color w:val="000000" w:themeColor="text1"/>
+                <w:sz w:val="22"/>
+                <w:szCs w:val="22"/>
+              </w:rPr>
+              <w:t>Alat</w:t>
             </w:r>
           </w:p>
+          <w:p>
+            <w:pPr>
+              <w:numPr>
+                <w:ilvl w:val="0"/>
+                <w:numId w:val="7"/>
+              </w:numPr>
+              <w:pBdr>
+                <w:top w:val="nil"/>
+                <w:left w:val="nil"/>
+                <w:bottom w:val="nil"/>
+                <w:right w:val="nil"/>
+                <w:between w:val="nil"/>
+              </w:pBdr>
+              <w:spacing w:after="120" w:line="276" w:lineRule="auto"/>
+              <w:ind w:left="294" w:hanging="242"/>
+              <w:jc w:val="both"/>
+              <w:rPr>
+                <w:rFonts w:ascii="Tahoma" w:eastAsia="Tahoma" w:hAnsi="Tahoma" w:cs="Tahoma"/>
+                <w:color w:val="000000" w:themeColor="text1"/>
+                <w:sz w:val="22"/>
+                <w:szCs w:val="22"/>
+              </w:rPr>
+            </w:pPr>
+          </w:p>
+        </w:tc>
+      </w:tr>
+      <w:tr>
+        <w:trPr>
+          <w:gridAfter w:val="1"/>
+          <w:wAfter w:w="10" w:type="dxa"/>
+          <w:trHeight w:val="754"/>
+        </w:trPr>
+        <w:tc>
+          <w:tcPr>
+            <w:tcW w:w="2665" w:type="dxa"/>
+            <w:gridSpan w:val="3"/>
+            <w:vMerge/>
+            <w:tcBorders>
+              <w:bottom w:val="nil"/>
+            </w:tcBorders>
+          </w:tcPr>
+          <w:p>
+            <w:pPr>
+              <w:spacing w:before="120"/>
+              <w:jc w:val="both"/>
+              <w:rPr>
+                <w:rFonts w:ascii="Tahoma" w:eastAsia="Tahoma" w:hAnsi="Tahoma" w:cs="Tahoma"/>
+                <w:b/>
+                <w:sz w:val="22"/>
+                <w:szCs w:val="22"/>
+              </w:rPr>
+            </w:pPr>
+          </w:p>
+        </w:tc>
+        <w:tc>
+          <w:tcPr>
+            <w:tcW w:w="7189" w:type="dxa"/>
+            <w:gridSpan w:val="6"/>
+          </w:tcPr>
           <w:p>
             <w:pPr>
               <w:pBdr>
@@ -755,85 +876,38 @@
               </w:rPr>
             </w:pPr>
             <w:r>
-              <w:t xml:space="preserve">Gambar dan Video</w:t>
+              <w:rPr>
+                <w:rFonts w:ascii="Tahoma" w:eastAsia="Tahoma" w:hAnsi="Tahoma" w:cs="Tahoma"/>
+                <w:color w:val="000000" w:themeColor="text1"/>
+                <w:sz w:val="22"/>
+                <w:szCs w:val="22"/>
+              </w:rPr>
+              <w:t>Bahan</w:t>
             </w:r>
           </w:p>
-        </w:tc>
-      </w:tr>
-      <w:tr>
-        <w:trPr>
-          <w:gridAfter w:val="1"/>
-          <w:wAfter w:w="10" w:type="dxa"/>
-          <w:trHeight w:val="754"/>
-        </w:trPr>
-        <w:tc>
-          <w:tcPr>
-            <w:tcW w:w="2665" w:type="dxa"/>
-            <w:gridSpan w:val="3"/>
-            <w:vMerge/>
-          </w:tcPr>
-          <w:p>
-            <w:pPr>
-              <w:spacing w:before="120"/>
+          <w:p>
+            <w:pPr>
+              <w:numPr>
+                <w:ilvl w:val="0"/>
+                <w:numId w:val="8"/>
+              </w:numPr>
+              <w:pBdr>
+                <w:top w:val="nil"/>
+                <w:left w:val="nil"/>
+                <w:bottom w:val="nil"/>
+                <w:right w:val="nil"/>
+                <w:between w:val="nil"/>
+              </w:pBdr>
+              <w:spacing w:after="120" w:line="276" w:lineRule="auto"/>
+              <w:ind w:left="294" w:hanging="242"/>
               <w:jc w:val="both"/>
               <w:rPr>
                 <w:rFonts w:ascii="Tahoma" w:eastAsia="Tahoma" w:hAnsi="Tahoma" w:cs="Tahoma"/>
-                <w:b/>
-                <w:sz w:val="22"/>
-                <w:szCs w:val="22"/>
-              </w:rPr>
-            </w:pPr>
-          </w:p>
-        </w:tc>
-        <w:tc>
-          <w:tcPr>
-            <w:tcW w:w="7189" w:type="dxa"/>
-            <w:gridSpan w:val="6"/>
-          </w:tcPr>
-          <w:p>
-            <w:r>
-              <w:t>Proyektor, Kit Mikrokontroler ESP32, Sensor &amp; Aktuator Pertanian, Multimeter</w:t>
-            </w:r>
-          </w:p>
-        </w:tc>
-      </w:tr>
-      <w:tr>
-        <w:trPr>
-          <w:gridAfter w:val="1"/>
-          <w:wAfter w:w="10" w:type="dxa"/>
-          <w:trHeight w:val="754"/>
-        </w:trPr>
-        <w:tc>
-          <w:tcPr>
-            <w:tcW w:w="2665" w:type="dxa"/>
-            <w:gridSpan w:val="3"/>
-            <w:vMerge/>
-            <w:tcBorders>
-              <w:bottom w:val="nil"/>
-            </w:tcBorders>
-          </w:tcPr>
-          <w:p>
-            <w:pPr>
-              <w:spacing w:before="120"/>
-              <w:jc w:val="both"/>
-              <w:rPr>
-                <w:rFonts w:ascii="Tahoma" w:eastAsia="Tahoma" w:hAnsi="Tahoma" w:cs="Tahoma"/>
-                <w:b/>
-                <w:sz w:val="22"/>
-                <w:szCs w:val="22"/>
-              </w:rPr>
-            </w:pPr>
-          </w:p>
-        </w:tc>
-        <w:tc>
-          <w:tcPr>
-            <w:tcW w:w="7189" w:type="dxa"/>
-            <w:gridSpan w:val="6"/>
-          </w:tcPr>
-          <w:p>
-            <w:r>
-              <w:t>Flashdisk, Modul Pelatihan, Lembar Jobsheet</w:t>
-            </w:r>
+                <w:color w:val="000000" w:themeColor="text1"/>
+                <w:sz w:val="22"/>
+                <w:szCs w:val="22"/>
+              </w:rPr>
+            </w:pPr>
           </w:p>
         </w:tc>
       </w:tr>
@@ -875,17 +949,21 @@
             <w:gridSpan w:val="6"/>
           </w:tcPr>
           <w:p>
-            <w:r>
-              <w:t>1. Memberi salam dan memperkenalkan diri</w:t>
-              <w:br/>
-              <w:t>2. Mengabsen peserta pelatihan</w:t>
-              <w:br/>
-              <w:t>3. Menjelaskan safety induction lab TIK dan aturan keselamatan</w:t>
-              <w:br/>
-              <w:t>4. Mengadakan apersepsi terkait materi</w:t>
-              <w:br/>
-              <w:t>5. Menyampaikan judul unit dan tujuan pembelajaran</w:t>
-            </w:r>
+            <w:pPr>
+              <w:numPr>
+                <w:ilvl w:val="0"/>
+                <w:numId w:val="5"/>
+              </w:numPr>
+              <w:spacing w:after="120" w:line="276" w:lineRule="auto"/>
+              <w:ind w:left="294" w:hanging="284"/>
+              <w:jc w:val="both"/>
+              <w:rPr>
+                <w:rFonts w:ascii="Tahoma" w:eastAsia="Tahoma" w:hAnsi="Tahoma" w:cs="Tahoma"/>
+                <w:color w:val="000000" w:themeColor="text1"/>
+                <w:sz w:val="22"/>
+                <w:szCs w:val="22"/>
+              </w:rPr>
+            </w:pPr>
           </w:p>
         </w:tc>
       </w:tr>
@@ -940,79 +1018,12 @@
               </w:rPr>
             </w:pPr>
             <w:r>
-              <w:t xml:space="preserve">1. Memberi salam dan Memperkenalkan diri</w:t>
-            </w:r>
-          </w:p>
-          <w:p>
-            <w:pPr>
-              <w:rPr>
-                <w:rFonts w:ascii="Tahoma" w:eastAsia="Tahoma" w:hAnsi="Tahoma" w:cs="Tahoma"/>
-                <w:sz w:val="22"/>
-                <w:szCs w:val="22"/>
-              </w:rPr>
-            </w:pPr>
-            <w:r>
-              <w:t xml:space="preserve">2. Mengabsen peserta pelatihan</w:t>
-            </w:r>
-          </w:p>
-          <w:p>
-            <w:pPr>
-              <w:rPr>
-                <w:rFonts w:ascii="Tahoma" w:eastAsia="Tahoma" w:hAnsi="Tahoma" w:cs="Tahoma"/>
-                <w:sz w:val="22"/>
-                <w:szCs w:val="22"/>
-              </w:rPr>
-            </w:pPr>
-            <w:r>
-              <w:t xml:space="preserve">3. Menjelaskan safety induction dan rules</w:t>
-            </w:r>
-          </w:p>
-          <w:p>
-            <w:pPr>
-              <w:rPr>
-                <w:rFonts w:ascii="Tahoma" w:eastAsia="Tahoma" w:hAnsi="Tahoma" w:cs="Tahoma"/>
-                <w:sz w:val="22"/>
-                <w:szCs w:val="22"/>
-              </w:rPr>
-            </w:pPr>
-            <w:r>
-              <w:t xml:space="preserve">4. Mengadakan apersepsi</w:t>
-            </w:r>
-          </w:p>
-          <w:p>
-            <w:pPr>
-              <w:rPr>
-                <w:rFonts w:ascii="Tahoma" w:eastAsia="Tahoma" w:hAnsi="Tahoma" w:cs="Tahoma"/>
-                <w:sz w:val="22"/>
-                <w:szCs w:val="22"/>
-              </w:rPr>
-            </w:pPr>
-            <w:r>
-              <w:t xml:space="preserve">5. Menyampaikan judul</w:t>
-            </w:r>
-          </w:p>
-          <w:p>
-            <w:pPr>
-              <w:rPr>
-                <w:rFonts w:ascii="Tahoma" w:eastAsia="Tahoma" w:hAnsi="Tahoma" w:cs="Tahoma"/>
-                <w:sz w:val="22"/>
-                <w:szCs w:val="22"/>
-              </w:rPr>
-            </w:pPr>
-            <w:r>
-              <w:t xml:space="preserve">6. Roadmap pelatihan</w:t>
-            </w:r>
-          </w:p>
-          <w:p>
-            <w:pPr>
-              <w:rPr>
-                <w:rFonts w:ascii="Tahoma" w:eastAsia="Tahoma" w:hAnsi="Tahoma" w:cs="Tahoma"/>
-                <w:sz w:val="22"/>
-                <w:szCs w:val="22"/>
-              </w:rPr>
-            </w:pPr>
-            <w:r>
-              <w:t xml:space="preserve">7. Menyampaikan tujuan dan manfaat belajar</w:t>
+              <w:rPr>
+                <w:rFonts w:ascii="Tahoma" w:eastAsia="Tahoma" w:hAnsi="Tahoma" w:cs="Tahoma"/>
+                <w:sz w:val="22"/>
+                <w:szCs w:val="22"/>
+              </w:rPr>
+              <w:t>1</w:t>
             </w:r>
           </w:p>
         </w:tc>
@@ -1114,9 +1125,6 @@
                 <w:szCs w:val="22"/>
               </w:rPr>
             </w:pPr>
-            <w:r>
-              <w:t xml:space="preserve">10 menit</w:t>
-            </w:r>
           </w:p>
         </w:tc>
       </w:tr>
@@ -1372,7 +1380,22 @@
               </w:rPr>
             </w:pPr>
             <w:r>
-              <w:t xml:space="preserve">Perkiraan Waktu</w:t>
+              <w:rPr>
+                <w:rFonts w:ascii="Tahoma" w:eastAsia="Tahoma" w:hAnsi="Tahoma" w:cs="Tahoma"/>
+                <w:b/>
+                <w:sz w:val="22"/>
+                <w:szCs w:val="22"/>
+              </w:rPr>
+              <w:t>Perkiraan Waktu</w:t>
+            </w:r>
+            <w:r>
+              <w:rPr>
+                <w:rFonts w:ascii="Tahoma" w:eastAsia="Tahoma" w:hAnsi="Tahoma" w:cs="Tahoma"/>
+                <w:i/>
+                <w:sz w:val="22"/>
+                <w:szCs w:val="22"/>
+              </w:rPr>
+              <w:t xml:space="preserve"> </w:t>
             </w:r>
           </w:p>
         </w:tc>
@@ -1389,9 +1412,72 @@
             <w:gridSpan w:val="3"/>
           </w:tcPr>
           <w:p>
+            <w:pPr>
+              <w:pStyle w:val="ListParagraph"/>
+              <w:numPr>
+                <w:ilvl w:val="3"/>
+                <w:numId w:val="5"/>
+              </w:numPr>
+              <w:spacing w:before="60"/>
+              <w:ind w:left="292"/>
+              <w:rPr>
+                <w:rFonts w:ascii="Tahoma" w:eastAsia="Tahoma" w:hAnsi="Tahoma" w:cs="Tahoma"/>
+                <w:b/>
+              </w:rPr>
+            </w:pPr>
             <w:r>
-              <w:t>Power Point &amp; Alat Praktik</w:t>
+              <w:rPr>
+                <w:rFonts w:ascii="Tahoma" w:eastAsia="Tahoma" w:hAnsi="Tahoma" w:cs="Tahoma"/>
+                <w:b/>
+              </w:rPr>
+              <w:t>Dasar-dasar Copywriting</w:t>
             </w:r>
+          </w:p>
+          <w:p>
+            <w:pPr>
+              <w:spacing w:before="60"/>
+              <w:rPr>
+                <w:rFonts w:ascii="Tahoma" w:eastAsia="Tahoma" w:hAnsi="Tahoma" w:cs="Tahoma"/>
+                <w:b/>
+              </w:rPr>
+            </w:pPr>
+          </w:p>
+          <w:p>
+            <w:pPr>
+              <w:spacing w:before="60"/>
+              <w:rPr>
+                <w:rFonts w:ascii="Tahoma" w:eastAsia="Tahoma" w:hAnsi="Tahoma" w:cs="Tahoma"/>
+                <w:b/>
+              </w:rPr>
+            </w:pPr>
+          </w:p>
+          <w:p>
+            <w:pPr>
+              <w:spacing w:before="60"/>
+              <w:rPr>
+                <w:rFonts w:ascii="Tahoma" w:eastAsia="Tahoma" w:hAnsi="Tahoma" w:cs="Tahoma"/>
+                <w:b/>
+              </w:rPr>
+            </w:pPr>
+          </w:p>
+          <w:p>
+            <w:pPr>
+              <w:spacing w:before="60"/>
+              <w:rPr>
+                <w:rFonts w:ascii="Tahoma" w:eastAsia="Tahoma" w:hAnsi="Tahoma" w:cs="Tahoma"/>
+                <w:b/>
+              </w:rPr>
+            </w:pPr>
+          </w:p>
+          <w:p>
+            <w:pPr>
+              <w:pStyle w:val="ListParagraph"/>
+              <w:spacing w:before="60"/>
+              <w:rPr>
+                <w:rFonts w:ascii="Tahoma" w:eastAsia="Tahoma" w:hAnsi="Tahoma" w:cs="Tahoma"/>
+                <w:b/>
+              </w:rPr>
+            </w:pPr>
           </w:p>
         </w:tc>
         <w:tc>
@@ -1400,9 +1486,26 @@
             <w:gridSpan w:val="2"/>
           </w:tcPr>
           <w:p>
-            <w:r>
-              <w:t>35 menit</w:t>
-            </w:r>
+            <w:pPr>
+              <w:pStyle w:val="ListParagraph"/>
+              <w:numPr>
+                <w:ilvl w:val="0"/>
+                <w:numId w:val="4"/>
+              </w:numPr>
+              <w:pBdr>
+                <w:top w:val="nil"/>
+                <w:left w:val="nil"/>
+                <w:bottom w:val="nil"/>
+                <w:right w:val="nil"/>
+                <w:between w:val="nil"/>
+              </w:pBdr>
+              <w:spacing w:before="60"/>
+              <w:ind w:left="171" w:right="89" w:hanging="283"/>
+              <w:rPr>
+                <w:rFonts w:ascii="Tahoma" w:eastAsia="Tahoma" w:hAnsi="Tahoma" w:cs="Tahoma"/>
+                <w:color w:val="000000"/>
+              </w:rPr>
+            </w:pPr>
           </w:p>
         </w:tc>
         <w:tc>
@@ -1428,31 +1531,6 @@
                 <w:szCs w:val="22"/>
               </w:rPr>
             </w:pPr>
-            <w:r>
-              <w:t xml:space="preserve">Power Point</w:t>
-            </w:r>
-          </w:p>
-          <w:p>
-            <w:pPr>
-              <w:pBdr>
-                <w:top w:val="nil"/>
-                <w:left w:val="nil"/>
-                <w:bottom w:val="nil"/>
-                <w:right w:val="nil"/>
-                <w:between w:val="nil"/>
-              </w:pBdr>
-              <w:spacing w:before="60" w:line="276" w:lineRule="auto"/>
-              <w:ind w:left="253" w:right="89"/>
-              <w:rPr>
-                <w:rFonts w:ascii="Tahoma" w:eastAsia="Tahoma" w:hAnsi="Tahoma" w:cs="Tahoma"/>
-                <w:color w:val="000000"/>
-                <w:sz w:val="22"/>
-                <w:szCs w:val="22"/>
-              </w:rPr>
-            </w:pPr>
-            <w:r>
-              <w:t xml:space="preserve">Gambar dan Video</w:t>
-            </w:r>
           </w:p>
         </w:tc>
         <w:tc>
@@ -1469,9 +1547,6 @@
                 <w:szCs w:val="22"/>
               </w:rPr>
             </w:pPr>
-            <w:r>
-              <w:t xml:space="preserve">35 menit</w:t>
-            </w:r>
           </w:p>
         </w:tc>
       </w:tr>
@@ -1487,104 +1562,6 @@
             <w:gridSpan w:val="3"/>
           </w:tcPr>
           <w:p>
-            <w:r>
-              <w:t>Kit ESP32 &amp; Jobsheet</w:t>
-            </w:r>
-          </w:p>
-        </w:tc>
-        <w:tc>
-          <w:tcPr>
-            <w:tcW w:w="3543" w:type="dxa"/>
-            <w:gridSpan w:val="2"/>
-          </w:tcPr>
-          <w:p>
-            <w:r>
-              <w:t>75 menit</w:t>
-            </w:r>
-          </w:p>
-        </w:tc>
-        <w:tc>
-          <w:tcPr>
-            <w:tcW w:w="1796" w:type="dxa"/>
-            <w:gridSpan w:val="3"/>
-          </w:tcPr>
-          <w:p>
-            <w:pPr>
-              <w:pBdr>
-                <w:top w:val="nil"/>
-                <w:left w:val="nil"/>
-                <w:bottom w:val="nil"/>
-                <w:right w:val="nil"/>
-                <w:between w:val="nil"/>
-              </w:pBdr>
-              <w:spacing w:before="60" w:line="276" w:lineRule="auto"/>
-              <w:ind w:left="253" w:right="89"/>
-              <w:rPr>
-                <w:rFonts w:ascii="Tahoma" w:eastAsia="Tahoma" w:hAnsi="Tahoma" w:cs="Tahoma"/>
-                <w:color w:val="000000"/>
-                <w:sz w:val="22"/>
-                <w:szCs w:val="22"/>
-              </w:rPr>
-            </w:pPr>
-            <w:r>
-              <w:t xml:space="preserve">Power Point</w:t>
-            </w:r>
-          </w:p>
-          <w:p>
-            <w:pPr>
-              <w:pBdr>
-                <w:top w:val="nil"/>
-                <w:left w:val="nil"/>
-                <w:bottom w:val="nil"/>
-                <w:right w:val="nil"/>
-                <w:between w:val="nil"/>
-              </w:pBdr>
-              <w:spacing w:before="60" w:line="276" w:lineRule="auto"/>
-              <w:ind w:left="253" w:right="89"/>
-              <w:rPr>
-                <w:rFonts w:ascii="Tahoma" w:eastAsia="Tahoma" w:hAnsi="Tahoma" w:cs="Tahoma"/>
-                <w:color w:val="000000"/>
-                <w:sz w:val="22"/>
-                <w:szCs w:val="22"/>
-              </w:rPr>
-            </w:pPr>
-            <w:r>
-              <w:t xml:space="preserve">Gambar dan Video</w:t>
-            </w:r>
-          </w:p>
-        </w:tc>
-        <w:tc>
-          <w:tcPr>
-            <w:tcW w:w="1850" w:type="dxa"/>
-          </w:tcPr>
-          <w:p>
-            <w:pPr>
-              <w:spacing w:before="60"/>
-              <w:jc w:val="center"/>
-              <w:rPr>
-                <w:rFonts w:ascii="Tahoma" w:eastAsia="Tahoma" w:hAnsi="Tahoma" w:cs="Tahoma"/>
-                <w:sz w:val="22"/>
-                <w:szCs w:val="22"/>
-              </w:rPr>
-            </w:pPr>
-            <w:r>
-              <w:t xml:space="preserve">35 menit</w:t>
-            </w:r>
-          </w:p>
-        </w:tc>
-      </w:tr>
-      <w:tr>
-        <w:trPr>
-          <w:gridAfter w:val="1"/>
-          <w:wAfter w:w="10" w:type="dxa"/>
-          <w:trHeight w:val="563"/>
-        </w:trPr>
-        <w:tc>
-          <w:tcPr>
-            <w:tcW w:w="2665" w:type="dxa"/>
-            <w:gridSpan w:val="3"/>
-          </w:tcPr>
-          <w:p>
             <w:pPr>
               <w:pStyle w:val="ListParagraph"/>
               <w:numPr>
@@ -1599,7 +1576,11 @@
               </w:rPr>
             </w:pPr>
             <w:r>
-              <w:t xml:space="preserve">Praktik Membuat Thumbnail (Sketsa)</w:t>
+              <w:rPr>
+                <w:rFonts w:ascii="Tahoma" w:eastAsia="Tahoma" w:hAnsi="Tahoma" w:cs="Tahoma"/>
+                <w:b/>
+              </w:rPr>
+              <w:t>Pengenalan Tools AI ( ChatGPT dan Canva AI)</w:t>
             </w:r>
           </w:p>
         </w:tc>
@@ -1630,10 +1611,89 @@
                 <w:szCs w:val="22"/>
               </w:rPr>
             </w:pPr>
+          </w:p>
+        </w:tc>
+        <w:tc>
+          <w:tcPr>
+            <w:tcW w:w="1796" w:type="dxa"/>
+            <w:gridSpan w:val="3"/>
+          </w:tcPr>
+          <w:p>
+            <w:pPr>
+              <w:pBdr>
+                <w:top w:val="nil"/>
+                <w:left w:val="nil"/>
+                <w:bottom w:val="nil"/>
+                <w:right w:val="nil"/>
+                <w:between w:val="nil"/>
+              </w:pBdr>
+              <w:spacing w:before="60" w:line="276" w:lineRule="auto"/>
+              <w:ind w:left="253" w:right="89"/>
+              <w:rPr>
+                <w:rFonts w:ascii="Tahoma" w:eastAsia="Tahoma" w:hAnsi="Tahoma" w:cs="Tahoma"/>
+                <w:color w:val="000000"/>
+                <w:sz w:val="22"/>
+                <w:szCs w:val="22"/>
+              </w:rPr>
+            </w:pPr>
+          </w:p>
+        </w:tc>
+        <w:tc>
+          <w:tcPr>
+            <w:tcW w:w="1850" w:type="dxa"/>
+          </w:tcPr>
+          <w:p>
+            <w:pPr>
+              <w:spacing w:before="60"/>
+              <w:jc w:val="center"/>
+              <w:rPr>
+                <w:rFonts w:ascii="Tahoma" w:eastAsia="Tahoma" w:hAnsi="Tahoma" w:cs="Tahoma"/>
+                <w:sz w:val="22"/>
+                <w:szCs w:val="22"/>
+              </w:rPr>
+            </w:pPr>
+          </w:p>
+        </w:tc>
+      </w:tr>
+      <w:tr>
+        <w:trPr>
+          <w:gridAfter w:val="1"/>
+          <w:wAfter w:w="10" w:type="dxa"/>
+          <w:trHeight w:val="563"/>
+        </w:trPr>
+        <w:tc>
+          <w:tcPr>
+            <w:tcW w:w="2665" w:type="dxa"/>
+            <w:gridSpan w:val="3"/>
+          </w:tcPr>
+          <w:p>
+            <w:pPr>
+              <w:pStyle w:val="ListParagraph"/>
+              <w:numPr>
+                <w:ilvl w:val="3"/>
+                <w:numId w:val="5"/>
+              </w:numPr>
+              <w:spacing w:before="60"/>
+              <w:ind w:left="292"/>
+              <w:rPr>
+                <w:rFonts w:ascii="Tahoma" w:eastAsia="Tahoma" w:hAnsi="Tahoma" w:cs="Tahoma"/>
+                <w:b/>
+              </w:rPr>
+            </w:pPr>
             <w:r>
-              <w:t xml:space="preserve">Instruktur memberikan jobsheet dan mendampingi peserta untuk:</w:t>
+              <w:rPr>
+                <w:rFonts w:ascii="Tahoma" w:eastAsia="Tahoma" w:hAnsi="Tahoma" w:cs="Tahoma"/>
+                <w:b/>
+              </w:rPr>
+              <w:t>Batasan dan Etika dalam menggunakan AI</w:t>
             </w:r>
           </w:p>
+        </w:tc>
+        <w:tc>
+          <w:tcPr>
+            <w:tcW w:w="3543" w:type="dxa"/>
+            <w:gridSpan w:val="2"/>
+          </w:tcPr>
           <w:p>
             <w:pPr>
               <w:numPr>
@@ -1656,10 +1716,89 @@
                 <w:szCs w:val="22"/>
               </w:rPr>
             </w:pPr>
+          </w:p>
+        </w:tc>
+        <w:tc>
+          <w:tcPr>
+            <w:tcW w:w="1796" w:type="dxa"/>
+            <w:gridSpan w:val="3"/>
+          </w:tcPr>
+          <w:p>
+            <w:pPr>
+              <w:pBdr>
+                <w:top w:val="nil"/>
+                <w:left w:val="nil"/>
+                <w:bottom w:val="nil"/>
+                <w:right w:val="nil"/>
+                <w:between w:val="nil"/>
+              </w:pBdr>
+              <w:spacing w:before="60" w:line="276" w:lineRule="auto"/>
+              <w:ind w:left="253" w:right="89"/>
+              <w:rPr>
+                <w:rFonts w:ascii="Tahoma" w:eastAsia="Tahoma" w:hAnsi="Tahoma" w:cs="Tahoma"/>
+                <w:color w:val="000000"/>
+                <w:sz w:val="22"/>
+                <w:szCs w:val="22"/>
+              </w:rPr>
+            </w:pPr>
+          </w:p>
+        </w:tc>
+        <w:tc>
+          <w:tcPr>
+            <w:tcW w:w="1850" w:type="dxa"/>
+          </w:tcPr>
+          <w:p>
+            <w:pPr>
+              <w:spacing w:before="60"/>
+              <w:jc w:val="center"/>
+              <w:rPr>
+                <w:rFonts w:ascii="Tahoma" w:eastAsia="Tahoma" w:hAnsi="Tahoma" w:cs="Tahoma"/>
+                <w:sz w:val="22"/>
+                <w:szCs w:val="22"/>
+              </w:rPr>
+            </w:pPr>
+          </w:p>
+        </w:tc>
+      </w:tr>
+      <w:tr>
+        <w:trPr>
+          <w:gridAfter w:val="1"/>
+          <w:wAfter w:w="10" w:type="dxa"/>
+          <w:trHeight w:val="563"/>
+        </w:trPr>
+        <w:tc>
+          <w:tcPr>
+            <w:tcW w:w="2665" w:type="dxa"/>
+            <w:gridSpan w:val="3"/>
+          </w:tcPr>
+          <w:p>
+            <w:pPr>
+              <w:pStyle w:val="ListParagraph"/>
+              <w:numPr>
+                <w:ilvl w:val="3"/>
+                <w:numId w:val="5"/>
+              </w:numPr>
+              <w:spacing w:before="60"/>
+              <w:ind w:left="292"/>
+              <w:rPr>
+                <w:rFonts w:ascii="Tahoma" w:eastAsia="Tahoma" w:hAnsi="Tahoma" w:cs="Tahoma"/>
+                <w:b/>
+              </w:rPr>
+            </w:pPr>
             <w:r>
-              <w:t xml:space="preserve">- Membuat minimal 3 alternatif thumbnail (sketsa kasar) di buku sketsa sesuai design brief</w:t>
+              <w:rPr>
+                <w:rFonts w:ascii="Tahoma" w:eastAsia="Tahoma" w:hAnsi="Tahoma" w:cs="Tahoma"/>
+                <w:b/>
+              </w:rPr>
+              <w:t>Kesimpulan ( Summary)</w:t>
             </w:r>
           </w:p>
+        </w:tc>
+        <w:tc>
+          <w:tcPr>
+            <w:tcW w:w="3543" w:type="dxa"/>
+            <w:gridSpan w:val="2"/>
+          </w:tcPr>
           <w:p>
             <w:pPr>
               <w:numPr>
@@ -1682,10 +1821,91 @@
                 <w:szCs w:val="22"/>
               </w:rPr>
             </w:pPr>
+          </w:p>
+        </w:tc>
+        <w:tc>
+          <w:tcPr>
+            <w:tcW w:w="1796" w:type="dxa"/>
+            <w:gridSpan w:val="3"/>
+          </w:tcPr>
+          <w:p>
+            <w:pPr>
+              <w:pBdr>
+                <w:top w:val="nil"/>
+                <w:left w:val="nil"/>
+                <w:bottom w:val="nil"/>
+                <w:right w:val="nil"/>
+                <w:between w:val="nil"/>
+              </w:pBdr>
+              <w:spacing w:before="60" w:line="276" w:lineRule="auto"/>
+              <w:ind w:left="253" w:right="89"/>
+              <w:rPr>
+                <w:rFonts w:ascii="Tahoma" w:eastAsia="Tahoma" w:hAnsi="Tahoma" w:cs="Tahoma"/>
+                <w:color w:val="000000"/>
+                <w:sz w:val="22"/>
+                <w:szCs w:val="22"/>
+              </w:rPr>
+            </w:pPr>
+          </w:p>
+        </w:tc>
+        <w:tc>
+          <w:tcPr>
+            <w:tcW w:w="1850" w:type="dxa"/>
+          </w:tcPr>
+          <w:p>
+            <w:pPr>
+              <w:spacing w:before="60"/>
+              <w:jc w:val="center"/>
+              <w:rPr>
+                <w:rFonts w:ascii="Tahoma" w:eastAsia="Tahoma" w:hAnsi="Tahoma" w:cs="Tahoma"/>
+                <w:sz w:val="22"/>
+                <w:szCs w:val="22"/>
+              </w:rPr>
+            </w:pPr>
+          </w:p>
+        </w:tc>
+      </w:tr>
+      <w:tr>
+        <w:trPr>
+          <w:gridAfter w:val="1"/>
+          <w:wAfter w:w="10" w:type="dxa"/>
+          <w:trHeight w:val="637"/>
+        </w:trPr>
+        <w:tc>
+          <w:tcPr>
+            <w:tcW w:w="2665" w:type="dxa"/>
+            <w:gridSpan w:val="3"/>
+            <w:vAlign w:val="center"/>
+          </w:tcPr>
+          <w:p>
+            <w:pPr>
+              <w:pStyle w:val="ListParagraph"/>
+              <w:numPr>
+                <w:ilvl w:val="0"/>
+                <w:numId w:val="6"/>
+              </w:numPr>
+              <w:spacing w:before="120" w:after="120"/>
+              <w:ind w:left="436" w:hanging="426"/>
+              <w:jc w:val="both"/>
+              <w:rPr>
+                <w:rFonts w:ascii="Tahoma" w:eastAsia="Tahoma" w:hAnsi="Tahoma" w:cs="Tahoma"/>
+                <w:b/>
+              </w:rPr>
+            </w:pPr>
             <w:r>
-              <w:t xml:space="preserve">- Menentukan margin &amp; grid, menyusun konten berdasarkan prioritas</w:t>
+              <w:rPr>
+                <w:rFonts w:ascii="Tahoma" w:eastAsia="Tahoma" w:hAnsi="Tahoma" w:cs="Tahoma"/>
+                <w:b/>
+              </w:rPr>
+              <w:t>Aplikasi</w:t>
             </w:r>
           </w:p>
+        </w:tc>
+        <w:tc>
+          <w:tcPr>
+            <w:tcW w:w="3543" w:type="dxa"/>
+            <w:gridSpan w:val="2"/>
+          </w:tcPr>
           <w:p>
             <w:pPr>
               <w:numPr>
@@ -1700,7 +1920,7 @@
                 <w:between w:val="nil"/>
               </w:pBdr>
               <w:spacing w:before="60" w:line="276" w:lineRule="auto"/>
-              <w:ind w:left="171" w:right="89" w:hanging="283"/>
+              <w:ind w:left="201" w:right="89" w:hanging="283"/>
               <w:rPr>
                 <w:rFonts w:ascii="Tahoma" w:eastAsia="Tahoma" w:hAnsi="Tahoma" w:cs="Tahoma"/>
                 <w:color w:val="000000"/>
@@ -1708,395 +1928,12 @@
                 <w:szCs w:val="22"/>
               </w:rPr>
             </w:pPr>
-            <w:r>
-              <w:t xml:space="preserve">- Memilih 1 thumbnail terbaik sebagai acuan pembuatan prototipe</w:t>
-            </w:r>
-          </w:p>
-          <w:p>
-            <w:pPr>
-              <w:numPr>
-                <w:ilvl w:val="0"/>
-                <w:numId w:val="4"/>
-              </w:numPr>
-              <w:pBdr>
-                <w:top w:val="nil"/>
-                <w:left w:val="nil"/>
-                <w:bottom w:val="nil"/>
-                <w:right w:val="nil"/>
-                <w:between w:val="nil"/>
-              </w:pBdr>
-              <w:spacing w:before="60" w:line="276" w:lineRule="auto"/>
-              <w:ind w:left="171" w:right="89" w:hanging="283"/>
-              <w:rPr>
-                <w:rFonts w:ascii="Tahoma" w:eastAsia="Tahoma" w:hAnsi="Tahoma" w:cs="Tahoma"/>
-                <w:color w:val="000000"/>
-                <w:sz w:val="22"/>
-                <w:szCs w:val="22"/>
-              </w:rPr>
-            </w:pPr>
-            <w:r>
-              <w:t xml:space="preserve">Instruktur berkeliling memberikan pendampingan dan umpan balik kepada setiap peserta</w:t>
-            </w:r>
           </w:p>
         </w:tc>
         <w:tc>
           <w:tcPr>
             <w:tcW w:w="1796" w:type="dxa"/>
             <w:gridSpan w:val="3"/>
-          </w:tcPr>
-          <w:p>
-            <w:pPr>
-              <w:pBdr>
-                <w:top w:val="nil"/>
-                <w:left w:val="nil"/>
-                <w:bottom w:val="nil"/>
-                <w:right w:val="nil"/>
-                <w:between w:val="nil"/>
-              </w:pBdr>
-              <w:spacing w:before="60" w:line="276" w:lineRule="auto"/>
-              <w:ind w:left="253" w:right="89"/>
-              <w:rPr>
-                <w:rFonts w:ascii="Tahoma" w:eastAsia="Tahoma" w:hAnsi="Tahoma" w:cs="Tahoma"/>
-                <w:color w:val="000000"/>
-                <w:sz w:val="22"/>
-                <w:szCs w:val="22"/>
-              </w:rPr>
-            </w:pPr>
-            <w:r>
-              <w:t xml:space="preserve">Buku Sketsa</w:t>
-            </w:r>
-          </w:p>
-          <w:p>
-            <w:pPr>
-              <w:pBdr>
-                <w:top w:val="nil"/>
-                <w:left w:val="nil"/>
-                <w:bottom w:val="nil"/>
-                <w:right w:val="nil"/>
-                <w:between w:val="nil"/>
-              </w:pBdr>
-              <w:spacing w:before="60" w:line="276" w:lineRule="auto"/>
-              <w:ind w:left="253" w:right="89"/>
-              <w:rPr>
-                <w:rFonts w:ascii="Tahoma" w:eastAsia="Tahoma" w:hAnsi="Tahoma" w:cs="Tahoma"/>
-                <w:color w:val="000000"/>
-                <w:sz w:val="22"/>
-                <w:szCs w:val="22"/>
-              </w:rPr>
-            </w:pPr>
-            <w:r>
-              <w:t xml:space="preserve">Pensil</w:t>
-            </w:r>
-          </w:p>
-          <w:p>
-            <w:pPr>
-              <w:pBdr>
-                <w:top w:val="nil"/>
-                <w:left w:val="nil"/>
-                <w:bottom w:val="nil"/>
-                <w:right w:val="nil"/>
-                <w:between w:val="nil"/>
-              </w:pBdr>
-              <w:spacing w:before="60" w:line="276" w:lineRule="auto"/>
-              <w:ind w:left="253" w:right="89"/>
-              <w:rPr>
-                <w:rFonts w:ascii="Tahoma" w:eastAsia="Tahoma" w:hAnsi="Tahoma" w:cs="Tahoma"/>
-                <w:color w:val="000000"/>
-                <w:sz w:val="22"/>
-                <w:szCs w:val="22"/>
-              </w:rPr>
-            </w:pPr>
-            <w:r>
-              <w:t xml:space="preserve">Lembar Jobsheet</w:t>
-            </w:r>
-          </w:p>
-        </w:tc>
-        <w:tc>
-          <w:tcPr>
-            <w:tcW w:w="1850" w:type="dxa"/>
-          </w:tcPr>
-          <w:p>
-            <w:pPr>
-              <w:spacing w:before="60"/>
-              <w:jc w:val="center"/>
-              <w:rPr>
-                <w:rFonts w:ascii="Tahoma" w:eastAsia="Tahoma" w:hAnsi="Tahoma" w:cs="Tahoma"/>
-                <w:sz w:val="22"/>
-                <w:szCs w:val="22"/>
-              </w:rPr>
-            </w:pPr>
-            <w:r>
-              <w:t xml:space="preserve">35 menit</w:t>
-            </w:r>
-          </w:p>
-        </w:tc>
-      </w:tr>
-      <w:tr>
-        <w:trPr>
-          <w:gridAfter w:val="1"/>
-          <w:wAfter w:w="10" w:type="dxa"/>
-          <w:trHeight w:val="563"/>
-        </w:trPr>
-        <w:tc>
-          <w:tcPr>
-            <w:tcW w:w="2665" w:type="dxa"/>
-            <w:gridSpan w:val="3"/>
-          </w:tcPr>
-          <w:p>
-            <w:pPr>
-              <w:pStyle w:val="ListParagraph"/>
-              <w:numPr>
-                <w:ilvl w:val="3"/>
-                <w:numId w:val="5"/>
-              </w:numPr>
-              <w:spacing w:before="60"/>
-              <w:ind w:left="292"/>
-              <w:rPr>
-                <w:rFonts w:ascii="Tahoma" w:eastAsia="Tahoma" w:hAnsi="Tahoma" w:cs="Tahoma"/>
-                <w:b/>
-              </w:rPr>
-            </w:pPr>
-            <w:r>
-              <w:t xml:space="preserve">Kesimpulan ( Summary)</w:t>
-            </w:r>
-          </w:p>
-        </w:tc>
-        <w:tc>
-          <w:tcPr>
-            <w:tcW w:w="3543" w:type="dxa"/>
-            <w:gridSpan w:val="2"/>
-          </w:tcPr>
-          <w:p>
-            <w:r>
-              <w:t>Instruktur menyimpulkan poin-poin penting dari materi Pengenalan K3 Pertanian Modern &amp; Keselamatan Kelistrikan serta memastikan seluruh peserta menguasai keterampilan terkait.</w:t>
-            </w:r>
-          </w:p>
-        </w:tc>
-        <w:tc>
-          <w:tcPr>
-            <w:tcW w:w="1796" w:type="dxa"/>
-            <w:gridSpan w:val="3"/>
-          </w:tcPr>
-          <w:p>
-            <w:r>
-              <w:t>5 menit</w:t>
-            </w:r>
-          </w:p>
-        </w:tc>
-        <w:tc>
-          <w:tcPr>
-            <w:tcW w:w="1850" w:type="dxa"/>
-          </w:tcPr>
-          <w:p>
-            <w:pPr>
-              <w:spacing w:before="60"/>
-              <w:jc w:val="center"/>
-              <w:rPr>
-                <w:rFonts w:ascii="Tahoma" w:eastAsia="Tahoma" w:hAnsi="Tahoma" w:cs="Tahoma"/>
-                <w:sz w:val="22"/>
-                <w:szCs w:val="22"/>
-              </w:rPr>
-            </w:pPr>
-            <w:r>
-              <w:t xml:space="preserve">5 menit</w:t>
-            </w:r>
-          </w:p>
-        </w:tc>
-      </w:tr>
-      <w:tr>
-        <w:trPr>
-          <w:gridAfter w:val="1"/>
-          <w:wAfter w:w="10" w:type="dxa"/>
-          <w:trHeight w:val="637"/>
-        </w:trPr>
-        <w:tc>
-          <w:tcPr>
-            <w:tcW w:w="2665" w:type="dxa"/>
-            <w:gridSpan w:val="3"/>
-            <w:vAlign w:val="center"/>
-          </w:tcPr>
-          <w:p>
-            <w:pPr>
-              <w:pStyle w:val="ListParagraph"/>
-              <w:numPr>
-                <w:ilvl w:val="0"/>
-                <w:numId w:val="6"/>
-              </w:numPr>
-              <w:spacing w:before="120" w:after="120"/>
-              <w:ind w:left="436" w:hanging="426"/>
-              <w:jc w:val="both"/>
-              <w:rPr>
-                <w:rFonts w:ascii="Tahoma" w:eastAsia="Tahoma" w:hAnsi="Tahoma" w:cs="Tahoma"/>
-                <w:b/>
-              </w:rPr>
-            </w:pPr>
-            <w:r>
-              <w:t xml:space="preserve">Aplikasi</w:t>
-            </w:r>
-          </w:p>
-        </w:tc>
-        <w:tc>
-          <w:tcPr>
-            <w:tcW w:w="3543" w:type="dxa"/>
-            <w:gridSpan w:val="2"/>
-          </w:tcPr>
-          <w:p>
-            <w:r>
-              <w:t>Instruktur memberikan kuis interaktif / tanya jawab untuk mengukur pemahaman peserta.</w:t>
-            </w:r>
-          </w:p>
-        </w:tc>
-        <w:tc>
-          <w:tcPr>
-            <w:tcW w:w="1796" w:type="dxa"/>
-            <w:gridSpan w:val="3"/>
-          </w:tcPr>
-          <w:p>
-            <w:r>
-              <w:t>20 menit</w:t>
-            </w:r>
-          </w:p>
-        </w:tc>
-        <w:tc>
-          <w:tcPr>
-            <w:tcW w:w="1850" w:type="dxa"/>
-          </w:tcPr>
-          <w:p>
-            <w:pPr>
-              <w:pBdr>
-                <w:top w:val="nil"/>
-                <w:left w:val="nil"/>
-                <w:bottom w:val="nil"/>
-                <w:right w:val="nil"/>
-                <w:between w:val="nil"/>
-              </w:pBdr>
-              <w:spacing w:before="60"/>
-              <w:jc w:val="center"/>
-              <w:rPr>
-                <w:rFonts w:ascii="Tahoma" w:eastAsia="Tahoma" w:hAnsi="Tahoma" w:cs="Tahoma"/>
-                <w:sz w:val="22"/>
-                <w:szCs w:val="22"/>
-              </w:rPr>
-            </w:pPr>
-            <w:r>
-              <w:t xml:space="preserve">20 menit</w:t>
-            </w:r>
-          </w:p>
-        </w:tc>
-      </w:tr>
-      <w:tr>
-        <w:trPr>
-          <w:gridAfter w:val="1"/>
-          <w:wAfter w:w="10" w:type="dxa"/>
-          <w:trHeight w:val="306"/>
-        </w:trPr>
-        <w:tc>
-          <w:tcPr>
-            <w:tcW w:w="2665" w:type="dxa"/>
-            <w:gridSpan w:val="3"/>
-            <w:vAlign w:val="center"/>
-          </w:tcPr>
-          <w:p>
-            <w:pPr>
-              <w:pStyle w:val="ListParagraph"/>
-              <w:numPr>
-                <w:ilvl w:val="0"/>
-                <w:numId w:val="6"/>
-              </w:numPr>
-              <w:spacing w:before="120" w:after="120"/>
-              <w:ind w:left="436" w:hanging="426"/>
-              <w:jc w:val="both"/>
-              <w:rPr>
-                <w:rFonts w:ascii="Tahoma" w:eastAsia="Tahoma" w:hAnsi="Tahoma" w:cs="Tahoma"/>
-                <w:b/>
-              </w:rPr>
-            </w:pPr>
-            <w:r>
-              <w:t xml:space="preserve">Evaluasi</w:t>
-            </w:r>
-          </w:p>
-        </w:tc>
-        <w:tc>
-          <w:tcPr>
-            <w:tcW w:w="3543" w:type="dxa"/>
-            <w:gridSpan w:val="2"/>
-          </w:tcPr>
-          <w:p>
-            <w:r>
-              <w:t>Tugas Tambahan</w:t>
-            </w:r>
-          </w:p>
-        </w:tc>
-        <w:tc>
-          <w:tcPr>
-            <w:tcW w:w="1796" w:type="dxa"/>
-            <w:gridSpan w:val="3"/>
-          </w:tcPr>
-          <w:p>
-            <w:r>
-              <w:t>30 menit</w:t>
-            </w:r>
-          </w:p>
-        </w:tc>
-        <w:tc>
-          <w:tcPr>
-            <w:tcW w:w="1850" w:type="dxa"/>
-          </w:tcPr>
-          <w:p>
-            <w:pPr>
-              <w:pBdr>
-                <w:top w:val="nil"/>
-                <w:left w:val="nil"/>
-                <w:bottom w:val="nil"/>
-                <w:right w:val="nil"/>
-                <w:between w:val="nil"/>
-              </w:pBdr>
-              <w:spacing w:before="60"/>
-              <w:jc w:val="center"/>
-              <w:rPr>
-                <w:rFonts w:ascii="Tahoma" w:eastAsia="Tahoma" w:hAnsi="Tahoma" w:cs="Tahoma"/>
-                <w:sz w:val="22"/>
-                <w:szCs w:val="22"/>
-              </w:rPr>
-            </w:pPr>
-            <w:r>
-              <w:t xml:space="preserve">30 menit</w:t>
-            </w:r>
-          </w:p>
-        </w:tc>
-      </w:tr>
-      <w:tr>
-        <w:trPr>
-          <w:gridAfter w:val="1"/>
-          <w:wAfter w:w="10" w:type="dxa"/>
-          <w:trHeight w:val="587"/>
-        </w:trPr>
-        <w:tc>
-          <w:tcPr>
-            <w:tcW w:w="2665" w:type="dxa"/>
-            <w:gridSpan w:val="3"/>
-            <w:vAlign w:val="center"/>
-          </w:tcPr>
-          <w:p>
-            <w:pPr>
-              <w:spacing w:before="120" w:after="120"/>
-              <w:jc w:val="both"/>
-              <w:rPr>
-                <w:rFonts w:ascii="Tahoma" w:eastAsia="Tahoma" w:hAnsi="Tahoma" w:cs="Tahoma"/>
-                <w:b/>
-                <w:sz w:val="22"/>
-                <w:szCs w:val="22"/>
-              </w:rPr>
-            </w:pPr>
-            <w:r>
-              <w:t xml:space="preserve">Tugas Tambahan</w:t>
-            </w:r>
-          </w:p>
-        </w:tc>
-        <w:tc>
-          <w:tcPr>
-            <w:tcW w:w="3543" w:type="dxa"/>
-            <w:gridSpan w:val="2"/>
           </w:tcPr>
           <w:p>
             <w:pPr>
@@ -2120,20 +1957,6 @@
                 <w:szCs w:val="22"/>
               </w:rPr>
             </w:pPr>
-            <w:r>
-              <w:t xml:space="preserve">Instruktur memberikan tugas tambahan kepada peserta pelatihan untuk pekerjaan rumah, setelah menyelesaikan tugas harap dikumpulkan kepada instruktur melalui email batas waktu esok hari pukul 09.00</w:t>
-            </w:r>
-          </w:p>
-        </w:tc>
-        <w:tc>
-          <w:tcPr>
-            <w:tcW w:w="1796" w:type="dxa"/>
-            <w:gridSpan w:val="3"/>
-          </w:tcPr>
-          <w:p>
-            <w:r>
-              <w:t>Merapikan peralatan praktik, membersihkan ruang lab (5R), berdoa, dan memberikan salam penutup.</w:t>
-            </w:r>
           </w:p>
         </w:tc>
         <w:tc>
@@ -2141,9 +1964,22 @@
             <w:tcW w:w="1850" w:type="dxa"/>
           </w:tcPr>
           <w:p>
-            <w:r>
-              <w:t>5 menit</w:t>
-            </w:r>
+            <w:pPr>
+              <w:pBdr>
+                <w:top w:val="nil"/>
+                <w:left w:val="nil"/>
+                <w:bottom w:val="nil"/>
+                <w:right w:val="nil"/>
+                <w:between w:val="nil"/>
+              </w:pBdr>
+              <w:spacing w:before="60"/>
+              <w:jc w:val="center"/>
+              <w:rPr>
+                <w:rFonts w:ascii="Tahoma" w:eastAsia="Tahoma" w:hAnsi="Tahoma" w:cs="Tahoma"/>
+                <w:sz w:val="22"/>
+                <w:szCs w:val="22"/>
+              </w:rPr>
+            </w:pPr>
           </w:p>
         </w:tc>
       </w:tr>
@@ -2151,6 +1987,7 @@
         <w:trPr>
           <w:gridAfter w:val="1"/>
           <w:wAfter w:w="10" w:type="dxa"/>
+          <w:trHeight w:val="306"/>
         </w:trPr>
         <w:tc>
           <w:tcPr>
@@ -2160,17 +1997,25 @@
           </w:tcPr>
           <w:p>
             <w:pPr>
+              <w:pStyle w:val="ListParagraph"/>
+              <w:numPr>
+                <w:ilvl w:val="0"/>
+                <w:numId w:val="6"/>
+              </w:numPr>
               <w:spacing w:before="120" w:after="120"/>
+              <w:ind w:left="436" w:hanging="426"/>
               <w:jc w:val="both"/>
               <w:rPr>
                 <w:rFonts w:ascii="Tahoma" w:eastAsia="Tahoma" w:hAnsi="Tahoma" w:cs="Tahoma"/>
                 <w:b/>
-                <w:sz w:val="22"/>
-                <w:szCs w:val="22"/>
               </w:rPr>
             </w:pPr>
             <w:r>
-              <w:t xml:space="preserve">Pemberesan Kelas</w:t>
+              <w:rPr>
+                <w:rFonts w:ascii="Tahoma" w:eastAsia="Tahoma" w:hAnsi="Tahoma" w:cs="Tahoma"/>
+                <w:b/>
+              </w:rPr>
+              <w:t>Evaluasi</w:t>
             </w:r>
           </w:p>
         </w:tc>
@@ -2178,6 +2023,35 @@
           <w:tcPr>
             <w:tcW w:w="3543" w:type="dxa"/>
             <w:gridSpan w:val="2"/>
+          </w:tcPr>
+          <w:p>
+            <w:pPr>
+              <w:numPr>
+                <w:ilvl w:val="0"/>
+                <w:numId w:val="4"/>
+              </w:numPr>
+              <w:pBdr>
+                <w:top w:val="nil"/>
+                <w:left w:val="nil"/>
+                <w:bottom w:val="nil"/>
+                <w:right w:val="nil"/>
+                <w:between w:val="nil"/>
+              </w:pBdr>
+              <w:spacing w:before="60" w:line="276" w:lineRule="auto"/>
+              <w:ind w:left="201" w:right="89" w:hanging="335"/>
+              <w:rPr>
+                <w:rFonts w:ascii="Tahoma" w:eastAsia="Tahoma" w:hAnsi="Tahoma" w:cs="Tahoma"/>
+                <w:color w:val="000000"/>
+                <w:sz w:val="22"/>
+                <w:szCs w:val="22"/>
+              </w:rPr>
+            </w:pPr>
+          </w:p>
+        </w:tc>
+        <w:tc>
+          <w:tcPr>
+            <w:tcW w:w="1796" w:type="dxa"/>
+            <w:gridSpan w:val="3"/>
           </w:tcPr>
           <w:p>
             <w:pPr>
@@ -2201,10 +2075,71 @@
                 <w:szCs w:val="22"/>
               </w:rPr>
             </w:pPr>
+          </w:p>
+        </w:tc>
+        <w:tc>
+          <w:tcPr>
+            <w:tcW w:w="1850" w:type="dxa"/>
+          </w:tcPr>
+          <w:p>
+            <w:pPr>
+              <w:pBdr>
+                <w:top w:val="nil"/>
+                <w:left w:val="nil"/>
+                <w:bottom w:val="nil"/>
+                <w:right w:val="nil"/>
+                <w:between w:val="nil"/>
+              </w:pBdr>
+              <w:spacing w:before="60"/>
+              <w:jc w:val="center"/>
+              <w:rPr>
+                <w:rFonts w:ascii="Tahoma" w:eastAsia="Tahoma" w:hAnsi="Tahoma" w:cs="Tahoma"/>
+                <w:sz w:val="22"/>
+                <w:szCs w:val="22"/>
+              </w:rPr>
+            </w:pPr>
+          </w:p>
+        </w:tc>
+      </w:tr>
+      <w:tr>
+        <w:trPr>
+          <w:gridAfter w:val="1"/>
+          <w:wAfter w:w="10" w:type="dxa"/>
+          <w:trHeight w:val="587"/>
+        </w:trPr>
+        <w:tc>
+          <w:tcPr>
+            <w:tcW w:w="2665" w:type="dxa"/>
+            <w:gridSpan w:val="3"/>
+            <w:vAlign w:val="center"/>
+          </w:tcPr>
+          <w:p>
+            <w:pPr>
+              <w:spacing w:before="120" w:after="120"/>
+              <w:jc w:val="both"/>
+              <w:rPr>
+                <w:rFonts w:ascii="Tahoma" w:eastAsia="Tahoma" w:hAnsi="Tahoma" w:cs="Tahoma"/>
+                <w:b/>
+                <w:sz w:val="22"/>
+                <w:szCs w:val="22"/>
+              </w:rPr>
+            </w:pPr>
             <w:r>
-              <w:t xml:space="preserve">Merapikan Ruang kelas</w:t>
+              <w:rPr>
+                <w:rFonts w:ascii="Tahoma" w:eastAsia="Tahoma" w:hAnsi="Tahoma" w:cs="Tahoma"/>
+                <w:b/>
+                <w:sz w:val="22"/>
+                <w:szCs w:val="22"/>
+              </w:rPr>
+              <w:t>Tugas Tambahan</w:t>
             </w:r>
           </w:p>
+        </w:tc>
+        <w:tc>
+          <w:tcPr>
+            <w:tcW w:w="3543" w:type="dxa"/>
+            <w:gridSpan w:val="2"/>
+          </w:tcPr>
           <w:p>
             <w:pPr>
               <w:numPr>
@@ -2227,15 +2162,94 @@
                 <w:szCs w:val="22"/>
               </w:rPr>
             </w:pPr>
-            <w:r>
-              <w:t xml:space="preserve">Berdoa dan memberikan salam</w:t>
-            </w:r>
           </w:p>
         </w:tc>
         <w:tc>
           <w:tcPr>
             <w:tcW w:w="1796" w:type="dxa"/>
             <w:gridSpan w:val="3"/>
+          </w:tcPr>
+          <w:p>
+            <w:pPr>
+              <w:pBdr>
+                <w:top w:val="nil"/>
+                <w:left w:val="nil"/>
+                <w:bottom w:val="nil"/>
+                <w:right w:val="nil"/>
+                <w:between w:val="nil"/>
+              </w:pBdr>
+              <w:spacing w:before="60" w:line="276" w:lineRule="auto"/>
+              <w:ind w:left="33" w:right="89"/>
+              <w:rPr>
+                <w:rFonts w:ascii="Tahoma" w:eastAsia="Tahoma" w:hAnsi="Tahoma" w:cs="Tahoma"/>
+                <w:color w:val="000000"/>
+                <w:sz w:val="22"/>
+                <w:szCs w:val="22"/>
+              </w:rPr>
+            </w:pPr>
+          </w:p>
+        </w:tc>
+        <w:tc>
+          <w:tcPr>
+            <w:tcW w:w="1850" w:type="dxa"/>
+          </w:tcPr>
+          <w:p>
+            <w:pPr>
+              <w:pBdr>
+                <w:top w:val="nil"/>
+                <w:left w:val="nil"/>
+                <w:bottom w:val="nil"/>
+                <w:right w:val="nil"/>
+                <w:between w:val="nil"/>
+              </w:pBdr>
+              <w:spacing w:before="60"/>
+              <w:jc w:val="center"/>
+              <w:rPr>
+                <w:rFonts w:ascii="Tahoma" w:eastAsia="Tahoma" w:hAnsi="Tahoma" w:cs="Tahoma"/>
+                <w:sz w:val="22"/>
+                <w:szCs w:val="22"/>
+              </w:rPr>
+            </w:pPr>
+          </w:p>
+        </w:tc>
+      </w:tr>
+      <w:tr>
+        <w:trPr>
+          <w:gridAfter w:val="1"/>
+          <w:wAfter w:w="10" w:type="dxa"/>
+        </w:trPr>
+        <w:tc>
+          <w:tcPr>
+            <w:tcW w:w="2665" w:type="dxa"/>
+            <w:gridSpan w:val="3"/>
+            <w:vAlign w:val="center"/>
+          </w:tcPr>
+          <w:p>
+            <w:pPr>
+              <w:spacing w:before="120" w:after="120"/>
+              <w:jc w:val="both"/>
+              <w:rPr>
+                <w:rFonts w:ascii="Tahoma" w:eastAsia="Tahoma" w:hAnsi="Tahoma" w:cs="Tahoma"/>
+                <w:b/>
+                <w:sz w:val="22"/>
+                <w:szCs w:val="22"/>
+              </w:rPr>
+            </w:pPr>
+            <w:r>
+              <w:rPr>
+                <w:rFonts w:ascii="Tahoma" w:eastAsia="Tahoma" w:hAnsi="Tahoma" w:cs="Tahoma"/>
+                <w:b/>
+                <w:sz w:val="22"/>
+                <w:szCs w:val="22"/>
+              </w:rPr>
+              <w:t>Pemberesan Kelas</w:t>
+            </w:r>
+          </w:p>
+        </w:tc>
+        <w:tc>
+          <w:tcPr>
+            <w:tcW w:w="3543" w:type="dxa"/>
+            <w:gridSpan w:val="2"/>
           </w:tcPr>
           <w:p>
             <w:pPr>
@@ -2263,6 +2277,35 @@
         </w:tc>
         <w:tc>
           <w:tcPr>
+            <w:tcW w:w="1796" w:type="dxa"/>
+            <w:gridSpan w:val="3"/>
+          </w:tcPr>
+          <w:p>
+            <w:pPr>
+              <w:numPr>
+                <w:ilvl w:val="0"/>
+                <w:numId w:val="4"/>
+              </w:numPr>
+              <w:pBdr>
+                <w:top w:val="nil"/>
+                <w:left w:val="nil"/>
+                <w:bottom w:val="nil"/>
+                <w:right w:val="nil"/>
+                <w:between w:val="nil"/>
+              </w:pBdr>
+              <w:spacing w:before="60" w:line="276" w:lineRule="auto"/>
+              <w:ind w:left="253" w:right="89" w:hanging="220"/>
+              <w:rPr>
+                <w:rFonts w:ascii="Tahoma" w:eastAsia="Tahoma" w:hAnsi="Tahoma" w:cs="Tahoma"/>
+                <w:color w:val="000000"/>
+                <w:sz w:val="22"/>
+                <w:szCs w:val="22"/>
+              </w:rPr>
+            </w:pPr>
+          </w:p>
+        </w:tc>
+        <w:tc>
+          <w:tcPr>
             <w:tcW w:w="1850" w:type="dxa"/>
           </w:tcPr>
           <w:p>
@@ -2282,9 +2325,6 @@
                 <w:szCs w:val="22"/>
               </w:rPr>
             </w:pPr>
-            <w:r>
-              <w:t xml:space="preserve">5 menit</w:t>
-            </w:r>
           </w:p>
         </w:tc>
       </w:tr>

</xml_diff>

<commit_message>
fix: populate pristine Google Drive template with correct Smart Farming content
</commit_message>
<xml_diff>
--- a/documents/Lesson_Plan_Pertemuan_01.docx
+++ b/documents/Lesson_Plan_Pertemuan_01.docx
@@ -531,7 +531,7 @@
           </w:tcPr>
           <w:p>
             <w:r>
-              <w:t>Pengenalan K3 Pertanian Modern &amp; Keselamatan Kelistrikan</w:t>
+              <w:t>JUDUL: Pengenalan K3 Pertanian Modern &amp; Keselamatan Kelistrikan</w:t>
             </w:r>
           </w:p>
         </w:tc>
@@ -564,24 +564,8 @@
             </w:tcBorders>
           </w:tcPr>
           <w:p>
-            <w:pPr>
-              <w:spacing w:before="120"/>
-              <w:jc w:val="both"/>
-              <w:rPr>
-                <w:rFonts w:ascii="Tahoma" w:eastAsia="Tahoma" w:hAnsi="Tahoma" w:cs="Tahoma"/>
-                <w:b/>
-                <w:sz w:val="22"/>
-                <w:szCs w:val="22"/>
-              </w:rPr>
-            </w:pPr>
             <w:r>
-              <w:rPr>
-                <w:rFonts w:ascii="Tahoma" w:eastAsia="Tahoma" w:hAnsi="Tahoma" w:cs="Tahoma"/>
-                <w:b/>
-                <w:sz w:val="22"/>
-                <w:szCs w:val="22"/>
-              </w:rPr>
-              <w:t>Metode Mengajar</w:t>
+              <w:t>Ceramah / Demonstrasi / Praktikum</w:t>
             </w:r>
           </w:p>
         </w:tc>
@@ -684,57 +668,9 @@
             <w:gridSpan w:val="6"/>
           </w:tcPr>
           <w:p>
-            <w:pPr>
-              <w:pBdr>
-                <w:top w:val="nil"/>
-                <w:left w:val="nil"/>
-                <w:bottom w:val="nil"/>
-                <w:right w:val="nil"/>
-                <w:between w:val="nil"/>
-              </w:pBdr>
-              <w:spacing w:before="120" w:line="276" w:lineRule="auto"/>
-              <w:ind w:left="52"/>
-              <w:jc w:val="both"/>
-              <w:rPr>
-                <w:rFonts w:ascii="Tahoma" w:eastAsia="Tahoma" w:hAnsi="Tahoma" w:cs="Tahoma"/>
-                <w:color w:val="000000" w:themeColor="text1"/>
-                <w:sz w:val="22"/>
-                <w:szCs w:val="22"/>
-              </w:rPr>
-            </w:pPr>
             <w:r>
-              <w:rPr>
-                <w:rFonts w:ascii="Tahoma" w:eastAsia="Tahoma" w:hAnsi="Tahoma" w:cs="Tahoma"/>
-                <w:color w:val="000000" w:themeColor="text1"/>
-                <w:sz w:val="22"/>
-                <w:szCs w:val="22"/>
-              </w:rPr>
-              <w:t>Media</w:t>
+              <w:t>Power Point, Video Tutorial, Diagram Arsitektur IoT</w:t>
             </w:r>
-          </w:p>
-          <w:p>
-            <w:pPr>
-              <w:numPr>
-                <w:ilvl w:val="0"/>
-                <w:numId w:val="3"/>
-              </w:numPr>
-              <w:pBdr>
-                <w:top w:val="nil"/>
-                <w:left w:val="nil"/>
-                <w:bottom w:val="nil"/>
-                <w:right w:val="nil"/>
-                <w:between w:val="nil"/>
-              </w:pBdr>
-              <w:spacing w:after="120" w:line="276" w:lineRule="auto"/>
-              <w:ind w:left="294" w:hanging="242"/>
-              <w:jc w:val="both"/>
-              <w:rPr>
-                <w:rFonts w:ascii="Tahoma" w:eastAsia="Tahoma" w:hAnsi="Tahoma" w:cs="Tahoma"/>
-                <w:color w:val="000000" w:themeColor="text1"/>
-                <w:sz w:val="22"/>
-                <w:szCs w:val="22"/>
-              </w:rPr>
-            </w:pPr>
           </w:p>
         </w:tc>
       </w:tr>
@@ -769,57 +705,9 @@
             <w:gridSpan w:val="6"/>
           </w:tcPr>
           <w:p>
-            <w:pPr>
-              <w:pBdr>
-                <w:top w:val="nil"/>
-                <w:left w:val="nil"/>
-                <w:bottom w:val="nil"/>
-                <w:right w:val="nil"/>
-                <w:between w:val="nil"/>
-              </w:pBdr>
-              <w:spacing w:before="120" w:line="276" w:lineRule="auto"/>
-              <w:ind w:left="52"/>
-              <w:jc w:val="both"/>
-              <w:rPr>
-                <w:rFonts w:ascii="Tahoma" w:eastAsia="Tahoma" w:hAnsi="Tahoma" w:cs="Tahoma"/>
-                <w:color w:val="000000" w:themeColor="text1"/>
-                <w:sz w:val="22"/>
-                <w:szCs w:val="22"/>
-              </w:rPr>
-            </w:pPr>
             <w:r>
-              <w:rPr>
-                <w:rFonts w:ascii="Tahoma" w:eastAsia="Tahoma" w:hAnsi="Tahoma" w:cs="Tahoma"/>
-                <w:color w:val="000000" w:themeColor="text1"/>
-                <w:sz w:val="22"/>
-                <w:szCs w:val="22"/>
-              </w:rPr>
-              <w:t>Alat</w:t>
+              <w:t>Proyektor, Kit Mikrokontroler ESP32, Sensor &amp; Aktuator Pertanian, Multimeter</w:t>
             </w:r>
-          </w:p>
-          <w:p>
-            <w:pPr>
-              <w:numPr>
-                <w:ilvl w:val="0"/>
-                <w:numId w:val="7"/>
-              </w:numPr>
-              <w:pBdr>
-                <w:top w:val="nil"/>
-                <w:left w:val="nil"/>
-                <w:bottom w:val="nil"/>
-                <w:right w:val="nil"/>
-                <w:between w:val="nil"/>
-              </w:pBdr>
-              <w:spacing w:after="120" w:line="276" w:lineRule="auto"/>
-              <w:ind w:left="294" w:hanging="242"/>
-              <w:jc w:val="both"/>
-              <w:rPr>
-                <w:rFonts w:ascii="Tahoma" w:eastAsia="Tahoma" w:hAnsi="Tahoma" w:cs="Tahoma"/>
-                <w:color w:val="000000" w:themeColor="text1"/>
-                <w:sz w:val="22"/>
-                <w:szCs w:val="22"/>
-              </w:rPr>
-            </w:pPr>
           </w:p>
         </w:tc>
       </w:tr>
@@ -857,57 +745,9 @@
             <w:gridSpan w:val="6"/>
           </w:tcPr>
           <w:p>
-            <w:pPr>
-              <w:pBdr>
-                <w:top w:val="nil"/>
-                <w:left w:val="nil"/>
-                <w:bottom w:val="nil"/>
-                <w:right w:val="nil"/>
-                <w:between w:val="nil"/>
-              </w:pBdr>
-              <w:spacing w:before="120" w:line="276" w:lineRule="auto"/>
-              <w:ind w:left="52"/>
-              <w:jc w:val="both"/>
-              <w:rPr>
-                <w:rFonts w:ascii="Tahoma" w:eastAsia="Tahoma" w:hAnsi="Tahoma" w:cs="Tahoma"/>
-                <w:color w:val="000000" w:themeColor="text1"/>
-                <w:sz w:val="22"/>
-                <w:szCs w:val="22"/>
-              </w:rPr>
-            </w:pPr>
             <w:r>
-              <w:rPr>
-                <w:rFonts w:ascii="Tahoma" w:eastAsia="Tahoma" w:hAnsi="Tahoma" w:cs="Tahoma"/>
-                <w:color w:val="000000" w:themeColor="text1"/>
-                <w:sz w:val="22"/>
-                <w:szCs w:val="22"/>
-              </w:rPr>
-              <w:t>Bahan</w:t>
+              <w:t>Flashdisk, Modul Pelatihan, Lembar Jobsheet</w:t>
             </w:r>
-          </w:p>
-          <w:p>
-            <w:pPr>
-              <w:numPr>
-                <w:ilvl w:val="0"/>
-                <w:numId w:val="8"/>
-              </w:numPr>
-              <w:pBdr>
-                <w:top w:val="nil"/>
-                <w:left w:val="nil"/>
-                <w:bottom w:val="nil"/>
-                <w:right w:val="nil"/>
-                <w:between w:val="nil"/>
-              </w:pBdr>
-              <w:spacing w:after="120" w:line="276" w:lineRule="auto"/>
-              <w:ind w:left="294" w:hanging="242"/>
-              <w:jc w:val="both"/>
-              <w:rPr>
-                <w:rFonts w:ascii="Tahoma" w:eastAsia="Tahoma" w:hAnsi="Tahoma" w:cs="Tahoma"/>
-                <w:color w:val="000000" w:themeColor="text1"/>
-                <w:sz w:val="22"/>
-                <w:szCs w:val="22"/>
-              </w:rPr>
-            </w:pPr>
           </w:p>
         </w:tc>
       </w:tr>
@@ -980,26 +820,16 @@
             <w:vMerge w:val="restart"/>
           </w:tcPr>
           <w:p>
-            <w:pPr>
-              <w:pStyle w:val="ListParagraph"/>
-              <w:numPr>
-                <w:ilvl w:val="0"/>
-                <w:numId w:val="6"/>
-              </w:numPr>
-              <w:spacing w:before="120" w:after="120"/>
-              <w:ind w:left="294" w:hanging="284"/>
-              <w:jc w:val="both"/>
-              <w:rPr>
-                <w:rFonts w:ascii="Tahoma" w:eastAsia="Tahoma" w:hAnsi="Tahoma" w:cs="Tahoma"/>
-                <w:b/>
-              </w:rPr>
-            </w:pPr>
             <w:r>
-              <w:rPr>
-                <w:rFonts w:ascii="Tahoma" w:eastAsia="Tahoma" w:hAnsi="Tahoma" w:cs="Tahoma"/>
-                <w:b/>
-              </w:rPr>
-              <w:t>Pendahuluan</w:t>
+              <w:t>1. Memberi salam dan memperkenalkan diri</w:t>
+              <w:br/>
+              <w:t>2. Mengabsen peserta pelatihan</w:t>
+              <w:br/>
+              <w:t>3. Menjelaskan safety induction lab TIK dan aturan keselamatan</w:t>
+              <w:br/>
+              <w:t>4. Mengadakan apersepsi terkait materi</w:t>
+              <w:br/>
+              <w:t>5. Menyampaikan judul unit dan tujuan pembelajaran</w:t>
             </w:r>
           </w:p>
         </w:tc>
@@ -1412,72 +1242,17 @@
             <w:gridSpan w:val="3"/>
           </w:tcPr>
           <w:p>
-            <w:pPr>
-              <w:pStyle w:val="ListParagraph"/>
-              <w:numPr>
-                <w:ilvl w:val="3"/>
-                <w:numId w:val="5"/>
-              </w:numPr>
-              <w:spacing w:before="60"/>
-              <w:ind w:left="292"/>
-              <w:rPr>
-                <w:rFonts w:ascii="Tahoma" w:eastAsia="Tahoma" w:hAnsi="Tahoma" w:cs="Tahoma"/>
-                <w:b/>
-              </w:rPr>
-            </w:pPr>
             <w:r>
-              <w:rPr>
-                <w:rFonts w:ascii="Tahoma" w:eastAsia="Tahoma" w:hAnsi="Tahoma" w:cs="Tahoma"/>
-                <w:b/>
-              </w:rPr>
-              <w:t>Dasar-dasar Copywriting</w:t>
+              <w:t>Instruktur menjelaskan kepada peserta terkait:</w:t>
+              <w:br/>
+              <w:t>- Pengertian dan pentingnya K3 (Keselamatan dan Kesehatan Kerja) di sektor pertanian modern</w:t>
+              <w:br/>
+              <w:t>- Potensi bahaya kelistrikan pada sistem otomatisasi dan perangkat IoT pertanian</w:t>
+              <w:br/>
+              <w:t>- Pengenalan Alat Pelindung Diri (APD) standar operasional lahan</w:t>
+              <w:br/>
+              <w:t>Instruktur menanyakan kepada peserta apakah materi yang disampaikan telah dipahami dan memberikan kesempatan untuk bertanya</w:t>
             </w:r>
-          </w:p>
-          <w:p>
-            <w:pPr>
-              <w:spacing w:before="60"/>
-              <w:rPr>
-                <w:rFonts w:ascii="Tahoma" w:eastAsia="Tahoma" w:hAnsi="Tahoma" w:cs="Tahoma"/>
-                <w:b/>
-              </w:rPr>
-            </w:pPr>
-          </w:p>
-          <w:p>
-            <w:pPr>
-              <w:spacing w:before="60"/>
-              <w:rPr>
-                <w:rFonts w:ascii="Tahoma" w:eastAsia="Tahoma" w:hAnsi="Tahoma" w:cs="Tahoma"/>
-                <w:b/>
-              </w:rPr>
-            </w:pPr>
-          </w:p>
-          <w:p>
-            <w:pPr>
-              <w:spacing w:before="60"/>
-              <w:rPr>
-                <w:rFonts w:ascii="Tahoma" w:eastAsia="Tahoma" w:hAnsi="Tahoma" w:cs="Tahoma"/>
-                <w:b/>
-              </w:rPr>
-            </w:pPr>
-          </w:p>
-          <w:p>
-            <w:pPr>
-              <w:spacing w:before="60"/>
-              <w:rPr>
-                <w:rFonts w:ascii="Tahoma" w:eastAsia="Tahoma" w:hAnsi="Tahoma" w:cs="Tahoma"/>
-                <w:b/>
-              </w:rPr>
-            </w:pPr>
-          </w:p>
-          <w:p>
-            <w:pPr>
-              <w:pStyle w:val="ListParagraph"/>
-              <w:spacing w:before="60"/>
-              <w:rPr>
-                <w:rFonts w:ascii="Tahoma" w:eastAsia="Tahoma" w:hAnsi="Tahoma" w:cs="Tahoma"/>
-                <w:b/>
-              </w:rPr>
-            </w:pPr>
           </w:p>
         </w:tc>
         <w:tc>

</xml_diff>